<commit_message>
docs: finalize owner completion runbook
</commit_message>
<xml_diff>
--- a/docs/GODFIN_OWNER_COMPLETION_RUNBOOK.docx
+++ b/docs/GODFIN_OWNER_COMPLETION_RUNBOOK.docx
@@ -64,9 +64,9 @@
           <w:color w:val="667085"/>
           <w:sz w:val="20"/>
         </w:rPr>
-        <w:t>Version 2.0  •  29 July 2026  •  oculusrex14/GODFIN (private)</w:t>
+        <w:t>Version 2.1  •  30 July 2026  •  oculusrex14/GODFIN (private)</w:t>
         <w:br/>
-        <w:t>Production branch: codex/godfin-production-v3</w:t>
+        <w:t>Production branch: codex/godfin-production-v4</w:t>
       </w:r>
     </w:p>
     <w:p>
@@ -184,6 +184,11 @@
       </w:r>
     </w:p>
     <w:p>
+      <w:r>
+        <w:br w:type="page"/>
+      </w:r>
+    </w:p>
+    <w:p>
       <w:pPr>
         <w:pStyle w:val="Heading1"/>
       </w:pPr>
@@ -215,7 +220,7 @@
           <w:color w:val="172033"/>
           <w:sz w:val="21"/>
         </w:rPr>
-        <w:t>Phases 0–4 are implemented. The local baseline is 306 passing backend tests; frontend and website production builds pass; production Playwright and mobile accessibility smoke pass; the packaged macOS app meets the accepted start, memory, database-preservation, fuse, and signature-seal checks.</w:t>
+        <w:t>Production remediation through accounts, reporting, and the website product tour is implemented on the private v4 branch. The local baseline is 324 passing backend tests; frontend and website production builds pass; focused desktop and website Playwright checks pass; package privacy inspection finds no local database, statement, Gmail credential, backup, or personal account artifact.</w:t>
       </w:r>
     </w:p>
     <w:p>
@@ -251,7 +256,7 @@
         </w:numPr>
       </w:pPr>
       <w:r>
-        <w:t>Supabase project: GODFIN (ap-south-1); migrations 0001 and 0002 match local history.</w:t>
+        <w:t>Supabase project: GODFIN (ap-south-1); migrations 0001–0003 match local history. Migration 0003 adds the non-revenue owner_test license kind without weakening normal three-device enforcement.</w:t>
       </w:r>
     </w:p>
     <w:p>
@@ -263,7 +268,7 @@
         </w:numPr>
       </w:pPr>
       <w:r>
-        <w:t>Vercel already contains the Supabase public/server variables and LICENSE_SIGNING_SECRET. Values are encrypted and are intentionally not reproduced here.</w:t>
+        <w:t>Deprecated source is preserved only in private, read-only repository oculusrex14/GODFIN-OPUS46-ARCHIVE. Its 35-commit rewritten history and archival tag pass secret scanning; the obsolete local source/build workspace was moved to Trash while active Application Support data was preserved.</w:t>
       </w:r>
     </w:p>
     <w:p>
@@ -275,7 +280,7 @@
         </w:numPr>
       </w:pPr>
       <w:r>
-        <w:t>Stripe, Resend, custom-domain, signing, R2, and clean-VM evidence are not yet complete.</w:t>
+        <w:t>PIN access recovery, portal-positioned calculation help, collapsible App Settings, external pricing navigation, auditable goal contributions, corrected goal simulation, recurring re-detection, atomic account routing, package privacy assertions, and the AY 2026–27 CA tax pack are implemented and tested.</w:t>
       </w:r>
     </w:p>
     <w:p>
@@ -287,7 +292,7 @@
         </w:numPr>
       </w:pPr>
       <w:r>
-        <w:t>Reward pilot, sponsor card, PPP checkout, and OpenDataLoader shipping remain safely feature-gated where applicable.</w:t>
+        <w:t>The website product tour uses real React application captures generated only from synthetic data, muted WebM/MP4 media with reduced-motion fallbacks, and build-time checks that prevent unreleased features from being advertised. Production deployment dpl_2dUiNiw38R9pqfsymPx7NWhpw7Ej is READY at godfin.vercel.app.</w:t>
       </w:r>
     </w:p>
     <w:p>
@@ -299,7 +304,72 @@
         </w:numPr>
       </w:pPr>
       <w:r>
+        <w:t>Production acceptance on 30 July 2026: website Playwright 4/4; Lighthouse performance 99, accessibility 100, SEO 100, LCP 1.73 seconds, CLS 0; required CSP, HSTS, frame, MIME, referrer, and permissions headers are present.</w:t>
+      </w:r>
+    </w:p>
+    <w:p>
+      <w:pPr>
+        <w:keepLines/>
+        <w:numPr>
+          <w:ilvl w:val="0"/>
+          <w:numId w:val="11"/>
+        </w:numPr>
+      </w:pPr>
+      <w:r>
+        <w:t>Vercel already contains the Supabase public/server variables and LICENSE_SIGNING_SECRET. Values are encrypted and are intentionally not reproduced here.</w:t>
+      </w:r>
+    </w:p>
+    <w:p>
+      <w:pPr>
+        <w:keepLines/>
+        <w:numPr>
+          <w:ilvl w:val="0"/>
+          <w:numId w:val="11"/>
+        </w:numPr>
+      </w:pPr>
+      <w:r>
+        <w:t>Google Cloud project GODFIN Website (project ID godfin-website) is owner-controlled. Google OAuth remains pending only until the owner accepts Google’s user-data-policy acknowledgement and the final callback test passes.</w:t>
+      </w:r>
+    </w:p>
+    <w:p>
+      <w:pPr>
+        <w:keepLines/>
+        <w:numPr>
+          <w:ilvl w:val="0"/>
+          <w:numId w:val="11"/>
+        </w:numPr>
+      </w:pPr>
+      <w:r>
+        <w:t>Stripe KYC/prices, Resend/DNS, custom domain, Apple/Windows certificates, R2, clean-VM evidence, and public-launch authorization are not yet complete.</w:t>
+      </w:r>
+    </w:p>
+    <w:p>
+      <w:pPr>
+        <w:keepLines/>
+        <w:numPr>
+          <w:ilvl w:val="0"/>
+          <w:numId w:val="11"/>
+        </w:numPr>
+      </w:pPr>
+      <w:r>
+        <w:t>Reward pilot, sponsor card, PPP checkout, and OpenDataLoader shipping remain safely feature-gated where applicable.</w:t>
+      </w:r>
+    </w:p>
+    <w:p>
+      <w:pPr>
+        <w:keepLines/>
+        <w:numPr>
+          <w:ilvl w:val="0"/>
+          <w:numId w:val="11"/>
+        </w:numPr>
+      </w:pPr>
+      <w:r>
         <w:t>Nothing in this document authorizes a public release. Phase 6 starts only after explicit written public-launch authorization.</w:t>
+      </w:r>
+    </w:p>
+    <w:p>
+      <w:r>
+        <w:br w:type="page"/>
       </w:r>
     </w:p>
     <w:p>
@@ -484,7 +554,7 @@
                 <w:color w:val="172033"/>
                 <w:sz w:val="18"/>
               </w:rPr>
-              <w:t>No Google web client/provider has been verified.</w:t>
+              <w:t>The dedicated Google project exists; Google requires the owner to accept its user-data-policy acknowledgement before client creation can finish.</w:t>
             </w:r>
           </w:p>
         </w:tc>
@@ -509,7 +579,7 @@
                 <w:color w:val="172033"/>
                 <w:sz w:val="18"/>
               </w:rPr>
-              <w:t>Create the client and enable Google in Supabase.</w:t>
+              <w:t>Review and accept the policy in the open browser, then let Codex finish client/provider setup.</w:t>
             </w:r>
           </w:p>
         </w:tc>
@@ -534,7 +604,7 @@
                 <w:color w:val="172033"/>
                 <w:sz w:val="18"/>
               </w:rPr>
-              <w:t>Google sign-in returns to /account.</w:t>
+              <w:t>Google sign-in returns to /account with only openid/email/profile.</w:t>
             </w:r>
           </w:p>
         </w:tc>
@@ -1173,210 +1243,6 @@
                 <w:color w:val="172033"/>
                 <w:sz w:val="18"/>
               </w:rPr>
-              <w:t>Reward pilot</w:t>
-            </w:r>
-          </w:p>
-        </w:tc>
-        <w:tc>
-          <w:tcPr>
-            <w:tcW w:type="dxa" w:w="2100"/>
-            <w:tcMar>
-              <w:top w:w="80" w:type="dxa"/>
-              <w:start w:w="120" w:type="dxa"/>
-              <w:bottom w:w="80" w:type="dxa"/>
-              <w:end w:w="120" w:type="dxa"/>
-            </w:tcMar>
-            <w:vAlign w:val="center"/>
-          </w:tcPr>
-          <w:p>
-            <w:pPr>
-              <w:spacing w:after="0"/>
-            </w:pPr>
-            <w:r>
-              <w:rPr>
-                <w:rFonts w:ascii="Calibri" w:hAnsi="Calibri"/>
-                <w:color w:val="172033"/>
-                <w:sz w:val="18"/>
-              </w:rPr>
-              <w:t>No approved endpoint, privacy review, or funded payout operation.</w:t>
-            </w:r>
-          </w:p>
-        </w:tc>
-        <w:tc>
-          <w:tcPr>
-            <w:tcW w:type="dxa" w:w="3000"/>
-            <w:tcMar>
-              <w:top w:w="80" w:type="dxa"/>
-              <w:start w:w="120" w:type="dxa"/>
-              <w:bottom w:w="80" w:type="dxa"/>
-              <w:end w:w="120" w:type="dxa"/>
-            </w:tcMar>
-            <w:vAlign w:val="center"/>
-          </w:tcPr>
-          <w:p>
-            <w:pPr>
-              <w:spacing w:after="0"/>
-            </w:pPr>
-            <w:r>
-              <w:rPr>
-                <w:rFonts w:ascii="Calibri" w:hAnsi="Calibri"/>
-                <w:color w:val="172033"/>
-                <w:sz w:val="18"/>
-              </w:rPr>
-              <w:t>Keep off or complete Section 10.</w:t>
-            </w:r>
-          </w:p>
-        </w:tc>
-        <w:tc>
-          <w:tcPr>
-            <w:tcW w:type="dxa" w:w="2760"/>
-            <w:tcMar>
-              <w:top w:w="80" w:type="dxa"/>
-              <w:start w:w="120" w:type="dxa"/>
-              <w:bottom w:w="80" w:type="dxa"/>
-              <w:end w:w="120" w:type="dxa"/>
-            </w:tcMar>
-            <w:vAlign w:val="center"/>
-          </w:tcPr>
-          <w:p>
-            <w:pPr>
-              <w:spacing w:after="0"/>
-            </w:pPr>
-            <w:r>
-              <w:rPr>
-                <w:rFonts w:ascii="Calibri" w:hAnsi="Calibri"/>
-                <w:color w:val="172033"/>
-                <w:sz w:val="18"/>
-              </w:rPr>
-              <w:t>Redaction and payout audit pass.</w:t>
-            </w:r>
-          </w:p>
-        </w:tc>
-      </w:tr>
-      <w:tr>
-        <w:tc>
-          <w:tcPr>
-            <w:tcW w:type="dxa" w:w="1500"/>
-            <w:tcMar>
-              <w:top w:w="80" w:type="dxa"/>
-              <w:start w:w="120" w:type="dxa"/>
-              <w:bottom w:w="80" w:type="dxa"/>
-              <w:end w:w="120" w:type="dxa"/>
-            </w:tcMar>
-            <w:vAlign w:val="center"/>
-          </w:tcPr>
-          <w:p>
-            <w:pPr>
-              <w:spacing w:after="0"/>
-            </w:pPr>
-            <w:r>
-              <w:rPr>
-                <w:rFonts w:ascii="Calibri" w:hAnsi="Calibri"/>
-                <w:color w:val="172033"/>
-                <w:sz w:val="18"/>
-              </w:rPr>
-              <w:t>OpenDataLoader</w:t>
-            </w:r>
-          </w:p>
-        </w:tc>
-        <w:tc>
-          <w:tcPr>
-            <w:tcW w:type="dxa" w:w="2100"/>
-            <w:tcMar>
-              <w:top w:w="80" w:type="dxa"/>
-              <w:start w:w="120" w:type="dxa"/>
-              <w:bottom w:w="80" w:type="dxa"/>
-              <w:end w:w="120" w:type="dxa"/>
-            </w:tcMar>
-            <w:vAlign w:val="center"/>
-          </w:tcPr>
-          <w:p>
-            <w:pPr>
-              <w:spacing w:after="0"/>
-            </w:pPr>
-            <w:r>
-              <w:rPr>
-                <w:rFonts w:ascii="Calibri" w:hAnsi="Calibri"/>
-                <w:color w:val="172033"/>
-                <w:sz w:val="18"/>
-              </w:rPr>
-              <w:t>No 200–500-file redacted benchmark corpus.</w:t>
-            </w:r>
-          </w:p>
-        </w:tc>
-        <w:tc>
-          <w:tcPr>
-            <w:tcW w:type="dxa" w:w="3000"/>
-            <w:tcMar>
-              <w:top w:w="80" w:type="dxa"/>
-              <w:start w:w="120" w:type="dxa"/>
-              <w:bottom w:w="80" w:type="dxa"/>
-              <w:end w:w="120" w:type="dxa"/>
-            </w:tcMar>
-            <w:vAlign w:val="center"/>
-          </w:tcPr>
-          <w:p>
-            <w:pPr>
-              <w:spacing w:after="0"/>
-            </w:pPr>
-            <w:r>
-              <w:rPr>
-                <w:rFonts w:ascii="Calibri" w:hAnsi="Calibri"/>
-                <w:color w:val="172033"/>
-                <w:sz w:val="18"/>
-              </w:rPr>
-              <w:t>Source a lawful corpus or leave the feature off.</w:t>
-            </w:r>
-          </w:p>
-        </w:tc>
-        <w:tc>
-          <w:tcPr>
-            <w:tcW w:type="dxa" w:w="2760"/>
-            <w:tcMar>
-              <w:top w:w="80" w:type="dxa"/>
-              <w:start w:w="120" w:type="dxa"/>
-              <w:bottom w:w="80" w:type="dxa"/>
-              <w:end w:w="120" w:type="dxa"/>
-            </w:tcMar>
-            <w:vAlign w:val="center"/>
-          </w:tcPr>
-          <w:p>
-            <w:pPr>
-              <w:spacing w:after="0"/>
-            </w:pPr>
-            <w:r>
-              <w:rPr>
-                <w:rFonts w:ascii="Calibri" w:hAnsi="Calibri"/>
-                <w:color w:val="172033"/>
-                <w:sz w:val="18"/>
-              </w:rPr>
-              <w:t>Accuracy decision is documented.</w:t>
-            </w:r>
-          </w:p>
-        </w:tc>
-      </w:tr>
-      <w:tr>
-        <w:tc>
-          <w:tcPr>
-            <w:tcW w:type="dxa" w:w="1500"/>
-            <w:tcMar>
-              <w:top w:w="80" w:type="dxa"/>
-              <w:start w:w="120" w:type="dxa"/>
-              <w:bottom w:w="80" w:type="dxa"/>
-              <w:end w:w="120" w:type="dxa"/>
-            </w:tcMar>
-            <w:vAlign w:val="center"/>
-          </w:tcPr>
-          <w:p>
-            <w:pPr>
-              <w:spacing w:after="0"/>
-            </w:pPr>
-            <w:r>
-              <w:rPr>
-                <w:rFonts w:ascii="Calibri" w:hAnsi="Calibri"/>
-                <w:color w:val="172033"/>
-                <w:sz w:val="18"/>
-              </w:rPr>
               <w:t>Public launch</w:t>
             </w:r>
           </w:p>
@@ -1464,6 +1330,11 @@
       </w:pPr>
     </w:p>
     <w:p>
+      <w:r>
+        <w:br w:type="page"/>
+      </w:r>
+    </w:p>
+    <w:p>
       <w:pPr>
         <w:pStyle w:val="Heading1"/>
       </w:pPr>
@@ -1508,6 +1379,33 @@
     </w:p>
     <w:p>
       <w:pPr>
+        <w:spacing w:before="100" w:after="160" w:line="288" w:lineRule="auto"/>
+        <w:ind w:left="115" w:right="115"/>
+        <w:shd w:fill="EAF7EF"/>
+        <w:pBdr>
+          <w:left w:val="single" w:sz="18" w:space="8" w:color="17663A"/>
+        </w:pBdr>
+      </w:pPr>
+      <w:r>
+        <w:rPr>
+          <w:rFonts w:ascii="Calibri" w:hAnsi="Calibri"/>
+          <w:b/>
+          <w:color w:val="17663A"/>
+          <w:sz w:val="21"/>
+        </w:rPr>
+        <w:t xml:space="preserve">CURRENT EVIDENCE  </w:t>
+      </w:r>
+      <w:r>
+        <w:rPr>
+          <w:rFonts w:ascii="Calibri" w:hAnsi="Calibri"/>
+          <w:color w:val="172033"/>
+          <w:sz w:val="21"/>
+        </w:rPr>
+        <w:t>Dedicated Google Cloud project: GODFIN Website; project ID: godfin-website; project number: 173410737907. Do not reuse this website client for the optional desktop Gmail integration.</w:t>
+      </w:r>
+    </w:p>
+    <w:p>
+      <w:pPr>
         <w:keepLines/>
         <w:numPr>
           <w:ilvl w:val="0"/>
@@ -1588,6 +1486,11 @@
       </w:pPr>
       <w:r>
         <w:t>Copy the client ID and client secret directly from Google into the Supabase Google provider form. Do not download or commit a client-secret JSON file.</w:t>
+      </w:r>
+    </w:p>
+    <w:p>
+      <w:r>
+        <w:br w:type="page"/>
       </w:r>
     </w:p>
     <w:p>
@@ -1743,7 +1646,7 @@
         <w:rPr>
           <w:b/>
         </w:rPr>
-        <w:t xml:space="preserve">Google Cloud project ID: </w:t>
+        <w:t xml:space="preserve">Google OAuth client name: </w:t>
       </w:r>
       <w:r>
         <w:t>__________________________________________________________________________</w:t>
@@ -2852,6 +2755,11 @@
       </w:r>
     </w:p>
     <w:p>
+      <w:r>
+        <w:br w:type="page"/>
+      </w:r>
+    </w:p>
+    <w:p>
       <w:pPr>
         <w:pStyle w:val="Heading2"/>
       </w:pPr>
@@ -3455,6 +3363,11 @@
       </w:r>
     </w:p>
     <w:p>
+      <w:r>
+        <w:br w:type="page"/>
+      </w:r>
+    </w:p>
+    <w:p>
       <w:pPr>
         <w:pStyle w:val="Heading1"/>
       </w:pPr>
@@ -3578,11 +3491,11 @@
         <w:keepLines/>
         <w:numPr>
           <w:ilvl w:val="0"/>
-          <w:numId w:val="12"/>
+          <w:numId w:val="10"/>
         </w:numPr>
       </w:pPr>
       <w:r>
-        <w:t>Vault and offline recovery copies are verified.</w:t>
+        <w:t>The owner test license must be kind owner_test, tier Max, linked to the owner’s first Supabase sign-in, absent from purchase/revenue records, stored only as a hash server-side, and activated through the same three-device verification flow as a paid license.</w:t>
       </w:r>
     </w:p>
     <w:p>
@@ -3594,7 +3507,7 @@
         </w:numPr>
       </w:pPr>
       <w:r>
-        <w:t>Three active installations succeed; the fourth is blocked.</w:t>
+        <w:t>Vault and offline recovery copies are verified.</w:t>
       </w:r>
     </w:p>
     <w:p>
@@ -3606,7 +3519,7 @@
         </w:numPr>
       </w:pPr>
       <w:r>
-        <w:t>Account-based deactivation and replacement succeed.</w:t>
+        <w:t>Three active installations succeed; the fourth is blocked.</w:t>
       </w:r>
     </w:p>
     <w:p>
@@ -3618,6 +3531,18 @@
         </w:numPr>
       </w:pPr>
       <w:r>
+        <w:t>Account-based deactivation and replacement succeed.</w:t>
+      </w:r>
+    </w:p>
+    <w:p>
+      <w:pPr>
+        <w:keepLines/>
+        <w:numPr>
+          <w:ilvl w:val="0"/>
+          <w:numId w:val="12"/>
+        </w:numPr>
+      </w:pPr>
+      <w:r>
         <w:t>No serial, IP fingerprint, payment method, or financial ledger is stored by licensing.</w:t>
       </w:r>
     </w:p>
@@ -3860,6 +3785,11 @@
       </w:r>
     </w:p>
     <w:p>
+      <w:r>
+        <w:br w:type="page"/>
+      </w:r>
+    </w:p>
+    <w:p>
       <w:pPr>
         <w:pStyle w:val="Heading1"/>
       </w:pPr>
@@ -4041,6 +3971,11 @@
       </w:r>
       <w:r>
         <w:t>__________________________________________________________________________</w:t>
+      </w:r>
+    </w:p>
+    <w:p>
+      <w:r>
+        <w:br w:type="page"/>
       </w:r>
     </w:p>
     <w:p>
@@ -4454,6 +4389,11 @@
       </w:r>
     </w:p>
     <w:p>
+      <w:r>
+        <w:br w:type="page"/>
+      </w:r>
+    </w:p>
+    <w:p>
       <w:pPr>
         <w:pStyle w:val="Heading1"/>
       </w:pPr>
@@ -4582,6 +4522,11 @@
       </w:pPr>
       <w:r>
         <w:t>Run a small internal dry run, reconcile accepted bundles to payouts, delete test identities, and obtain written approval before enabling the feature flag.</w:t>
+      </w:r>
+    </w:p>
+    <w:p>
+      <w:r>
+        <w:br w:type="page"/>
       </w:r>
     </w:p>
     <w:p>
@@ -4915,11 +4860,11 @@
       <w:tblGrid>
         <w:gridCol w:w="1800"/>
         <w:gridCol w:w="750"/>
-        <w:gridCol w:w="750"/>
-        <w:gridCol w:w="750"/>
+        <w:gridCol w:w="950"/>
+        <w:gridCol w:w="850"/>
         <w:gridCol w:w="1300"/>
-        <w:gridCol w:w="850"/>
-        <w:gridCol w:w="3160"/>
+        <w:gridCol w:w="1000"/>
+        <w:gridCol w:w="2710"/>
       </w:tblGrid>
       <w:tr>
         <w:trPr>
@@ -4981,7 +4926,7 @@
         </w:tc>
         <w:tc>
           <w:tcPr>
-            <w:tcW w:type="dxa" w:w="750"/>
+            <w:tcW w:type="dxa" w:w="950"/>
             <w:shd w:fill="E8EEF5"/>
             <w:tcMar>
               <w:top w:w="80" w:type="dxa"/>
@@ -5008,7 +4953,7 @@
         </w:tc>
         <w:tc>
           <w:tcPr>
-            <w:tcW w:type="dxa" w:w="750"/>
+            <w:tcW w:type="dxa" w:w="850"/>
             <w:shd w:fill="E8EEF5"/>
             <w:tcMar>
               <w:top w:w="80" w:type="dxa"/>
@@ -5062,7 +5007,7 @@
         </w:tc>
         <w:tc>
           <w:tcPr>
-            <w:tcW w:type="dxa" w:w="850"/>
+            <w:tcW w:type="dxa" w:w="1000"/>
             <w:shd w:fill="E8EEF5"/>
             <w:tcMar>
               <w:top w:w="80" w:type="dxa"/>
@@ -5089,7 +5034,7 @@
         </w:tc>
         <w:tc>
           <w:tcPr>
-            <w:tcW w:type="dxa" w:w="3160"/>
+            <w:tcW w:type="dxa" w:w="2710"/>
             <w:shd w:fill="E8EEF5"/>
             <w:tcMar>
               <w:top w:w="80" w:type="dxa"/>
@@ -5168,7 +5113,7 @@
         </w:tc>
         <w:tc>
           <w:tcPr>
-            <w:tcW w:type="dxa" w:w="750"/>
+            <w:tcW w:type="dxa" w:w="950"/>
             <w:tcMar>
               <w:top w:w="80" w:type="dxa"/>
               <w:start w:w="120" w:type="dxa"/>
@@ -5193,7 +5138,7 @@
         </w:tc>
         <w:tc>
           <w:tcPr>
-            <w:tcW w:type="dxa" w:w="750"/>
+            <w:tcW w:type="dxa" w:w="850"/>
             <w:tcMar>
               <w:top w:w="80" w:type="dxa"/>
               <w:start w:w="120" w:type="dxa"/>
@@ -5243,7 +5188,7 @@
         </w:tc>
         <w:tc>
           <w:tcPr>
-            <w:tcW w:type="dxa" w:w="850"/>
+            <w:tcW w:type="dxa" w:w="1000"/>
             <w:tcMar>
               <w:top w:w="80" w:type="dxa"/>
               <w:start w:w="120" w:type="dxa"/>
@@ -5268,7 +5213,7 @@
         </w:tc>
         <w:tc>
           <w:tcPr>
-            <w:tcW w:type="dxa" w:w="3160"/>
+            <w:tcW w:type="dxa" w:w="2710"/>
             <w:tcMar>
               <w:top w:w="80" w:type="dxa"/>
               <w:start w:w="120" w:type="dxa"/>
@@ -5344,7 +5289,7 @@
         </w:tc>
         <w:tc>
           <w:tcPr>
-            <w:tcW w:type="dxa" w:w="750"/>
+            <w:tcW w:type="dxa" w:w="950"/>
             <w:tcMar>
               <w:top w:w="80" w:type="dxa"/>
               <w:start w:w="120" w:type="dxa"/>
@@ -5369,7 +5314,7 @@
         </w:tc>
         <w:tc>
           <w:tcPr>
-            <w:tcW w:type="dxa" w:w="750"/>
+            <w:tcW w:type="dxa" w:w="850"/>
             <w:tcMar>
               <w:top w:w="80" w:type="dxa"/>
               <w:start w:w="120" w:type="dxa"/>
@@ -5419,7 +5364,7 @@
         </w:tc>
         <w:tc>
           <w:tcPr>
-            <w:tcW w:type="dxa" w:w="850"/>
+            <w:tcW w:type="dxa" w:w="1000"/>
             <w:tcMar>
               <w:top w:w="80" w:type="dxa"/>
               <w:start w:w="120" w:type="dxa"/>
@@ -5444,7 +5389,7 @@
         </w:tc>
         <w:tc>
           <w:tcPr>
-            <w:tcW w:type="dxa" w:w="3160"/>
+            <w:tcW w:type="dxa" w:w="2710"/>
             <w:tcMar>
               <w:top w:w="80" w:type="dxa"/>
               <w:start w:w="120" w:type="dxa"/>
@@ -5520,7 +5465,7 @@
         </w:tc>
         <w:tc>
           <w:tcPr>
-            <w:tcW w:type="dxa" w:w="750"/>
+            <w:tcW w:type="dxa" w:w="950"/>
             <w:tcMar>
               <w:top w:w="80" w:type="dxa"/>
               <w:start w:w="120" w:type="dxa"/>
@@ -5545,7 +5490,7 @@
         </w:tc>
         <w:tc>
           <w:tcPr>
-            <w:tcW w:type="dxa" w:w="750"/>
+            <w:tcW w:type="dxa" w:w="850"/>
             <w:tcMar>
               <w:top w:w="80" w:type="dxa"/>
               <w:start w:w="120" w:type="dxa"/>
@@ -5595,7 +5540,7 @@
         </w:tc>
         <w:tc>
           <w:tcPr>
-            <w:tcW w:type="dxa" w:w="850"/>
+            <w:tcW w:type="dxa" w:w="1000"/>
             <w:tcMar>
               <w:top w:w="80" w:type="dxa"/>
               <w:start w:w="120" w:type="dxa"/>
@@ -5620,7 +5565,7 @@
         </w:tc>
         <w:tc>
           <w:tcPr>
-            <w:tcW w:type="dxa" w:w="3160"/>
+            <w:tcW w:type="dxa" w:w="2710"/>
             <w:tcMar>
               <w:top w:w="80" w:type="dxa"/>
               <w:start w:w="120" w:type="dxa"/>
@@ -5696,7 +5641,7 @@
         </w:tc>
         <w:tc>
           <w:tcPr>
-            <w:tcW w:type="dxa" w:w="750"/>
+            <w:tcW w:type="dxa" w:w="950"/>
             <w:tcMar>
               <w:top w:w="80" w:type="dxa"/>
               <w:start w:w="120" w:type="dxa"/>
@@ -5721,7 +5666,7 @@
         </w:tc>
         <w:tc>
           <w:tcPr>
-            <w:tcW w:type="dxa" w:w="750"/>
+            <w:tcW w:type="dxa" w:w="850"/>
             <w:tcMar>
               <w:top w:w="80" w:type="dxa"/>
               <w:start w:w="120" w:type="dxa"/>
@@ -5771,7 +5716,7 @@
         </w:tc>
         <w:tc>
           <w:tcPr>
-            <w:tcW w:type="dxa" w:w="850"/>
+            <w:tcW w:type="dxa" w:w="1000"/>
             <w:tcMar>
               <w:top w:w="80" w:type="dxa"/>
               <w:start w:w="120" w:type="dxa"/>
@@ -5796,7 +5741,7 @@
         </w:tc>
         <w:tc>
           <w:tcPr>
-            <w:tcW w:type="dxa" w:w="3160"/>
+            <w:tcW w:type="dxa" w:w="2710"/>
             <w:tcMar>
               <w:top w:w="80" w:type="dxa"/>
               <w:start w:w="120" w:type="dxa"/>
@@ -5872,7 +5817,7 @@
         </w:tc>
         <w:tc>
           <w:tcPr>
-            <w:tcW w:type="dxa" w:w="750"/>
+            <w:tcW w:type="dxa" w:w="950"/>
             <w:tcMar>
               <w:top w:w="80" w:type="dxa"/>
               <w:start w:w="120" w:type="dxa"/>
@@ -5897,7 +5842,7 @@
         </w:tc>
         <w:tc>
           <w:tcPr>
-            <w:tcW w:type="dxa" w:w="750"/>
+            <w:tcW w:type="dxa" w:w="850"/>
             <w:tcMar>
               <w:top w:w="80" w:type="dxa"/>
               <w:start w:w="120" w:type="dxa"/>
@@ -5947,7 +5892,7 @@
         </w:tc>
         <w:tc>
           <w:tcPr>
-            <w:tcW w:type="dxa" w:w="850"/>
+            <w:tcW w:type="dxa" w:w="1000"/>
             <w:tcMar>
               <w:top w:w="80" w:type="dxa"/>
               <w:start w:w="120" w:type="dxa"/>
@@ -5972,7 +5917,7 @@
         </w:tc>
         <w:tc>
           <w:tcPr>
-            <w:tcW w:type="dxa" w:w="3160"/>
+            <w:tcW w:type="dxa" w:w="2710"/>
             <w:tcMar>
               <w:top w:w="80" w:type="dxa"/>
               <w:start w:w="120" w:type="dxa"/>
@@ -6142,6 +6087,11 @@
       </w:r>
     </w:p>
     <w:p>
+      <w:r>
+        <w:br w:type="page"/>
+      </w:r>
+    </w:p>
+    <w:p>
       <w:pPr>
         <w:pStyle w:val="Heading1"/>
       </w:pPr>
@@ -6158,7 +6108,7 @@
         </w:numPr>
       </w:pPr>
       <w:r>
-        <w:t>Backend: at least 306 tests pass, including auth/PIN, encryption, migrations, backups, merchant upsert, licenses, classification memory, performance, net worth, behavior insights, and reward-pilot redaction.</w:t>
+        <w:t>Backend: at least 324 tests pass, including auth/PIN, encryption, migrations, backups, merchant upsert, licenses, goal ledgers and FD/RD suggestions, simulation reference vectors, recurring detection, atomic accounts, package privacy, CA tax pack, classification memory, performance, net worth, behavior insights, and reward-pilot redaction.</w:t>
       </w:r>
     </w:p>
     <w:p>
@@ -6170,7 +6120,7 @@
         </w:numPr>
       </w:pPr>
       <w:r>
-        <w:t>Frontend: lint and production build pass. Production Playwright import/classify/report, navigation budget, mobile PIN touch target, menu names, and tutorial keyboard flows pass.</w:t>
+        <w:t>Frontend: lint and production build pass. Focused Playwright covers PIN entry, portal calculation help, goals, recurring re-detection, external pricing, settings disclosure, and CA tax-pack controls.</w:t>
       </w:r>
     </w:p>
     <w:p>
@@ -6182,7 +6132,7 @@
         </w:numPr>
       </w:pPr>
       <w:r>
-        <w:t>Website: entitlement/payment contract verification, production build, security headers, checkout safe-disable behavior, and dependency audit pass.</w:t>
+        <w:t>Website: entitlement/payment contract verification, production build, real-app product chapters, reduced-motion fallbacks, mobile overflow, lifetime/no-bundled-credit pricing, security headers, checkout safe-disable behavior, and dependency audit pass. The final production URL scores Lighthouse performance 99, accessibility 100, and SEO 100, with LCP 1.73 seconds and CLS 0.</w:t>
       </w:r>
     </w:p>
     <w:p>
@@ -6537,11 +6487,43 @@
       </w:r>
     </w:p>
     <w:p>
+      <w:r>
+        <w:br w:type="page"/>
+      </w:r>
+    </w:p>
+    <w:p>
       <w:pPr>
         <w:pStyle w:val="Heading1"/>
       </w:pPr>
       <w:r>
         <w:t>15. Final website and support acceptance</w:t>
+      </w:r>
+    </w:p>
+    <w:p>
+      <w:pPr>
+        <w:spacing w:before="100" w:after="160" w:line="288" w:lineRule="auto"/>
+        <w:ind w:left="115" w:right="115"/>
+        <w:shd w:fill="EAF7EF"/>
+        <w:pBdr>
+          <w:left w:val="single" w:sz="18" w:space="8" w:color="17663A"/>
+        </w:pBdr>
+      </w:pPr>
+      <w:r>
+        <w:rPr>
+          <w:rFonts w:ascii="Calibri" w:hAnsi="Calibri"/>
+          <w:b/>
+          <w:color w:val="17663A"/>
+          <w:sz w:val="21"/>
+        </w:rPr>
+        <w:t xml:space="preserve">VERIFIED ASSETS  </w:t>
+      </w:r>
+      <w:r>
+        <w:rPr>
+          <w:rFonts w:ascii="Calibri" w:hAnsi="Calibri"/>
+          <w:color w:val="172033"/>
+          <w:sz w:val="21"/>
+        </w:rPr>
+        <w:t>The current website tour demonstrates imports, learned classification, goals, recurring detection, CA tax packs, and local privacy using synthetic-data captures from the real React application. A muted WebM/MP4 loop, still posters, lazy loading, and prefers-reduced-motion fallbacks are included.</w:t>
       </w:r>
     </w:p>
     <w:p>
@@ -6698,6 +6680,11 @@
       </w:pPr>
       <w:r>
         <w:t>Screenshots and demo match the final candidate.</w:t>
+      </w:r>
+    </w:p>
+    <w:p>
+      <w:r>
+        <w:br w:type="page"/>
       </w:r>
     </w:p>
     <w:p>
@@ -8069,6 +8056,11 @@
       </w:pPr>
     </w:p>
     <w:p>
+      <w:r>
+        <w:br w:type="page"/>
+      </w:r>
+    </w:p>
+    <w:p>
       <w:pPr>
         <w:spacing w:after="80"/>
       </w:pPr>
@@ -8185,7 +8177,7 @@
     <w:pPr>
       <w:pStyle w:val="Footer"/>
       <w:spacing w:after="0"/>
-      <w:jc w:val="right"/>
+      <w:jc w:val="center"/>
     </w:pPr>
     <w:r>
       <w:rPr>
@@ -8461,10 +8453,10 @@
       <w:lvlJc w:val="left"/>
       <w:pPr>
         <w:tabs>
-          <w:tab w:val="num" w:pos="540"/>
+          <w:tab w:val="num" w:pos="720"/>
         </w:tabs>
-        <w:ind w:left="540" w:hanging="270"/>
-        <w:spacing w:after="80" w:line="300" w:lineRule="auto"/>
+        <w:ind w:left="720" w:hanging="360"/>
+        <w:spacing w:after="60" w:line="276" w:lineRule="auto"/>
       </w:pPr>
     </w:lvl>
   </w:abstractNum>
@@ -8480,10 +8472,10 @@
       <w:lvlJc w:val="left"/>
       <w:pPr>
         <w:tabs>
-          <w:tab w:val="num" w:pos="540"/>
+          <w:tab w:val="num" w:pos="720"/>
         </w:tabs>
-        <w:ind w:left="540" w:hanging="270"/>
-        <w:spacing w:after="80" w:line="300" w:lineRule="auto"/>
+        <w:ind w:left="720" w:hanging="360"/>
+        <w:spacing w:after="60" w:line="276" w:lineRule="auto"/>
       </w:pPr>
       <w:rPr>
         <w:rFonts w:ascii="Segoe UI Symbol" w:hAnsi="Segoe UI Symbol"/>
@@ -8502,10 +8494,10 @@
       <w:lvlJc w:val="left"/>
       <w:pPr>
         <w:tabs>
-          <w:tab w:val="num" w:pos="540"/>
+          <w:tab w:val="num" w:pos="720"/>
         </w:tabs>
-        <w:ind w:left="540" w:hanging="270"/>
-        <w:spacing w:after="80" w:line="300" w:lineRule="auto"/>
+        <w:ind w:left="720" w:hanging="360"/>
+        <w:spacing w:after="60" w:line="276" w:lineRule="auto"/>
       </w:pPr>
       <w:rPr>
         <w:rFonts w:ascii="Segoe UI Symbol" w:hAnsi="Segoe UI Symbol"/>
@@ -8679,12 +8671,12 @@
     <w:qFormat/>
     <w:rsid w:val="00FC693F"/>
     <w:pPr>
-      <w:spacing w:before="0" w:after="120" w:line="300" w:lineRule="auto"/>
+      <w:spacing w:before="0" w:after="80" w:line="276" w:lineRule="auto"/>
     </w:pPr>
     <w:rPr>
       <w:rFonts w:ascii="Calibri" w:hAnsi="Calibri"/>
       <w:color w:val="172033"/>
-      <w:sz w:val="22"/>
+      <w:sz w:val="21"/>
     </w:rPr>
   </w:style>
   <w:style w:type="paragraph" w:styleId="Header">

</xml_diff>

<commit_message>
docs: record OAuth and owner access evidence
</commit_message>
<xml_diff>
--- a/docs/GODFIN_OWNER_COMPLETION_RUNBOOK.docx
+++ b/docs/GODFIN_OWNER_COMPLETION_RUNBOOK.docx
@@ -64,7 +64,7 @@
           <w:color w:val="667085"/>
           <w:sz w:val="20"/>
         </w:rPr>
-        <w:t>Version 2.1  •  30 July 2026  •  oculusrex14/GODFIN (private)</w:t>
+        <w:t>Version 2.2  •  30 July 2026  •  oculusrex14/GODFIN (private)</w:t>
         <w:br/>
         <w:t>Production branch: codex/godfin-production-v4</w:t>
       </w:r>
@@ -328,7 +328,19 @@
         </w:numPr>
       </w:pPr>
       <w:r>
-        <w:t>Google Cloud project GODFIN Website (project ID godfin-website) is owner-controlled. Google OAuth remains pending only until the owner accepts Google’s user-data-policy acknowledgement and the final callback test passes.</w:t>
+        <w:t>Google OAuth is active. The owner-controlled GODFIN Website project uses the rotated web client named GODFIN Website Rotated; the provider requests only openid/email/profile, the original client is revoked, and production sign-in returned successfully to /account twice on 30 July 2026.</w:t>
+      </w:r>
+    </w:p>
+    <w:p>
+      <w:pPr>
+        <w:keepLines/>
+        <w:numPr>
+          <w:ilvl w:val="0"/>
+          <w:numId w:val="11"/>
+        </w:numPr>
+      </w:pPr>
+      <w:r>
+        <w:t>A non-revenue Max owner_test license is active for the owner account. The server stores only its hash, purchase history remains empty, and one macOS arm64 installation is verified through the normal three-device flow. The full key is retained only in macOS Keychain and encrypted local app storage.</w:t>
       </w:r>
     </w:p>
     <w:p>
@@ -503,108 +515,6 @@
                 <w:sz w:val="19"/>
               </w:rPr>
               <w:t>Completion evidence</w:t>
-            </w:r>
-          </w:p>
-        </w:tc>
-      </w:tr>
-      <w:tr>
-        <w:tc>
-          <w:tcPr>
-            <w:tcW w:type="dxa" w:w="1500"/>
-            <w:tcMar>
-              <w:top w:w="80" w:type="dxa"/>
-              <w:start w:w="120" w:type="dxa"/>
-              <w:bottom w:w="80" w:type="dxa"/>
-              <w:end w:w="120" w:type="dxa"/>
-            </w:tcMar>
-            <w:vAlign w:val="center"/>
-          </w:tcPr>
-          <w:p>
-            <w:pPr>
-              <w:spacing w:after="0"/>
-            </w:pPr>
-            <w:r>
-              <w:rPr>
-                <w:rFonts w:ascii="Calibri" w:hAnsi="Calibri"/>
-                <w:color w:val="172033"/>
-                <w:sz w:val="18"/>
-              </w:rPr>
-              <w:t>Google OAuth</w:t>
-            </w:r>
-          </w:p>
-        </w:tc>
-        <w:tc>
-          <w:tcPr>
-            <w:tcW w:type="dxa" w:w="2100"/>
-            <w:tcMar>
-              <w:top w:w="80" w:type="dxa"/>
-              <w:start w:w="120" w:type="dxa"/>
-              <w:bottom w:w="80" w:type="dxa"/>
-              <w:end w:w="120" w:type="dxa"/>
-            </w:tcMar>
-            <w:vAlign w:val="center"/>
-          </w:tcPr>
-          <w:p>
-            <w:pPr>
-              <w:spacing w:after="0"/>
-            </w:pPr>
-            <w:r>
-              <w:rPr>
-                <w:rFonts w:ascii="Calibri" w:hAnsi="Calibri"/>
-                <w:color w:val="172033"/>
-                <w:sz w:val="18"/>
-              </w:rPr>
-              <w:t>The dedicated Google project exists; Google requires the owner to accept its user-data-policy acknowledgement before client creation can finish.</w:t>
-            </w:r>
-          </w:p>
-        </w:tc>
-        <w:tc>
-          <w:tcPr>
-            <w:tcW w:type="dxa" w:w="3000"/>
-            <w:tcMar>
-              <w:top w:w="80" w:type="dxa"/>
-              <w:start w:w="120" w:type="dxa"/>
-              <w:bottom w:w="80" w:type="dxa"/>
-              <w:end w:w="120" w:type="dxa"/>
-            </w:tcMar>
-            <w:vAlign w:val="center"/>
-          </w:tcPr>
-          <w:p>
-            <w:pPr>
-              <w:spacing w:after="0"/>
-            </w:pPr>
-            <w:r>
-              <w:rPr>
-                <w:rFonts w:ascii="Calibri" w:hAnsi="Calibri"/>
-                <w:color w:val="172033"/>
-                <w:sz w:val="18"/>
-              </w:rPr>
-              <w:t>Review and accept the policy in the open browser, then let Codex finish client/provider setup.</w:t>
-            </w:r>
-          </w:p>
-        </w:tc>
-        <w:tc>
-          <w:tcPr>
-            <w:tcW w:type="dxa" w:w="2760"/>
-            <w:tcMar>
-              <w:top w:w="80" w:type="dxa"/>
-              <w:start w:w="120" w:type="dxa"/>
-              <w:bottom w:w="80" w:type="dxa"/>
-              <w:end w:w="120" w:type="dxa"/>
-            </w:tcMar>
-            <w:vAlign w:val="center"/>
-          </w:tcPr>
-          <w:p>
-            <w:pPr>
-              <w:spacing w:after="0"/>
-            </w:pPr>
-            <w:r>
-              <w:rPr>
-                <w:rFonts w:ascii="Calibri" w:hAnsi="Calibri"/>
-                <w:color w:val="172033"/>
-                <w:sz w:val="18"/>
-              </w:rPr>
-              <w:t>Google sign-in returns to /account with only openid/email/profile.</w:t>
             </w:r>
           </w:p>
         </w:tc>
@@ -1401,7 +1311,7 @@
           <w:color w:val="172033"/>
           <w:sz w:val="21"/>
         </w:rPr>
-        <w:t>Dedicated Google Cloud project: GODFIN Website; project ID: godfin-website; project number: 173410737907. Do not reuse this website client for the optional desktop Gmail integration.</w:t>
+        <w:t>Completed 30 July 2026. Dedicated Google Cloud project: GODFIN Website; project ID: godfin-website; project number: 173410737907. The active web client is GODFIN Website Rotated. Supabase Google authentication is enabled, the original client is revoked, and two production callback runs returned the owner account to /account. Do not reuse this website client for the optional desktop Gmail integration.</w:t>
       </w:r>
     </w:p>
     <w:p>
@@ -1636,6 +1546,33 @@
       </w:pPr>
       <w:r>
         <w:t>The client secret exists only in Google/Supabase and the business vault.</w:t>
+      </w:r>
+    </w:p>
+    <w:p>
+      <w:pPr>
+        <w:spacing w:before="100" w:after="160" w:line="288" w:lineRule="auto"/>
+        <w:ind w:left="115" w:right="115"/>
+        <w:shd w:fill="EAF7EF"/>
+        <w:pBdr>
+          <w:left w:val="single" w:sz="18" w:space="8" w:color="17663A"/>
+        </w:pBdr>
+      </w:pPr>
+      <w:r>
+        <w:rPr>
+          <w:rFonts w:ascii="Calibri" w:hAnsi="Calibri"/>
+          <w:b/>
+          <w:color w:val="17663A"/>
+          <w:sz w:val="21"/>
+        </w:rPr>
+        <w:t xml:space="preserve">VERIFIED  </w:t>
+      </w:r>
+      <w:r>
+        <w:rPr>
+          <w:rFonts w:ascii="Calibri" w:hAnsi="Calibri"/>
+          <w:color w:val="172033"/>
+          <w:sz w:val="21"/>
+        </w:rPr>
+        <w:t>The production origin is https://godfin.vercel.app, the Supabase callback is https://omrtkfwjauyakhvynutk.supabase.co/auth/v1/callback, and the website callback is https://godfin.vercel.app/auth/callback. A distinct second-account isolation test remains a pre-launch gate.</w:t>
       </w:r>
     </w:p>
     <w:p>
@@ -3495,7 +3432,7 @@
         </w:numPr>
       </w:pPr>
       <w:r>
-        <w:t>The owner test license must be kind owner_test, tier Max, linked to the owner’s first Supabase sign-in, absent from purchase/revenue records, stored only as a hash server-side, and activated through the same three-device verification flow as a paid license.</w:t>
+        <w:t>Completed 30 July 2026: the owner license is kind owner_test, tier Max, linked to the owner’s Supabase account, absent from purchase/revenue records, stored only as a hash server-side, and activated on one macOS arm64 installation through the normal verification flow. Its full key is not reproduced in this document.</w:t>
       </w:r>
     </w:p>
     <w:p>
@@ -6871,7 +6808,109 @@
                 <w:color w:val="172033"/>
                 <w:sz w:val="18"/>
               </w:rPr>
-              <w:t>Google OAuth + account isolation</w:t>
+              <w:t>Google OAuth callback</w:t>
+            </w:r>
+          </w:p>
+        </w:tc>
+        <w:tc>
+          <w:tcPr>
+            <w:tcW w:type="dxa" w:w="1450"/>
+            <w:tcMar>
+              <w:top w:w="80" w:type="dxa"/>
+              <w:start w:w="120" w:type="dxa"/>
+              <w:bottom w:w="80" w:type="dxa"/>
+              <w:end w:w="120" w:type="dxa"/>
+            </w:tcMar>
+            <w:vAlign w:val="center"/>
+          </w:tcPr>
+          <w:p>
+            <w:pPr>
+              <w:spacing w:after="0"/>
+            </w:pPr>
+            <w:r>
+              <w:rPr>
+                <w:rFonts w:ascii="Calibri" w:hAnsi="Calibri"/>
+                <w:color w:val="172033"/>
+                <w:sz w:val="18"/>
+              </w:rPr>
+              <w:t>Codex</w:t>
+            </w:r>
+          </w:p>
+        </w:tc>
+        <w:tc>
+          <w:tcPr>
+            <w:tcW w:type="dxa" w:w="900"/>
+            <w:tcMar>
+              <w:top w:w="80" w:type="dxa"/>
+              <w:start w:w="120" w:type="dxa"/>
+              <w:bottom w:w="80" w:type="dxa"/>
+              <w:end w:w="120" w:type="dxa"/>
+            </w:tcMar>
+            <w:vAlign w:val="center"/>
+          </w:tcPr>
+          <w:p>
+            <w:pPr>
+              <w:spacing w:after="0"/>
+            </w:pPr>
+            <w:r>
+              <w:rPr>
+                <w:rFonts w:ascii="Calibri" w:hAnsi="Calibri"/>
+                <w:color w:val="172033"/>
+                <w:sz w:val="18"/>
+              </w:rPr>
+              <w:t>☒</w:t>
+            </w:r>
+          </w:p>
+        </w:tc>
+        <w:tc>
+          <w:tcPr>
+            <w:tcW w:type="dxa" w:w="3510"/>
+            <w:tcMar>
+              <w:top w:w="80" w:type="dxa"/>
+              <w:start w:w="120" w:type="dxa"/>
+              <w:bottom w:w="80" w:type="dxa"/>
+              <w:end w:w="120" w:type="dxa"/>
+            </w:tcMar>
+            <w:vAlign w:val="center"/>
+          </w:tcPr>
+          <w:p>
+            <w:pPr>
+              <w:spacing w:after="0"/>
+            </w:pPr>
+            <w:r>
+              <w:rPr>
+                <w:rFonts w:ascii="Calibri" w:hAnsi="Calibri"/>
+                <w:color w:val="172033"/>
+                <w:sz w:val="18"/>
+              </w:rPr>
+              <w:t>Production callback passed twice on 30 Jul 2026; rotated client active; original client revoked.</w:t>
+            </w:r>
+          </w:p>
+        </w:tc>
+      </w:tr>
+      <w:tr>
+        <w:tc>
+          <w:tcPr>
+            <w:tcW w:type="dxa" w:w="3500"/>
+            <w:tcMar>
+              <w:top w:w="80" w:type="dxa"/>
+              <w:start w:w="120" w:type="dxa"/>
+              <w:bottom w:w="80" w:type="dxa"/>
+              <w:end w:w="120" w:type="dxa"/>
+            </w:tcMar>
+            <w:vAlign w:val="center"/>
+          </w:tcPr>
+          <w:p>
+            <w:pPr>
+              <w:spacing w:after="0"/>
+            </w:pPr>
+            <w:r>
+              <w:rPr>
+                <w:rFonts w:ascii="Calibri" w:hAnsi="Calibri"/>
+                <w:color w:val="172033"/>
+                <w:sz w:val="18"/>
+              </w:rPr>
+              <w:t>Second-account isolation</w:t>
             </w:r>
           </w:p>
         </w:tc>
@@ -6945,6 +6984,7 @@
                 <w:color w:val="172033"/>
                 <w:sz w:val="18"/>
               </w:rPr>
+              <w:t>Repeat with a distinct Google test account before public launch.</w:t>
             </w:r>
           </w:p>
         </w:tc>

</xml_diff>

<commit_message>
docs(operations): refresh owner completion runbook [GF-ASSET-001] [GF-OPS-001]
</commit_message>
<xml_diff>
--- a/docs/GODFIN_OWNER_COMPLETION_RUNBOOK.docx
+++ b/docs/GODFIN_OWNER_COMPLETION_RUNBOOK.docx
@@ -64,9 +64,9 @@
           <w:color w:val="667085"/>
           <w:sz w:val="20"/>
         </w:rPr>
-        <w:t>Version 2.2  •  30 July 2026  •  oculusrex14/GODFIN (private)</w:t>
+        <w:t>Version 2.3  •  16 August 2026  •  oculusrex14/GODFIN (private)</w:t>
         <w:br/>
-        <w:t>Production branch: codex/godfin-production-v4</w:t>
+        <w:t>Production branch: codex/godfin-production-v5</w:t>
       </w:r>
     </w:p>
     <w:p>
@@ -220,7 +220,7 @@
           <w:color w:val="172033"/>
           <w:sz w:val="21"/>
         </w:rPr>
-        <w:t>Production remediation through accounts, reporting, and the website product tour is implemented on the private v4 branch. The local baseline is 324 passing backend tests; frontend and website production builds pass; focused desktop and website Playwright checks pass; package privacy inspection finds no local database, statement, Gmail credential, backup, or personal account artifact.</w:t>
+        <w:t>Production remediation is tracked on the private v5 branch. The clean Python 3.12 baseline is 859 passing backend tests. Frontend lint, accessibility, authentication, and production builds pass; website contract and production builds pass; desktop release/update tests pass 12/12; and package privacy checks pass 7/7.</w:t>
       </w:r>
     </w:p>
     <w:p>
@@ -352,7 +352,67 @@
         </w:numPr>
       </w:pPr>
       <w:r>
-        <w:t>Stripe KYC/prices, Resend/DNS, custom domain, Apple/Windows certificates, R2, clean-VM evidence, and public-launch authorization are not yet complete.</w:t>
+        <w:t>Dependency surfaces are separated into runtime, test, and build locks. The Gmail API client is an explicit runtime dependency. All four JavaScript workspaces and both Python lock surfaces audit with no unaccepted known vulnerability; the qualified cryptography finding is documented in the signed evidence.</w:t>
+      </w:r>
+    </w:p>
+    <w:p>
+      <w:pPr>
+        <w:keepLines/>
+        <w:numPr>
+          <w:ilvl w:val="0"/>
+          <w:numId w:val="11"/>
+        </w:numPr>
+      </w:pPr>
+      <w:r>
+        <w:t>The deterministic CycloneDX 1.6 SBOM contains 1,008 unique components with zero unresolved license identifiers. Third-party notices list all conditional licenses. Final human legal clearance is intentionally fail-closed and remains pending in supply-chain/legal-clearance.json.</w:t>
+      </w:r>
+    </w:p>
+    <w:p>
+      <w:pPr>
+        <w:keepLines/>
+        <w:numPr>
+          <w:ilvl w:val="0"/>
+          <w:numId w:val="11"/>
+        </w:numPr>
+      </w:pPr>
+      <w:r>
+        <w:t>A fresh local macOS arm64 package was built from the locked toolchain. It starts in 2.916 seconds on first launch and 0.926 seconds on restart, preserves its database, enforces the local trust boundary, and remains below the 700 MB idle-memory budget at 605.6 MB. This is an ad-hoc local test signature, not an Apple-notarized customer release.</w:t>
+      </w:r>
+    </w:p>
+    <w:p>
+      <w:pPr>
+        <w:keepLines/>
+        <w:numPr>
+          <w:ilvl w:val="0"/>
+          <w:numId w:val="11"/>
+        </w:numPr>
+      </w:pPr>
+      <w:r>
+        <w:t>Release workflows require exact tag, commit, and package-version agreement; refuse an existing GitHub Release; publish deterministic SBOM, notices, checksums, and provenance; use immutable action SHAs; and require staged promotion plus a reviewed rollback path.</w:t>
+      </w:r>
+    </w:p>
+    <w:p>
+      <w:pPr>
+        <w:keepLines/>
+        <w:numPr>
+          <w:ilvl w:val="0"/>
+          <w:numId w:val="11"/>
+        </w:numPr>
+      </w:pPr>
+      <w:r>
+        <w:t>Repository evidence is current through commit 59c146a on codex/godfin-production-v5.</w:t>
+      </w:r>
+    </w:p>
+    <w:p>
+      <w:pPr>
+        <w:keepLines/>
+        <w:numPr>
+          <w:ilvl w:val="0"/>
+          <w:numId w:val="11"/>
+        </w:numPr>
+      </w:pPr>
+      <w:r>
+        <w:t>Desktop Gmail OAuth configuration, final browser-family verification, Stripe KYC/prices, Resend/DNS, custom domain, Apple/Windows certificates, R2, cross-platform clean-system evidence, dependency-license approval, and public-launch authorization are not yet complete.</w:t>
       </w:r>
     </w:p>
     <w:p>
@@ -515,6 +575,210 @@
                 <w:sz w:val="19"/>
               </w:rPr>
               <w:t>Completion evidence</w:t>
+            </w:r>
+          </w:p>
+        </w:tc>
+      </w:tr>
+      <w:tr>
+        <w:tc>
+          <w:tcPr>
+            <w:tcW w:type="dxa" w:w="1500"/>
+            <w:tcMar>
+              <w:top w:w="80" w:type="dxa"/>
+              <w:start w:w="120" w:type="dxa"/>
+              <w:bottom w:w="80" w:type="dxa"/>
+              <w:end w:w="120" w:type="dxa"/>
+            </w:tcMar>
+            <w:vAlign w:val="center"/>
+          </w:tcPr>
+          <w:p>
+            <w:pPr>
+              <w:spacing w:after="0"/>
+            </w:pPr>
+            <w:r>
+              <w:rPr>
+                <w:rFonts w:ascii="Calibri" w:hAnsi="Calibri"/>
+                <w:color w:val="172033"/>
+                <w:sz w:val="18"/>
+              </w:rPr>
+              <w:t>Desktop Gmail OAuth</w:t>
+            </w:r>
+          </w:p>
+        </w:tc>
+        <w:tc>
+          <w:tcPr>
+            <w:tcW w:type="dxa" w:w="2100"/>
+            <w:tcMar>
+              <w:top w:w="80" w:type="dxa"/>
+              <w:start w:w="120" w:type="dxa"/>
+              <w:bottom w:w="80" w:type="dxa"/>
+              <w:end w:w="120" w:type="dxa"/>
+            </w:tcMar>
+            <w:vAlign w:val="center"/>
+          </w:tcPr>
+          <w:p>
+            <w:pPr>
+              <w:spacing w:after="0"/>
+            </w:pPr>
+            <w:r>
+              <w:rPr>
+                <w:rFonts w:ascii="Calibri" w:hAnsi="Calibri"/>
+                <w:color w:val="172033"/>
+                <w:sz w:val="18"/>
+              </w:rPr>
+              <w:t>No owner desktop OAuth client is installed outside the repository.</w:t>
+            </w:r>
+          </w:p>
+        </w:tc>
+        <w:tc>
+          <w:tcPr>
+            <w:tcW w:type="dxa" w:w="3000"/>
+            <w:tcMar>
+              <w:top w:w="80" w:type="dxa"/>
+              <w:start w:w="120" w:type="dxa"/>
+              <w:bottom w:w="80" w:type="dxa"/>
+              <w:end w:w="120" w:type="dxa"/>
+            </w:tcMar>
+            <w:vAlign w:val="center"/>
+          </w:tcPr>
+          <w:p>
+            <w:pPr>
+              <w:spacing w:after="0"/>
+            </w:pPr>
+            <w:r>
+              <w:rPr>
+                <w:rFonts w:ascii="Calibri" w:hAnsi="Calibri"/>
+                <w:color w:val="172033"/>
+                <w:sz w:val="18"/>
+              </w:rPr>
+              <w:t>Create the separate read-only Gmail desktop client and store its JSON privately.</w:t>
+            </w:r>
+          </w:p>
+        </w:tc>
+        <w:tc>
+          <w:tcPr>
+            <w:tcW w:type="dxa" w:w="2760"/>
+            <w:tcMar>
+              <w:top w:w="80" w:type="dxa"/>
+              <w:start w:w="120" w:type="dxa"/>
+              <w:bottom w:w="80" w:type="dxa"/>
+              <w:end w:w="120" w:type="dxa"/>
+            </w:tcMar>
+            <w:vAlign w:val="center"/>
+          </w:tcPr>
+          <w:p>
+            <w:pPr>
+              <w:spacing w:after="0"/>
+            </w:pPr>
+            <w:r>
+              <w:rPr>
+                <w:rFonts w:ascii="Calibri" w:hAnsi="Calibri"/>
+                <w:color w:val="172033"/>
+                <w:sz w:val="18"/>
+              </w:rPr>
+              <w:t>Connect, callback, status, sync, disconnect, and reauthorization pass.</w:t>
+            </w:r>
+          </w:p>
+        </w:tc>
+      </w:tr>
+      <w:tr>
+        <w:tc>
+          <w:tcPr>
+            <w:tcW w:type="dxa" w:w="1500"/>
+            <w:tcMar>
+              <w:top w:w="80" w:type="dxa"/>
+              <w:start w:w="120" w:type="dxa"/>
+              <w:bottom w:w="80" w:type="dxa"/>
+              <w:end w:w="120" w:type="dxa"/>
+            </w:tcMar>
+            <w:vAlign w:val="center"/>
+          </w:tcPr>
+          <w:p>
+            <w:pPr>
+              <w:spacing w:after="0"/>
+            </w:pPr>
+            <w:r>
+              <w:rPr>
+                <w:rFonts w:ascii="Calibri" w:hAnsi="Calibri"/>
+                <w:color w:val="172033"/>
+                <w:sz w:val="18"/>
+              </w:rPr>
+              <w:t>Dependency legal review</w:t>
+            </w:r>
+          </w:p>
+        </w:tc>
+        <w:tc>
+          <w:tcPr>
+            <w:tcW w:type="dxa" w:w="2100"/>
+            <w:tcMar>
+              <w:top w:w="80" w:type="dxa"/>
+              <w:start w:w="120" w:type="dxa"/>
+              <w:bottom w:w="80" w:type="dxa"/>
+              <w:end w:w="120" w:type="dxa"/>
+            </w:tcMar>
+            <w:vAlign w:val="center"/>
+          </w:tcPr>
+          <w:p>
+            <w:pPr>
+              <w:spacing w:after="0"/>
+            </w:pPr>
+            <w:r>
+              <w:rPr>
+                <w:rFonts w:ascii="Calibri" w:hAnsi="Calibri"/>
+                <w:color w:val="172033"/>
+                <w:sz w:val="18"/>
+              </w:rPr>
+              <w:t>Automated license inventory is complete; human approval is not.</w:t>
+            </w:r>
+          </w:p>
+        </w:tc>
+        <w:tc>
+          <w:tcPr>
+            <w:tcW w:type="dxa" w:w="3000"/>
+            <w:tcMar>
+              <w:top w:w="80" w:type="dxa"/>
+              <w:start w:w="120" w:type="dxa"/>
+              <w:bottom w:w="80" w:type="dxa"/>
+              <w:end w:w="120" w:type="dxa"/>
+            </w:tcMar>
+            <w:vAlign w:val="center"/>
+          </w:tcPr>
+          <w:p>
+            <w:pPr>
+              <w:spacing w:after="0"/>
+            </w:pPr>
+            <w:r>
+              <w:rPr>
+                <w:rFonts w:ascii="Calibri" w:hAnsi="Calibri"/>
+                <w:color w:val="172033"/>
+                <w:sz w:val="18"/>
+              </w:rPr>
+              <w:t>Review conditional licenses and sign legal-clearance.json without changing evidence hashes.</w:t>
+            </w:r>
+          </w:p>
+        </w:tc>
+        <w:tc>
+          <w:tcPr>
+            <w:tcW w:type="dxa" w:w="2760"/>
+            <w:tcMar>
+              <w:top w:w="80" w:type="dxa"/>
+              <w:start w:w="120" w:type="dxa"/>
+              <w:bottom w:w="80" w:type="dxa"/>
+              <w:end w:w="120" w:type="dxa"/>
+            </w:tcMar>
+            <w:vAlign w:val="center"/>
+          </w:tcPr>
+          <w:p>
+            <w:pPr>
+              <w:spacing w:after="0"/>
+            </w:pPr>
+            <w:r>
+              <w:rPr>
+                <w:rFonts w:ascii="Calibri" w:hAnsi="Calibri"/>
+                <w:color w:val="172033"/>
+                <w:sz w:val="18"/>
+              </w:rPr>
+              <w:t>Release gate reports approved and the signed record is archived.</w:t>
             </w:r>
           </w:p>
         </w:tc>
@@ -1076,7 +1340,7 @@
                 <w:color w:val="172033"/>
                 <w:sz w:val="18"/>
               </w:rPr>
-              <w:t>Only local macOS packaging is evidenced.</w:t>
+              <w:t>Only local macOS arm64 packaging is evidenced.</w:t>
             </w:r>
           </w:p>
         </w:tc>
@@ -1127,6 +1391,108 @@
                 <w:sz w:val="18"/>
               </w:rPr>
               <w:t>Install/upgrade/recovery matrix is signed.</w:t>
+            </w:r>
+          </w:p>
+        </w:tc>
+      </w:tr>
+      <w:tr>
+        <w:tc>
+          <w:tcPr>
+            <w:tcW w:type="dxa" w:w="1500"/>
+            <w:tcMar>
+              <w:top w:w="80" w:type="dxa"/>
+              <w:start w:w="120" w:type="dxa"/>
+              <w:bottom w:w="80" w:type="dxa"/>
+              <w:end w:w="120" w:type="dxa"/>
+            </w:tcMar>
+            <w:vAlign w:val="center"/>
+          </w:tcPr>
+          <w:p>
+            <w:pPr>
+              <w:spacing w:after="0"/>
+            </w:pPr>
+            <w:r>
+              <w:rPr>
+                <w:rFonts w:ascii="Calibri" w:hAnsi="Calibri"/>
+                <w:color w:val="172033"/>
+                <w:sz w:val="18"/>
+              </w:rPr>
+              <w:t>Browser matrix</w:t>
+            </w:r>
+          </w:p>
+        </w:tc>
+        <w:tc>
+          <w:tcPr>
+            <w:tcW w:type="dxa" w:w="2100"/>
+            <w:tcMar>
+              <w:top w:w="80" w:type="dxa"/>
+              <w:start w:w="120" w:type="dxa"/>
+              <w:bottom w:w="80" w:type="dxa"/>
+              <w:end w:w="120" w:type="dxa"/>
+            </w:tcMar>
+            <w:vAlign w:val="center"/>
+          </w:tcPr>
+          <w:p>
+            <w:pPr>
+              <w:spacing w:after="0"/>
+            </w:pPr>
+            <w:r>
+              <w:rPr>
+                <w:rFonts w:ascii="Calibri" w:hAnsi="Calibri"/>
+                <w:color w:val="172033"/>
+                <w:sz w:val="18"/>
+              </w:rPr>
+              <w:t>Provider-backed browser checks are deferred to the final tranche.</w:t>
+            </w:r>
+          </w:p>
+        </w:tc>
+        <w:tc>
+          <w:tcPr>
+            <w:tcW w:type="dxa" w:w="3000"/>
+            <w:tcMar>
+              <w:top w:w="80" w:type="dxa"/>
+              <w:start w:w="120" w:type="dxa"/>
+              <w:bottom w:w="80" w:type="dxa"/>
+              <w:end w:w="120" w:type="dxa"/>
+            </w:tcMar>
+            <w:vAlign w:val="center"/>
+          </w:tcPr>
+          <w:p>
+            <w:pPr>
+              <w:spacing w:after="0"/>
+            </w:pPr>
+            <w:r>
+              <w:rPr>
+                <w:rFonts w:ascii="Calibri" w:hAnsi="Calibri"/>
+                <w:color w:val="172033"/>
+                <w:sz w:val="18"/>
+              </w:rPr>
+              <w:t>Run supported Chrome, Safari, Firefox, and Edge acceptance flows.</w:t>
+            </w:r>
+          </w:p>
+        </w:tc>
+        <w:tc>
+          <w:tcPr>
+            <w:tcW w:type="dxa" w:w="2760"/>
+            <w:tcMar>
+              <w:top w:w="80" w:type="dxa"/>
+              <w:start w:w="120" w:type="dxa"/>
+              <w:bottom w:w="80" w:type="dxa"/>
+              <w:end w:w="120" w:type="dxa"/>
+            </w:tcMar>
+            <w:vAlign w:val="center"/>
+          </w:tcPr>
+          <w:p>
+            <w:pPr>
+              <w:spacing w:after="0"/>
+            </w:pPr>
+            <w:r>
+              <w:rPr>
+                <w:rFonts w:ascii="Calibri" w:hAnsi="Calibri"/>
+                <w:color w:val="172033"/>
+                <w:sz w:val="18"/>
+              </w:rPr>
+              <w:t>Screenshots, traces, accessibility, and isolation evidence are archived.</w:t>
             </w:r>
           </w:p>
         </w:tc>
@@ -1598,6 +1964,287 @@
           <w:b/>
         </w:rPr>
         <w:t xml:space="preserve">Test accounts used: </w:t>
+      </w:r>
+      <w:r>
+        <w:t>__________________________________________________________________________</w:t>
+      </w:r>
+    </w:p>
+    <w:p>
+      <w:pPr>
+        <w:spacing w:after="80"/>
+      </w:pPr>
+      <w:r>
+        <w:rPr>
+          <w:b/>
+        </w:rPr>
+        <w:t xml:space="preserve">Completed by / date: </w:t>
+      </w:r>
+      <w:r>
+        <w:t>__________________________________________________________________________</w:t>
+      </w:r>
+    </w:p>
+    <w:p>
+      <w:r>
+        <w:br w:type="page"/>
+      </w:r>
+    </w:p>
+    <w:p>
+      <w:pPr>
+        <w:pStyle w:val="Heading2"/>
+      </w:pPr>
+      <w:r>
+        <w:t>1.3 Desktop Gmail OAuth for local ingestion</w:t>
+      </w:r>
+    </w:p>
+    <w:p>
+      <w:pPr>
+        <w:spacing w:before="100" w:after="160" w:line="288" w:lineRule="auto"/>
+        <w:ind w:left="115" w:right="115"/>
+        <w:shd w:fill="FFF4D8"/>
+        <w:pBdr>
+          <w:left w:val="single" w:sz="18" w:space="8" w:color="7A5A00"/>
+        </w:pBdr>
+      </w:pPr>
+      <w:r>
+        <w:rPr>
+          <w:rFonts w:ascii="Calibri" w:hAnsi="Calibri"/>
+          <w:b/>
+          <w:color w:val="7A5A00"/>
+          <w:sz w:val="21"/>
+        </w:rPr>
+        <w:t xml:space="preserve">SEPARATE CLIENT AND SCOPE  </w:t>
+      </w:r>
+      <w:r>
+        <w:rPr>
+          <w:rFonts w:ascii="Calibri" w:hAnsi="Calibri"/>
+          <w:color w:val="172033"/>
+          <w:sz w:val="21"/>
+        </w:rPr>
+        <w:t>This is not the website Google login. Create a dedicated OAuth client of type Desktop app and request only https://www.googleapis.com/auth/gmail.readonly. GODFIN cannot send, edit, or delete email through this integration.</w:t>
+      </w:r>
+    </w:p>
+    <w:p>
+      <w:pPr>
+        <w:keepLines/>
+        <w:numPr>
+          <w:ilvl w:val="0"/>
+          <w:numId w:val="10"/>
+        </w:numPr>
+      </w:pPr>
+      <w:r>
+        <w:t>In a business-owned Google Cloud project dedicated to GODFIN Desktop Gmail, enable the Gmail API and configure the OAuth consent screen. Keep its client, scopes, and consent records separate from the GODFIN Website web client.</w:t>
+      </w:r>
+    </w:p>
+    <w:p>
+      <w:pPr>
+        <w:keepLines/>
+        <w:numPr>
+          <w:ilvl w:val="0"/>
+          <w:numId w:val="10"/>
+        </w:numPr>
+      </w:pPr>
+      <w:r>
+        <w:t>Create an OAuth 2.0 Client ID of type Desktop app. Download the JSON and confirm its top-level object is installed and contains client_id and client_secret. Do not use a Web application JSON file.</w:t>
+      </w:r>
+    </w:p>
+    <w:p>
+      <w:pPr>
+        <w:keepLines/>
+        <w:numPr>
+          <w:ilvl w:val="0"/>
+          <w:numId w:val="10"/>
+        </w:numPr>
+      </w:pPr>
+      <w:r>
+        <w:t>The local callback is http://127.0.0.1:5100/api/v1/auth/gmail/callback. GODFIN binds the backend to localhost by default; do not expose this callback or backend to the public internet.</w:t>
+      </w:r>
+    </w:p>
+    <w:p>
+      <w:pPr>
+        <w:keepLines/>
+        <w:numPr>
+          <w:ilvl w:val="0"/>
+          <w:numId w:val="10"/>
+        </w:numPr>
+      </w:pPr>
+      <w:r>
+        <w:t>Move the downloaded JSON outside the repository into an owner-controlled Application Support location. Point GODFIN_GMAIL_CLIENT_SECRETS_FILE to that absolute file. For development only, backend/data/client_secret.json is supported but must remain ignored and must never be committed, attached, or shared.</w:t>
+      </w:r>
+    </w:p>
+    <w:p>
+      <w:pPr>
+        <w:keepLines/>
+        <w:numPr>
+          <w:ilvl w:val="0"/>
+          <w:numId w:val="10"/>
+        </w:numPr>
+      </w:pPr>
+      <w:r>
+        <w:t>Alternatively set GOOGLE_CLIENT_ID and GOOGLE_CLIENT_SECRET in the private local process environment. Never put either value in source files, screenshots, this runbook, terminal history, or chat.</w:t>
+      </w:r>
+    </w:p>
+    <w:p>
+      <w:pPr>
+        <w:keepLines/>
+        <w:numPr>
+          <w:ilvl w:val="0"/>
+          <w:numId w:val="10"/>
+        </w:numPr>
+      </w:pPr>
+      <w:r>
+        <w:t>Start GODFIN, open Settings, choose Connect Gmail, and review the Google consent screen. It must show read-only Gmail access and no send, modify, delete, contacts, Drive, calendar, or broad Google account scope.</w:t>
+      </w:r>
+    </w:p>
+    <w:p>
+      <w:pPr>
+        <w:keepLines/>
+        <w:numPr>
+          <w:ilvl w:val="0"/>
+          <w:numId w:val="10"/>
+        </w:numPr>
+      </w:pPr>
+      <w:r>
+        <w:t>Complete the localhost callback. Verify Settings changes to connected, run the initial sync against a test mailbox, and confirm imports are assigned only to configured active account routes.</w:t>
+      </w:r>
+    </w:p>
+    <w:p>
+      <w:pPr>
+        <w:keepLines/>
+        <w:numPr>
+          <w:ilvl w:val="0"/>
+          <w:numId w:val="10"/>
+        </w:numPr>
+      </w:pPr>
+      <w:r>
+        <w:t>Disconnect Gmail, confirm the local token is removed, then reconnect and verify reauthorization. Tokens are encrypted in local SQLite using GODFIN's stable local key; OAuth state is hashed, installation-bound, expiring, PKCE-protected, and single-use.</w:t>
+      </w:r>
+    </w:p>
+    <w:p>
+      <w:pPr>
+        <w:keepLines/>
+        <w:numPr>
+          <w:ilvl w:val="0"/>
+          <w:numId w:val="10"/>
+        </w:numPr>
+      </w:pPr>
+      <w:r>
+        <w:t>If Google keeps the app in Testing, add each intended test mailbox as a test user and record the expiry/re-consent implications. Complete Google verification before inviting general customers if the provider requires it for the read-only scope.</w:t>
+      </w:r>
+    </w:p>
+    <w:p>
+      <w:pPr>
+        <w:keepLines/>
+        <w:numPr>
+          <w:ilvl w:val="0"/>
+          <w:numId w:val="12"/>
+        </w:numPr>
+      </w:pPr>
+      <w:r>
+        <w:t>Dedicated Desktop app client exists; the website client is not reused.</w:t>
+      </w:r>
+    </w:p>
+    <w:p>
+      <w:pPr>
+        <w:keepLines/>
+        <w:numPr>
+          <w:ilvl w:val="0"/>
+          <w:numId w:val="12"/>
+        </w:numPr>
+      </w:pPr>
+      <w:r>
+        <w:t>Only gmail.readonly appears on the consent screen.</w:t>
+      </w:r>
+    </w:p>
+    <w:p>
+      <w:pPr>
+        <w:keepLines/>
+        <w:numPr>
+          <w:ilvl w:val="0"/>
+          <w:numId w:val="12"/>
+        </w:numPr>
+      </w:pPr>
+      <w:r>
+        <w:t>The downloaded client JSON is outside the repository and protected by owner-only permissions.</w:t>
+      </w:r>
+    </w:p>
+    <w:p>
+      <w:pPr>
+        <w:keepLines/>
+        <w:numPr>
+          <w:ilvl w:val="0"/>
+          <w:numId w:val="12"/>
+        </w:numPr>
+      </w:pPr>
+      <w:r>
+        <w:t>Connect, localhost callback, connected status, initial sync, disconnect, and reauthorization pass.</w:t>
+      </w:r>
+    </w:p>
+    <w:p>
+      <w:pPr>
+        <w:keepLines/>
+        <w:numPr>
+          <w:ilvl w:val="0"/>
+          <w:numId w:val="12"/>
+        </w:numPr>
+      </w:pPr>
+      <w:r>
+        <w:t>No client secret or token appears in Git, logs, screenshots, chat, or the packaged application.</w:t>
+      </w:r>
+    </w:p>
+    <w:p>
+      <w:pPr>
+        <w:pStyle w:val="RunbookCaption"/>
+      </w:pPr>
+      <w:r>
+        <w:t xml:space="preserve">Official reference: </w:t>
+      </w:r>
+      <w:hyperlink r:id="rId12">
+        <w:r>
+          <w:rPr>
+            <w:color w:val="2E74B5"/>
+            <w:u w:val="single"/>
+          </w:rPr>
+          <w:t>Google Gmail API Python quickstart</w:t>
+        </w:r>
+      </w:hyperlink>
+    </w:p>
+    <w:p>
+      <w:pPr>
+        <w:spacing w:after="80"/>
+      </w:pPr>
+      <w:r>
+        <w:rPr>
+          <w:b/>
+        </w:rPr>
+        <w:t xml:space="preserve">Google Cloud project name: </w:t>
+      </w:r>
+      <w:r>
+        <w:t>__________________________________________________________________________</w:t>
+      </w:r>
+    </w:p>
+    <w:p>
+      <w:pPr>
+        <w:spacing w:after="80"/>
+      </w:pPr>
+      <w:r>
+        <w:rPr>
+          <w:b/>
+        </w:rPr>
+        <w:t xml:space="preserve">Desktop OAuth client name: </w:t>
+      </w:r>
+      <w:r>
+        <w:t>__________________________________________________________________________</w:t>
+      </w:r>
+    </w:p>
+    <w:p>
+      <w:pPr>
+        <w:spacing w:after="80"/>
+      </w:pPr>
+      <w:r>
+        <w:rPr>
+          <w:b/>
+        </w:rPr>
+        <w:t xml:space="preserve">Test mailbox: </w:t>
       </w:r>
       <w:r>
         <w:t>__________________________________________________________________________</w:t>
@@ -2807,7 +3454,7 @@
       <w:r>
         <w:t xml:space="preserve">Official reference: </w:t>
       </w:r>
-      <w:hyperlink r:id="rId12">
+      <w:hyperlink r:id="rId13">
         <w:r>
           <w:rPr>
             <w:color w:val="2E74B5"/>
@@ -2824,7 +3471,7 @@
       <w:r>
         <w:t xml:space="preserve">Official reference: </w:t>
       </w:r>
-      <w:hyperlink r:id="rId13">
+      <w:hyperlink r:id="rId14">
         <w:r>
           <w:rPr>
             <w:color w:val="2E74B5"/>
@@ -3049,7 +3696,7 @@
       <w:r>
         <w:t xml:space="preserve">Official reference: </w:t>
       </w:r>
-      <w:hyperlink r:id="rId14">
+      <w:hyperlink r:id="rId15">
         <w:r>
           <w:rPr>
             <w:color w:val="2E74B5"/>
@@ -3992,7 +4639,7 @@
         </w:numPr>
       </w:pPr>
       <w:r>
-        <w:t>The promote-updates workflow requires the exact typed confirmation PUBLISH_SIGNED_RELEASE and the release-production environment. Do not run it before explicit public-launch authorization.</w:t>
+        <w:t>For the first 5% update cohort, the promote-updates workflow requires PUBLISH_STAGED_RELEASE. Advancing to 25%, 50%, or 100% requires ADVANCE_AFTER_HEALTH_REVIEW. Both use the protected release-production environment and must not run before explicit public-launch authorization.</w:t>
       </w:r>
     </w:p>
     <w:p>
@@ -4004,7 +4651,7 @@
         </w:numPr>
       </w:pPr>
       <w:r>
-        <w:t>Test rollback with a previously reviewed signed release using the separate rollback workflow and its exact confirmation.</w:t>
+        <w:t>Test rollback with a previously reviewed signed release using the separate rollback workflow and the exact confirmation ROLLBACK_SIGNED_RELEASE.</w:t>
       </w:r>
     </w:p>
     <w:p>
@@ -4273,7 +4920,7 @@
       <w:r>
         <w:t xml:space="preserve">Official reference: </w:t>
       </w:r>
-      <w:hyperlink r:id="rId15">
+      <w:hyperlink r:id="rId16">
         <w:r>
           <w:rPr>
             <w:color w:val="2E74B5"/>
@@ -6045,7 +6692,7 @@
         </w:numPr>
       </w:pPr>
       <w:r>
-        <w:t>Backend: at least 324 tests pass, including auth/PIN, encryption, migrations, backups, merchant upsert, licenses, goal ledgers and FD/RD suggestions, simulation reference vectors, recurring detection, atomic accounts, package privacy, CA tax pack, classification memory, performance, net worth, behavior insights, and reward-pilot redaction.</w:t>
+        <w:t>Backend: 859 tests pass under clean Python 3.12, including auth/PIN, encryption, migrations, backups, merchant upsert, licenses, goal ledgers and FD/RD suggestions, simulation reference vectors, recurring detection, atomic accounts, package privacy, CA tax pack, classification memory, performance, net worth, behavior insights, reward-pilot redaction, and UTC finance-fetch regressions.</w:t>
       </w:r>
     </w:p>
     <w:p>
@@ -6057,7 +6704,7 @@
         </w:numPr>
       </w:pPr>
       <w:r>
-        <w:t>Frontend: lint and production build pass. Focused Playwright covers PIN entry, portal calculation help, goals, recurring re-detection, external pricing, settings disclosure, and CA tax-pack controls.</w:t>
+        <w:t>Frontend: lint, accessibility checks, authentication checks, and production build pass. Focused Playwright covers PIN entry, portal calculation help, goals, recurring re-detection, external pricing, settings disclosure, and CA tax-pack controls.</w:t>
       </w:r>
     </w:p>
     <w:p>
@@ -6081,7 +6728,43 @@
         </w:numPr>
       </w:pPr>
       <w:r>
-        <w:t>Dependencies: Python lock, frontend, website, and desktop shipped dependencies report no known vulnerabilities.</w:t>
+        <w:t>Dependencies: runtime, test, and build Python locks are separated and hash-locked; frontend, website, desktop, and Playwright workspaces use npm ci. Audits report zero unaccepted known vulnerabilities. The Gmail API client is explicit in runtime requirements.</w:t>
+      </w:r>
+    </w:p>
+    <w:p>
+      <w:pPr>
+        <w:keepLines/>
+        <w:numPr>
+          <w:ilvl w:val="0"/>
+          <w:numId w:val="12"/>
+        </w:numPr>
+      </w:pPr>
+      <w:r>
+        <w:t>Supply chain: deterministic CycloneDX 1.6 SBOM and third-party notices cover 1,008 unique components with zero unresolved license identifiers. Human review of conditional licenses remains a required fail-closed release gate.</w:t>
+      </w:r>
+    </w:p>
+    <w:p>
+      <w:pPr>
+        <w:keepLines/>
+        <w:numPr>
+          <w:ilvl w:val="0"/>
+          <w:numId w:val="12"/>
+        </w:numPr>
+      </w:pPr>
+      <w:r>
+        <w:t>Release engineering: 12/12 desktop update/release workflow tests and 7/7 package privacy checks pass. All GitHub Actions are pinned to verified 40-character commit SHAs, and release provenance binds the exact commit, tag, package version, SBOM, notices, and checksums.</w:t>
+      </w:r>
+    </w:p>
+    <w:p>
+      <w:pPr>
+        <w:keepLines/>
+        <w:numPr>
+          <w:ilvl w:val="0"/>
+          <w:numId w:val="12"/>
+        </w:numPr>
+      </w:pPr>
+      <w:r>
+        <w:t>Local packaging: a fresh macOS arm64 candidate passed strict codesign verification, first start 2.916 seconds, restart 0.926 seconds, idle memory 605.6 MB, database preservation, local trust boundary, and maintenance-boundary checks. Gatekeeper correctly rejects it because it is not yet Apple-notarized.</w:t>
       </w:r>
     </w:p>
     <w:p>
@@ -6232,7 +6915,7 @@
         </w:numPr>
       </w:pPr>
       <w:r>
-        <w:t>Choose an internal release-candidate version such as v0.1.0-rc.1. Confirm desktop/package.json and website version variables agree before tagging.</w:t>
+        <w:t>Choose an immutable semantic candidate tag that matches the desktop package version exactly, such as v0.1.0. The release workflow intentionally accepts only vX.Y.Z tags; do not use an -rc suffix unless the validated workflow contract is deliberately changed first.</w:t>
       </w:r>
     </w:p>
     <w:p>
@@ -6268,7 +6951,19 @@
         </w:numPr>
       </w:pPr>
       <w:r>
-        <w:t>Create and push the annotated tag. The release workflow builds native macOS arm64/x64, Windows x64, and Linux x64 artifacts; verifies packages; generates Homebrew metadata and SHA-256 checksums; and creates a private draft GitHub Release.</w:t>
+        <w:t>Create and push the annotated tag. The release workflow verifies exact tag/commit/version agreement, refuses an existing release for that tag, builds native macOS arm64/x64, Windows x64, and Linux x64 artifacts, verifies packages, generates SHA-256 checksums, SBOM, notices, and provenance, and creates a private draft GitHub Release.</w:t>
+      </w:r>
+    </w:p>
+    <w:p>
+      <w:pPr>
+        <w:keepLines/>
+        <w:numPr>
+          <w:ilvl w:val="0"/>
+          <w:numId w:val="10"/>
+        </w:numPr>
+      </w:pPr>
+      <w:r>
+        <w:t>Confirm supply-chain/legal-clearance.json is approved. The workflow must remain fail-closed while legal status is pending or the recorded evidence hashes do not match.</w:t>
       </w:r>
     </w:p>
     <w:p>
@@ -6985,6 +7680,208 @@
                 <w:sz w:val="18"/>
               </w:rPr>
               <w:t>Repeat with a distinct Google test account before public launch.</w:t>
+            </w:r>
+          </w:p>
+        </w:tc>
+      </w:tr>
+      <w:tr>
+        <w:tc>
+          <w:tcPr>
+            <w:tcW w:type="dxa" w:w="3500"/>
+            <w:tcMar>
+              <w:top w:w="80" w:type="dxa"/>
+              <w:start w:w="120" w:type="dxa"/>
+              <w:bottom w:w="80" w:type="dxa"/>
+              <w:end w:w="120" w:type="dxa"/>
+            </w:tcMar>
+            <w:vAlign w:val="center"/>
+          </w:tcPr>
+          <w:p>
+            <w:pPr>
+              <w:spacing w:after="0"/>
+            </w:pPr>
+            <w:r>
+              <w:rPr>
+                <w:rFonts w:ascii="Calibri" w:hAnsi="Calibri"/>
+                <w:color w:val="172033"/>
+                <w:sz w:val="18"/>
+              </w:rPr>
+              <w:t>Desktop Gmail OAuth + sync</w:t>
+            </w:r>
+          </w:p>
+        </w:tc>
+        <w:tc>
+          <w:tcPr>
+            <w:tcW w:type="dxa" w:w="1450"/>
+            <w:tcMar>
+              <w:top w:w="80" w:type="dxa"/>
+              <w:start w:w="120" w:type="dxa"/>
+              <w:bottom w:w="80" w:type="dxa"/>
+              <w:end w:w="120" w:type="dxa"/>
+            </w:tcMar>
+            <w:vAlign w:val="center"/>
+          </w:tcPr>
+          <w:p>
+            <w:pPr>
+              <w:spacing w:after="0"/>
+            </w:pPr>
+            <w:r>
+              <w:rPr>
+                <w:rFonts w:ascii="Calibri" w:hAnsi="Calibri"/>
+                <w:color w:val="172033"/>
+                <w:sz w:val="18"/>
+              </w:rPr>
+            </w:r>
+          </w:p>
+        </w:tc>
+        <w:tc>
+          <w:tcPr>
+            <w:tcW w:type="dxa" w:w="900"/>
+            <w:tcMar>
+              <w:top w:w="80" w:type="dxa"/>
+              <w:start w:w="120" w:type="dxa"/>
+              <w:bottom w:w="80" w:type="dxa"/>
+              <w:end w:w="120" w:type="dxa"/>
+            </w:tcMar>
+            <w:vAlign w:val="center"/>
+          </w:tcPr>
+          <w:p>
+            <w:pPr>
+              <w:spacing w:after="0"/>
+            </w:pPr>
+            <w:r>
+              <w:rPr>
+                <w:rFonts w:ascii="Calibri" w:hAnsi="Calibri"/>
+                <w:color w:val="172033"/>
+                <w:sz w:val="18"/>
+              </w:rPr>
+              <w:t>☐</w:t>
+            </w:r>
+          </w:p>
+        </w:tc>
+        <w:tc>
+          <w:tcPr>
+            <w:tcW w:type="dxa" w:w="3510"/>
+            <w:tcMar>
+              <w:top w:w="80" w:type="dxa"/>
+              <w:start w:w="120" w:type="dxa"/>
+              <w:bottom w:w="80" w:type="dxa"/>
+              <w:end w:w="120" w:type="dxa"/>
+            </w:tcMar>
+            <w:vAlign w:val="center"/>
+          </w:tcPr>
+          <w:p>
+            <w:pPr>
+              <w:spacing w:after="0"/>
+            </w:pPr>
+            <w:r>
+              <w:rPr>
+                <w:rFonts w:ascii="Calibri" w:hAnsi="Calibri"/>
+                <w:color w:val="172033"/>
+                <w:sz w:val="18"/>
+              </w:rPr>
+              <w:t>Separate Desktop client; read-only consent; connect/sync/disconnect/reconnect evidence.</w:t>
+            </w:r>
+          </w:p>
+        </w:tc>
+      </w:tr>
+      <w:tr>
+        <w:tc>
+          <w:tcPr>
+            <w:tcW w:type="dxa" w:w="3500"/>
+            <w:tcMar>
+              <w:top w:w="80" w:type="dxa"/>
+              <w:start w:w="120" w:type="dxa"/>
+              <w:bottom w:w="80" w:type="dxa"/>
+              <w:end w:w="120" w:type="dxa"/>
+            </w:tcMar>
+            <w:vAlign w:val="center"/>
+          </w:tcPr>
+          <w:p>
+            <w:pPr>
+              <w:spacing w:after="0"/>
+            </w:pPr>
+            <w:r>
+              <w:rPr>
+                <w:rFonts w:ascii="Calibri" w:hAnsi="Calibri"/>
+                <w:color w:val="172033"/>
+                <w:sz w:val="18"/>
+              </w:rPr>
+              <w:t>Dependency license clearance</w:t>
+            </w:r>
+          </w:p>
+        </w:tc>
+        <w:tc>
+          <w:tcPr>
+            <w:tcW w:type="dxa" w:w="1450"/>
+            <w:tcMar>
+              <w:top w:w="80" w:type="dxa"/>
+              <w:start w:w="120" w:type="dxa"/>
+              <w:bottom w:w="80" w:type="dxa"/>
+              <w:end w:w="120" w:type="dxa"/>
+            </w:tcMar>
+            <w:vAlign w:val="center"/>
+          </w:tcPr>
+          <w:p>
+            <w:pPr>
+              <w:spacing w:after="0"/>
+            </w:pPr>
+            <w:r>
+              <w:rPr>
+                <w:rFonts w:ascii="Calibri" w:hAnsi="Calibri"/>
+                <w:color w:val="172033"/>
+                <w:sz w:val="18"/>
+              </w:rPr>
+            </w:r>
+          </w:p>
+        </w:tc>
+        <w:tc>
+          <w:tcPr>
+            <w:tcW w:type="dxa" w:w="900"/>
+            <w:tcMar>
+              <w:top w:w="80" w:type="dxa"/>
+              <w:start w:w="120" w:type="dxa"/>
+              <w:bottom w:w="80" w:type="dxa"/>
+              <w:end w:w="120" w:type="dxa"/>
+            </w:tcMar>
+            <w:vAlign w:val="center"/>
+          </w:tcPr>
+          <w:p>
+            <w:pPr>
+              <w:spacing w:after="0"/>
+            </w:pPr>
+            <w:r>
+              <w:rPr>
+                <w:rFonts w:ascii="Calibri" w:hAnsi="Calibri"/>
+                <w:color w:val="172033"/>
+                <w:sz w:val="18"/>
+              </w:rPr>
+              <w:t>☐</w:t>
+            </w:r>
+          </w:p>
+        </w:tc>
+        <w:tc>
+          <w:tcPr>
+            <w:tcW w:type="dxa" w:w="3510"/>
+            <w:tcMar>
+              <w:top w:w="80" w:type="dxa"/>
+              <w:start w:w="120" w:type="dxa"/>
+              <w:bottom w:w="80" w:type="dxa"/>
+              <w:end w:w="120" w:type="dxa"/>
+            </w:tcMar>
+            <w:vAlign w:val="center"/>
+          </w:tcPr>
+          <w:p>
+            <w:pPr>
+              <w:spacing w:after="0"/>
+            </w:pPr>
+            <w:r>
+              <w:rPr>
+                <w:rFonts w:ascii="Calibri" w:hAnsi="Calibri"/>
+                <w:color w:val="172033"/>
+                <w:sz w:val="18"/>
+              </w:rPr>
+              <w:t>Human approval of conditional licenses with unchanged SBOM/notices hashes.</w:t>
             </w:r>
           </w:p>
         </w:tc>
@@ -7611,7 +8508,109 @@
                 <w:color w:val="172033"/>
                 <w:sz w:val="18"/>
               </w:rPr>
-              <w:t>Clean-system matrix</w:t>
+              <w:t>Local macOS arm64 package proof</w:t>
+            </w:r>
+          </w:p>
+        </w:tc>
+        <w:tc>
+          <w:tcPr>
+            <w:tcW w:type="dxa" w:w="1450"/>
+            <w:tcMar>
+              <w:top w:w="80" w:type="dxa"/>
+              <w:start w:w="120" w:type="dxa"/>
+              <w:bottom w:w="80" w:type="dxa"/>
+              <w:end w:w="120" w:type="dxa"/>
+            </w:tcMar>
+            <w:vAlign w:val="center"/>
+          </w:tcPr>
+          <w:p>
+            <w:pPr>
+              <w:spacing w:after="0"/>
+            </w:pPr>
+            <w:r>
+              <w:rPr>
+                <w:rFonts w:ascii="Calibri" w:hAnsi="Calibri"/>
+                <w:color w:val="172033"/>
+                <w:sz w:val="18"/>
+              </w:rPr>
+              <w:t>Codex</w:t>
+            </w:r>
+          </w:p>
+        </w:tc>
+        <w:tc>
+          <w:tcPr>
+            <w:tcW w:type="dxa" w:w="900"/>
+            <w:tcMar>
+              <w:top w:w="80" w:type="dxa"/>
+              <w:start w:w="120" w:type="dxa"/>
+              <w:bottom w:w="80" w:type="dxa"/>
+              <w:end w:w="120" w:type="dxa"/>
+            </w:tcMar>
+            <w:vAlign w:val="center"/>
+          </w:tcPr>
+          <w:p>
+            <w:pPr>
+              <w:spacing w:after="0"/>
+            </w:pPr>
+            <w:r>
+              <w:rPr>
+                <w:rFonts w:ascii="Calibri" w:hAnsi="Calibri"/>
+                <w:color w:val="172033"/>
+                <w:sz w:val="18"/>
+              </w:rPr>
+              <w:t>☒</w:t>
+            </w:r>
+          </w:p>
+        </w:tc>
+        <w:tc>
+          <w:tcPr>
+            <w:tcW w:type="dxa" w:w="3510"/>
+            <w:tcMar>
+              <w:top w:w="80" w:type="dxa"/>
+              <w:start w:w="120" w:type="dxa"/>
+              <w:bottom w:w="80" w:type="dxa"/>
+              <w:end w:w="120" w:type="dxa"/>
+            </w:tcMar>
+            <w:vAlign w:val="center"/>
+          </w:tcPr>
+          <w:p>
+            <w:pPr>
+              <w:spacing w:after="0"/>
+            </w:pPr>
+            <w:r>
+              <w:rPr>
+                <w:rFonts w:ascii="Calibri" w:hAnsi="Calibri"/>
+                <w:color w:val="172033"/>
+                <w:sz w:val="18"/>
+              </w:rPr>
+              <w:t>Locked local candidate meets startup, memory, privacy, persistence, and trust-boundary budgets; not notarized.</w:t>
+            </w:r>
+          </w:p>
+        </w:tc>
+      </w:tr>
+      <w:tr>
+        <w:tc>
+          <w:tcPr>
+            <w:tcW w:type="dxa" w:w="3500"/>
+            <w:tcMar>
+              <w:top w:w="80" w:type="dxa"/>
+              <w:start w:w="120" w:type="dxa"/>
+              <w:bottom w:w="80" w:type="dxa"/>
+              <w:end w:w="120" w:type="dxa"/>
+            </w:tcMar>
+            <w:vAlign w:val="center"/>
+          </w:tcPr>
+          <w:p>
+            <w:pPr>
+              <w:spacing w:after="0"/>
+            </w:pPr>
+            <w:r>
+              <w:rPr>
+                <w:rFonts w:ascii="Calibri" w:hAnsi="Calibri"/>
+                <w:color w:val="172033"/>
+                <w:sz w:val="18"/>
+              </w:rPr>
+              <w:t>Cross-platform clean-system matrix</w:t>
             </w:r>
           </w:p>
         </w:tc>
@@ -7685,6 +8684,108 @@
                 <w:color w:val="172033"/>
                 <w:sz w:val="18"/>
               </w:rPr>
+              <w:t>macOS x64, Windows 10/11 x64, and Ubuntu 22.04 x64 remain external gates.</w:t>
+            </w:r>
+          </w:p>
+        </w:tc>
+      </w:tr>
+      <w:tr>
+        <w:tc>
+          <w:tcPr>
+            <w:tcW w:type="dxa" w:w="3500"/>
+            <w:tcMar>
+              <w:top w:w="80" w:type="dxa"/>
+              <w:start w:w="120" w:type="dxa"/>
+              <w:bottom w:w="80" w:type="dxa"/>
+              <w:end w:w="120" w:type="dxa"/>
+            </w:tcMar>
+            <w:vAlign w:val="center"/>
+          </w:tcPr>
+          <w:p>
+            <w:pPr>
+              <w:spacing w:after="0"/>
+            </w:pPr>
+            <w:r>
+              <w:rPr>
+                <w:rFonts w:ascii="Calibri" w:hAnsi="Calibri"/>
+                <w:color w:val="172033"/>
+                <w:sz w:val="18"/>
+              </w:rPr>
+              <w:t>Browser-family matrix</w:t>
+            </w:r>
+          </w:p>
+        </w:tc>
+        <w:tc>
+          <w:tcPr>
+            <w:tcW w:type="dxa" w:w="1450"/>
+            <w:tcMar>
+              <w:top w:w="80" w:type="dxa"/>
+              <w:start w:w="120" w:type="dxa"/>
+              <w:bottom w:w="80" w:type="dxa"/>
+              <w:end w:w="120" w:type="dxa"/>
+            </w:tcMar>
+            <w:vAlign w:val="center"/>
+          </w:tcPr>
+          <w:p>
+            <w:pPr>
+              <w:spacing w:after="0"/>
+            </w:pPr>
+            <w:r>
+              <w:rPr>
+                <w:rFonts w:ascii="Calibri" w:hAnsi="Calibri"/>
+                <w:color w:val="172033"/>
+                <w:sz w:val="18"/>
+              </w:rPr>
+            </w:r>
+          </w:p>
+        </w:tc>
+        <w:tc>
+          <w:tcPr>
+            <w:tcW w:type="dxa" w:w="900"/>
+            <w:tcMar>
+              <w:top w:w="80" w:type="dxa"/>
+              <w:start w:w="120" w:type="dxa"/>
+              <w:bottom w:w="80" w:type="dxa"/>
+              <w:end w:w="120" w:type="dxa"/>
+            </w:tcMar>
+            <w:vAlign w:val="center"/>
+          </w:tcPr>
+          <w:p>
+            <w:pPr>
+              <w:spacing w:after="0"/>
+            </w:pPr>
+            <w:r>
+              <w:rPr>
+                <w:rFonts w:ascii="Calibri" w:hAnsi="Calibri"/>
+                <w:color w:val="172033"/>
+                <w:sz w:val="18"/>
+              </w:rPr>
+              <w:t>☐</w:t>
+            </w:r>
+          </w:p>
+        </w:tc>
+        <w:tc>
+          <w:tcPr>
+            <w:tcW w:type="dxa" w:w="3510"/>
+            <w:tcMar>
+              <w:top w:w="80" w:type="dxa"/>
+              <w:start w:w="120" w:type="dxa"/>
+              <w:bottom w:w="80" w:type="dxa"/>
+              <w:end w:w="120" w:type="dxa"/>
+            </w:tcMar>
+            <w:vAlign w:val="center"/>
+          </w:tcPr>
+          <w:p>
+            <w:pPr>
+              <w:spacing w:after="0"/>
+            </w:pPr>
+            <w:r>
+              <w:rPr>
+                <w:rFonts w:ascii="Calibri" w:hAnsi="Calibri"/>
+                <w:color w:val="172033"/>
+                <w:sz w:val="18"/>
+              </w:rPr>
+              <w:t>Chrome, Safari, Firefox, and Edge acceptance evidence remains deferred.</w:t>
             </w:r>
           </w:p>
         </w:tc>
@@ -8094,11 +9195,6 @@
       <w:pPr>
         <w:spacing w:after="20"/>
       </w:pPr>
-    </w:p>
-    <w:p>
-      <w:r>
-        <w:br w:type="page"/>
-      </w:r>
     </w:p>
     <w:p>
       <w:pPr>

</xml_diff>

<commit_message>
docs(ops): refresh production evidence and owner runbook
</commit_message>
<xml_diff>
--- a/docs/GODFIN_OWNER_COMPLETION_RUNBOOK.docx
+++ b/docs/GODFIN_OWNER_COMPLETION_RUNBOOK.docx
@@ -64,7 +64,7 @@
           <w:color w:val="667085"/>
           <w:sz w:val="20"/>
         </w:rPr>
-        <w:t>Version 2.3  •  16 August 2026  •  oculusrex14/GODFIN (private)</w:t>
+        <w:t>Version 2.4  •  16 August 2026  •  oculusrex14/GODFIN (private)</w:t>
         <w:br/>
         <w:t>Production branch: codex/godfin-production-v5</w:t>
       </w:r>
@@ -220,7 +220,7 @@
           <w:color w:val="172033"/>
           <w:sz w:val="21"/>
         </w:rPr>
-        <w:t>Production remediation is tracked on the private v5 branch. The clean Python 3.12 baseline is 859 passing backend tests. Frontend lint, accessibility, authentication, and production builds pass; website contract and production builds pass; desktop release/update tests pass 12/12; and package privacy checks pass 7/7.</w:t>
+        <w:t>Production remediation is tracked on the private v5 branch. The clean Python 3.12 baseline is 876 passing backend tests. All 182 API operations publish an explicit success or intentional terminal status, a non-empty media-specific success schema, and the shared error contract. Frontend lint, accessibility, authentication, and production builds pass; website contract and production builds pass; desktop release/update tests pass 12/12; and package privacy checks pass 7/7.</w:t>
       </w:r>
     </w:p>
     <w:p>
@@ -352,7 +352,7 @@
         </w:numPr>
       </w:pPr>
       <w:r>
-        <w:t>Dependency surfaces are separated into runtime, test, and build locks. The Gmail API client is an explicit runtime dependency. All four JavaScript workspaces and both Python lock surfaces audit with no unaccepted known vulnerability; the qualified cryptography finding is documented in the signed evidence.</w:t>
+        <w:t>Dependency surfaces are separated into runtime, test, and frozen-build locks. The Gmail API client is an explicit runtime dependency. All four JavaScript workspaces and all three Python lock surfaces audit with no unaccepted known vulnerability; the qualified cryptography finding is documented in the signed evidence.</w:t>
       </w:r>
     </w:p>
     <w:p>
@@ -376,7 +376,7 @@
         </w:numPr>
       </w:pPr>
       <w:r>
-        <w:t>A fresh local macOS arm64 package was built from the locked toolchain. It starts in 2.916 seconds on first launch and 0.926 seconds on restart, preserves its database, enforces the local trust boundary, and remains below the 700 MB idle-memory budget at 605.6 MB. This is an ad-hoc local test signature, not an Apple-notarized customer release.</w:t>
+        <w:t>A fresh local macOS arm64 package was built from code commit 25fd5f7 using the locked toolchain. It starts in 3.000 seconds on first launch and 1.033 seconds on restart, preserves its database, enforces the local trust and maintenance boundaries, and remains below the 700 MB idle-memory budget at 604.5 MB across five processes. The private DMG SHA-256 is 5b3fd15ae40e9ab59ea2b344f6de9e15f37e6ad2030b1d2f330253f2ed4c98c5 and the ZIP SHA-256 is 8bd9d5b59e11e3bdbb5edfb5f882ed953a5341a178a2d77cd0a7190154ce5b91. This is an ad-hoc local test signature, not an Apple-notarized customer release.</w:t>
       </w:r>
     </w:p>
     <w:p>
@@ -400,7 +400,7 @@
         </w:numPr>
       </w:pPr>
       <w:r>
-        <w:t>Repository evidence is current through commit 59c146a on codex/godfin-production-v5.</w:t>
+        <w:t>Repository code evidence is current through commit 25fd5f7 on codex/godfin-production-v5; this v2.4 runbook and its refreshed package evidence are the next documentation-only commit.</w:t>
       </w:r>
     </w:p>
     <w:p>
@@ -2372,10 +2372,10 @@
         <w:tblInd w:w="120" w:type="dxa"/>
       </w:tblPr>
       <w:tblGrid>
+        <w:gridCol w:w="3260"/>
+        <w:gridCol w:w="2500"/>
+        <w:gridCol w:w="1000"/>
         <w:gridCol w:w="2600"/>
-        <w:gridCol w:w="3100"/>
-        <w:gridCol w:w="1100"/>
-        <w:gridCol w:w="2560"/>
       </w:tblGrid>
       <w:tr>
         <w:trPr>
@@ -2383,7 +2383,7 @@
         </w:trPr>
         <w:tc>
           <w:tcPr>
-            <w:tcW w:type="dxa" w:w="2600"/>
+            <w:tcW w:type="dxa" w:w="3260"/>
             <w:shd w:fill="E8EEF5"/>
             <w:tcMar>
               <w:top w:w="80" w:type="dxa"/>
@@ -2410,7 +2410,7 @@
         </w:tc>
         <w:tc>
           <w:tcPr>
-            <w:tcW w:type="dxa" w:w="3100"/>
+            <w:tcW w:type="dxa" w:w="2500"/>
             <w:shd w:fill="E8EEF5"/>
             <w:tcMar>
               <w:top w:w="80" w:type="dxa"/>
@@ -2437,7 +2437,7 @@
         </w:tc>
         <w:tc>
           <w:tcPr>
-            <w:tcW w:type="dxa" w:w="1100"/>
+            <w:tcW w:type="dxa" w:w="1000"/>
             <w:shd w:fill="E8EEF5"/>
             <w:tcMar>
               <w:top w:w="80" w:type="dxa"/>
@@ -2464,7 +2464,7 @@
         </w:tc>
         <w:tc>
           <w:tcPr>
-            <w:tcW w:type="dxa" w:w="2560"/>
+            <w:tcW w:type="dxa" w:w="2600"/>
             <w:shd w:fill="E8EEF5"/>
             <w:tcMar>
               <w:top w:w="80" w:type="dxa"/>
@@ -2493,7 +2493,7 @@
       <w:tr>
         <w:tc>
           <w:tcPr>
-            <w:tcW w:type="dxa" w:w="2600"/>
+            <w:tcW w:type="dxa" w:w="3260"/>
             <w:tcMar>
               <w:top w:w="80" w:type="dxa"/>
               <w:start w:w="120" w:type="dxa"/>
@@ -2518,7 +2518,7 @@
         </w:tc>
         <w:tc>
           <w:tcPr>
-            <w:tcW w:type="dxa" w:w="3100"/>
+            <w:tcW w:type="dxa" w:w="2500"/>
             <w:tcMar>
               <w:top w:w="80" w:type="dxa"/>
               <w:start w:w="120" w:type="dxa"/>
@@ -2543,7 +2543,7 @@
         </w:tc>
         <w:tc>
           <w:tcPr>
-            <w:tcW w:type="dxa" w:w="1100"/>
+            <w:tcW w:type="dxa" w:w="1000"/>
             <w:tcMar>
               <w:top w:w="80" w:type="dxa"/>
               <w:start w:w="120" w:type="dxa"/>
@@ -2568,7 +2568,7 @@
         </w:tc>
         <w:tc>
           <w:tcPr>
-            <w:tcW w:type="dxa" w:w="2560"/>
+            <w:tcW w:type="dxa" w:w="2600"/>
             <w:tcMar>
               <w:top w:w="80" w:type="dxa"/>
               <w:start w:w="120" w:type="dxa"/>
@@ -2595,7 +2595,7 @@
       <w:tr>
         <w:tc>
           <w:tcPr>
-            <w:tcW w:type="dxa" w:w="2600"/>
+            <w:tcW w:type="dxa" w:w="3260"/>
             <w:tcMar>
               <w:top w:w="80" w:type="dxa"/>
               <w:start w:w="120" w:type="dxa"/>
@@ -2620,7 +2620,7 @@
         </w:tc>
         <w:tc>
           <w:tcPr>
-            <w:tcW w:type="dxa" w:w="3100"/>
+            <w:tcW w:type="dxa" w:w="2500"/>
             <w:tcMar>
               <w:top w:w="80" w:type="dxa"/>
               <w:start w:w="120" w:type="dxa"/>
@@ -2645,7 +2645,7 @@
         </w:tc>
         <w:tc>
           <w:tcPr>
-            <w:tcW w:type="dxa" w:w="1100"/>
+            <w:tcW w:type="dxa" w:w="1000"/>
             <w:tcMar>
               <w:top w:w="80" w:type="dxa"/>
               <w:start w:w="120" w:type="dxa"/>
@@ -2670,7 +2670,7 @@
         </w:tc>
         <w:tc>
           <w:tcPr>
-            <w:tcW w:type="dxa" w:w="2560"/>
+            <w:tcW w:type="dxa" w:w="2600"/>
             <w:tcMar>
               <w:top w:w="80" w:type="dxa"/>
               <w:start w:w="120" w:type="dxa"/>
@@ -2697,7 +2697,7 @@
       <w:tr>
         <w:tc>
           <w:tcPr>
-            <w:tcW w:type="dxa" w:w="2600"/>
+            <w:tcW w:type="dxa" w:w="3260"/>
             <w:tcMar>
               <w:top w:w="80" w:type="dxa"/>
               <w:start w:w="120" w:type="dxa"/>
@@ -2722,7 +2722,7 @@
         </w:tc>
         <w:tc>
           <w:tcPr>
-            <w:tcW w:type="dxa" w:w="3100"/>
+            <w:tcW w:type="dxa" w:w="2500"/>
             <w:tcMar>
               <w:top w:w="80" w:type="dxa"/>
               <w:start w:w="120" w:type="dxa"/>
@@ -2747,7 +2747,7 @@
         </w:tc>
         <w:tc>
           <w:tcPr>
-            <w:tcW w:type="dxa" w:w="1100"/>
+            <w:tcW w:type="dxa" w:w="1000"/>
             <w:tcMar>
               <w:top w:w="80" w:type="dxa"/>
               <w:start w:w="120" w:type="dxa"/>
@@ -2772,7 +2772,7 @@
         </w:tc>
         <w:tc>
           <w:tcPr>
-            <w:tcW w:type="dxa" w:w="2560"/>
+            <w:tcW w:type="dxa" w:w="2600"/>
             <w:tcMar>
               <w:top w:w="80" w:type="dxa"/>
               <w:start w:w="120" w:type="dxa"/>
@@ -2799,7 +2799,7 @@
       <w:tr>
         <w:tc>
           <w:tcPr>
-            <w:tcW w:type="dxa" w:w="2600"/>
+            <w:tcW w:type="dxa" w:w="3260"/>
             <w:tcMar>
               <w:top w:w="80" w:type="dxa"/>
               <w:start w:w="120" w:type="dxa"/>
@@ -2824,7 +2824,7 @@
         </w:tc>
         <w:tc>
           <w:tcPr>
-            <w:tcW w:type="dxa" w:w="3100"/>
+            <w:tcW w:type="dxa" w:w="2500"/>
             <w:tcMar>
               <w:top w:w="80" w:type="dxa"/>
               <w:start w:w="120" w:type="dxa"/>
@@ -2849,7 +2849,7 @@
         </w:tc>
         <w:tc>
           <w:tcPr>
-            <w:tcW w:type="dxa" w:w="1100"/>
+            <w:tcW w:type="dxa" w:w="1000"/>
             <w:tcMar>
               <w:top w:w="80" w:type="dxa"/>
               <w:start w:w="120" w:type="dxa"/>
@@ -2874,7 +2874,7 @@
         </w:tc>
         <w:tc>
           <w:tcPr>
-            <w:tcW w:type="dxa" w:w="2560"/>
+            <w:tcW w:type="dxa" w:w="2600"/>
             <w:tcMar>
               <w:top w:w="80" w:type="dxa"/>
               <w:start w:w="120" w:type="dxa"/>
@@ -2901,7 +2901,7 @@
       <w:tr>
         <w:tc>
           <w:tcPr>
-            <w:tcW w:type="dxa" w:w="2600"/>
+            <w:tcW w:type="dxa" w:w="3260"/>
             <w:tcMar>
               <w:top w:w="80" w:type="dxa"/>
               <w:start w:w="120" w:type="dxa"/>
@@ -2926,7 +2926,7 @@
         </w:tc>
         <w:tc>
           <w:tcPr>
-            <w:tcW w:type="dxa" w:w="3100"/>
+            <w:tcW w:type="dxa" w:w="2500"/>
             <w:tcMar>
               <w:top w:w="80" w:type="dxa"/>
               <w:start w:w="120" w:type="dxa"/>
@@ -2951,7 +2951,7 @@
         </w:tc>
         <w:tc>
           <w:tcPr>
-            <w:tcW w:type="dxa" w:w="1100"/>
+            <w:tcW w:type="dxa" w:w="1000"/>
             <w:tcMar>
               <w:top w:w="80" w:type="dxa"/>
               <w:start w:w="120" w:type="dxa"/>
@@ -2976,7 +2976,7 @@
         </w:tc>
         <w:tc>
           <w:tcPr>
-            <w:tcW w:type="dxa" w:w="2560"/>
+            <w:tcW w:type="dxa" w:w="2600"/>
             <w:tcMar>
               <w:top w:w="80" w:type="dxa"/>
               <w:start w:w="120" w:type="dxa"/>
@@ -3003,7 +3003,7 @@
       <w:tr>
         <w:tc>
           <w:tcPr>
-            <w:tcW w:type="dxa" w:w="2600"/>
+            <w:tcW w:type="dxa" w:w="3260"/>
             <w:tcMar>
               <w:top w:w="80" w:type="dxa"/>
               <w:start w:w="120" w:type="dxa"/>
@@ -3028,7 +3028,7 @@
         </w:tc>
         <w:tc>
           <w:tcPr>
-            <w:tcW w:type="dxa" w:w="3100"/>
+            <w:tcW w:type="dxa" w:w="2500"/>
             <w:tcMar>
               <w:top w:w="80" w:type="dxa"/>
               <w:start w:w="120" w:type="dxa"/>
@@ -3053,7 +3053,7 @@
         </w:tc>
         <w:tc>
           <w:tcPr>
-            <w:tcW w:type="dxa" w:w="1100"/>
+            <w:tcW w:type="dxa" w:w="1000"/>
             <w:tcMar>
               <w:top w:w="80" w:type="dxa"/>
               <w:start w:w="120" w:type="dxa"/>
@@ -3078,7 +3078,7 @@
         </w:tc>
         <w:tc>
           <w:tcPr>
-            <w:tcW w:type="dxa" w:w="2560"/>
+            <w:tcW w:type="dxa" w:w="2600"/>
             <w:tcMar>
               <w:top w:w="80" w:type="dxa"/>
               <w:start w:w="120" w:type="dxa"/>
@@ -3105,7 +3105,7 @@
       <w:tr>
         <w:tc>
           <w:tcPr>
-            <w:tcW w:type="dxa" w:w="2600"/>
+            <w:tcW w:type="dxa" w:w="3260"/>
             <w:tcMar>
               <w:top w:w="80" w:type="dxa"/>
               <w:start w:w="120" w:type="dxa"/>
@@ -3130,7 +3130,7 @@
         </w:tc>
         <w:tc>
           <w:tcPr>
-            <w:tcW w:type="dxa" w:w="3100"/>
+            <w:tcW w:type="dxa" w:w="2500"/>
             <w:tcMar>
               <w:top w:w="80" w:type="dxa"/>
               <w:start w:w="120" w:type="dxa"/>
@@ -3155,7 +3155,7 @@
         </w:tc>
         <w:tc>
           <w:tcPr>
-            <w:tcW w:type="dxa" w:w="1100"/>
+            <w:tcW w:type="dxa" w:w="1000"/>
             <w:tcMar>
               <w:top w:w="80" w:type="dxa"/>
               <w:start w:w="120" w:type="dxa"/>
@@ -3180,7 +3180,7 @@
         </w:tc>
         <w:tc>
           <w:tcPr>
-            <w:tcW w:type="dxa" w:w="2560"/>
+            <w:tcW w:type="dxa" w:w="2600"/>
             <w:tcMar>
               <w:top w:w="80" w:type="dxa"/>
               <w:start w:w="120" w:type="dxa"/>
@@ -6692,7 +6692,7 @@
         </w:numPr>
       </w:pPr>
       <w:r>
-        <w:t>Backend: 859 tests pass under clean Python 3.12, including auth/PIN, encryption, migrations, backups, merchant upsert, licenses, goal ledgers and FD/RD suggestions, simulation reference vectors, recurring detection, atomic accounts, package privacy, CA tax pack, classification memory, performance, net worth, behavior insights, reward-pilot redaction, and UTC finance-fetch regressions.</w:t>
+        <w:t>Backend: 876 tests pass under clean Python 3.12, including auth/PIN, encryption, migrations, backups, merchant upsert, licenses, exact response contracts for all 182 API operations, goal ledgers and FD/RD suggestions, simulation reference vectors, recurring detection, atomic accounts, package privacy, CA tax pack, classification memory, performance, net worth, behavior insights, reward-pilot redaction, and UTC finance-fetch regressions.</w:t>
       </w:r>
     </w:p>
     <w:p>
@@ -6764,7 +6764,7 @@
         </w:numPr>
       </w:pPr>
       <w:r>
-        <w:t>Local packaging: a fresh macOS arm64 candidate passed strict codesign verification, first start 2.916 seconds, restart 0.926 seconds, idle memory 605.6 MB, database preservation, local trust boundary, and maintenance-boundary checks. Gatekeeper correctly rejects it because it is not yet Apple-notarized.</w:t>
+        <w:t>Local packaging: the fresh commit-25fd5f7 macOS arm64 candidate passed strict codesign verification, first start 3.000 seconds, restart 1.033 seconds, idle memory 604.5 MB across five processes, database preservation, local trust boundary, and maintenance-boundary checks. The DMG and ZIP exact SHA-256 values are recorded in the current package evidence. Gatekeeper correctly rejects the candidate because it is not yet Apple-notarized.</w:t>
       </w:r>
     </w:p>
     <w:p>
@@ -7116,11 +7116,6 @@
       </w:r>
       <w:r>
         <w:t>__________________________________________________________________________</w:t>
-      </w:r>
-    </w:p>
-    <w:p>
-      <w:r>
-        <w:br w:type="page"/>
       </w:r>
     </w:p>
     <w:p>
@@ -7363,10 +7358,10 @@
         <w:tblInd w:w="120" w:type="dxa"/>
       </w:tblPr>
       <w:tblGrid>
-        <w:gridCol w:w="3500"/>
-        <w:gridCol w:w="1450"/>
-        <w:gridCol w:w="900"/>
-        <w:gridCol w:w="3510"/>
+        <w:gridCol w:w="3300"/>
+        <w:gridCol w:w="1300"/>
+        <w:gridCol w:w="1100"/>
+        <w:gridCol w:w="3660"/>
       </w:tblGrid>
       <w:tr>
         <w:trPr>
@@ -7374,7 +7369,7 @@
         </w:trPr>
         <w:tc>
           <w:tcPr>
-            <w:tcW w:type="dxa" w:w="3500"/>
+            <w:tcW w:type="dxa" w:w="3300"/>
             <w:shd w:fill="E8EEF5"/>
             <w:tcMar>
               <w:top w:w="80" w:type="dxa"/>
@@ -7401,7 +7396,7 @@
         </w:tc>
         <w:tc>
           <w:tcPr>
-            <w:tcW w:type="dxa" w:w="1450"/>
+            <w:tcW w:type="dxa" w:w="1300"/>
             <w:shd w:fill="E8EEF5"/>
             <w:tcMar>
               <w:top w:w="80" w:type="dxa"/>
@@ -7428,7 +7423,7 @@
         </w:tc>
         <w:tc>
           <w:tcPr>
-            <w:tcW w:type="dxa" w:w="900"/>
+            <w:tcW w:type="dxa" w:w="1100"/>
             <w:shd w:fill="E8EEF5"/>
             <w:tcMar>
               <w:top w:w="80" w:type="dxa"/>
@@ -7455,7 +7450,7 @@
         </w:tc>
         <w:tc>
           <w:tcPr>
-            <w:tcW w:type="dxa" w:w="3510"/>
+            <w:tcW w:type="dxa" w:w="3660"/>
             <w:shd w:fill="E8EEF5"/>
             <w:tcMar>
               <w:top w:w="80" w:type="dxa"/>
@@ -7484,7 +7479,7 @@
       <w:tr>
         <w:tc>
           <w:tcPr>
-            <w:tcW w:type="dxa" w:w="3500"/>
+            <w:tcW w:type="dxa" w:w="3300"/>
             <w:tcMar>
               <w:top w:w="80" w:type="dxa"/>
               <w:start w:w="120" w:type="dxa"/>
@@ -7509,7 +7504,7 @@
         </w:tc>
         <w:tc>
           <w:tcPr>
-            <w:tcW w:type="dxa" w:w="1450"/>
+            <w:tcW w:type="dxa" w:w="1300"/>
             <w:tcMar>
               <w:top w:w="80" w:type="dxa"/>
               <w:start w:w="120" w:type="dxa"/>
@@ -7534,7 +7529,7 @@
         </w:tc>
         <w:tc>
           <w:tcPr>
-            <w:tcW w:type="dxa" w:w="900"/>
+            <w:tcW w:type="dxa" w:w="1100"/>
             <w:tcMar>
               <w:top w:w="80" w:type="dxa"/>
               <w:start w:w="120" w:type="dxa"/>
@@ -7559,7 +7554,7 @@
         </w:tc>
         <w:tc>
           <w:tcPr>
-            <w:tcW w:type="dxa" w:w="3510"/>
+            <w:tcW w:type="dxa" w:w="3660"/>
             <w:tcMar>
               <w:top w:w="80" w:type="dxa"/>
               <w:start w:w="120" w:type="dxa"/>
@@ -7586,7 +7581,7 @@
       <w:tr>
         <w:tc>
           <w:tcPr>
-            <w:tcW w:type="dxa" w:w="3500"/>
+            <w:tcW w:type="dxa" w:w="3300"/>
             <w:tcMar>
               <w:top w:w="80" w:type="dxa"/>
               <w:start w:w="120" w:type="dxa"/>
@@ -7611,7 +7606,7 @@
         </w:tc>
         <w:tc>
           <w:tcPr>
-            <w:tcW w:type="dxa" w:w="1450"/>
+            <w:tcW w:type="dxa" w:w="1300"/>
             <w:tcMar>
               <w:top w:w="80" w:type="dxa"/>
               <w:start w:w="120" w:type="dxa"/>
@@ -7635,7 +7630,7 @@
         </w:tc>
         <w:tc>
           <w:tcPr>
-            <w:tcW w:type="dxa" w:w="900"/>
+            <w:tcW w:type="dxa" w:w="1100"/>
             <w:tcMar>
               <w:top w:w="80" w:type="dxa"/>
               <w:start w:w="120" w:type="dxa"/>
@@ -7660,7 +7655,7 @@
         </w:tc>
         <w:tc>
           <w:tcPr>
-            <w:tcW w:type="dxa" w:w="3510"/>
+            <w:tcW w:type="dxa" w:w="3660"/>
             <w:tcMar>
               <w:top w:w="80" w:type="dxa"/>
               <w:start w:w="120" w:type="dxa"/>
@@ -7687,7 +7682,7 @@
       <w:tr>
         <w:tc>
           <w:tcPr>
-            <w:tcW w:type="dxa" w:w="3500"/>
+            <w:tcW w:type="dxa" w:w="3300"/>
             <w:tcMar>
               <w:top w:w="80" w:type="dxa"/>
               <w:start w:w="120" w:type="dxa"/>
@@ -7712,7 +7707,7 @@
         </w:tc>
         <w:tc>
           <w:tcPr>
-            <w:tcW w:type="dxa" w:w="1450"/>
+            <w:tcW w:type="dxa" w:w="1300"/>
             <w:tcMar>
               <w:top w:w="80" w:type="dxa"/>
               <w:start w:w="120" w:type="dxa"/>
@@ -7736,7 +7731,7 @@
         </w:tc>
         <w:tc>
           <w:tcPr>
-            <w:tcW w:type="dxa" w:w="900"/>
+            <w:tcW w:type="dxa" w:w="1100"/>
             <w:tcMar>
               <w:top w:w="80" w:type="dxa"/>
               <w:start w:w="120" w:type="dxa"/>
@@ -7761,7 +7756,7 @@
         </w:tc>
         <w:tc>
           <w:tcPr>
-            <w:tcW w:type="dxa" w:w="3510"/>
+            <w:tcW w:type="dxa" w:w="3660"/>
             <w:tcMar>
               <w:top w:w="80" w:type="dxa"/>
               <w:start w:w="120" w:type="dxa"/>
@@ -7788,7 +7783,7 @@
       <w:tr>
         <w:tc>
           <w:tcPr>
-            <w:tcW w:type="dxa" w:w="3500"/>
+            <w:tcW w:type="dxa" w:w="3300"/>
             <w:tcMar>
               <w:top w:w="80" w:type="dxa"/>
               <w:start w:w="120" w:type="dxa"/>
@@ -7813,7 +7808,7 @@
         </w:tc>
         <w:tc>
           <w:tcPr>
-            <w:tcW w:type="dxa" w:w="1450"/>
+            <w:tcW w:type="dxa" w:w="1300"/>
             <w:tcMar>
               <w:top w:w="80" w:type="dxa"/>
               <w:start w:w="120" w:type="dxa"/>
@@ -7837,7 +7832,7 @@
         </w:tc>
         <w:tc>
           <w:tcPr>
-            <w:tcW w:type="dxa" w:w="900"/>
+            <w:tcW w:type="dxa" w:w="1100"/>
             <w:tcMar>
               <w:top w:w="80" w:type="dxa"/>
               <w:start w:w="120" w:type="dxa"/>
@@ -7862,7 +7857,7 @@
         </w:tc>
         <w:tc>
           <w:tcPr>
-            <w:tcW w:type="dxa" w:w="3510"/>
+            <w:tcW w:type="dxa" w:w="3660"/>
             <w:tcMar>
               <w:top w:w="80" w:type="dxa"/>
               <w:start w:w="120" w:type="dxa"/>
@@ -7889,7 +7884,7 @@
       <w:tr>
         <w:tc>
           <w:tcPr>
-            <w:tcW w:type="dxa" w:w="3500"/>
+            <w:tcW w:type="dxa" w:w="3300"/>
             <w:tcMar>
               <w:top w:w="80" w:type="dxa"/>
               <w:start w:w="120" w:type="dxa"/>
@@ -7914,7 +7909,7 @@
         </w:tc>
         <w:tc>
           <w:tcPr>
-            <w:tcW w:type="dxa" w:w="1450"/>
+            <w:tcW w:type="dxa" w:w="1300"/>
             <w:tcMar>
               <w:top w:w="80" w:type="dxa"/>
               <w:start w:w="120" w:type="dxa"/>
@@ -7938,7 +7933,7 @@
         </w:tc>
         <w:tc>
           <w:tcPr>
-            <w:tcW w:type="dxa" w:w="900"/>
+            <w:tcW w:type="dxa" w:w="1100"/>
             <w:tcMar>
               <w:top w:w="80" w:type="dxa"/>
               <w:start w:w="120" w:type="dxa"/>
@@ -7963,7 +7958,7 @@
         </w:tc>
         <w:tc>
           <w:tcPr>
-            <w:tcW w:type="dxa" w:w="3510"/>
+            <w:tcW w:type="dxa" w:w="3660"/>
             <w:tcMar>
               <w:top w:w="80" w:type="dxa"/>
               <w:start w:w="120" w:type="dxa"/>
@@ -7989,7 +7984,7 @@
       <w:tr>
         <w:tc>
           <w:tcPr>
-            <w:tcW w:type="dxa" w:w="3500"/>
+            <w:tcW w:type="dxa" w:w="3300"/>
             <w:tcMar>
               <w:top w:w="80" w:type="dxa"/>
               <w:start w:w="120" w:type="dxa"/>
@@ -8014,7 +8009,7 @@
         </w:tc>
         <w:tc>
           <w:tcPr>
-            <w:tcW w:type="dxa" w:w="1450"/>
+            <w:tcW w:type="dxa" w:w="1300"/>
             <w:tcMar>
               <w:top w:w="80" w:type="dxa"/>
               <w:start w:w="120" w:type="dxa"/>
@@ -8038,7 +8033,7 @@
         </w:tc>
         <w:tc>
           <w:tcPr>
-            <w:tcW w:type="dxa" w:w="900"/>
+            <w:tcW w:type="dxa" w:w="1100"/>
             <w:tcMar>
               <w:top w:w="80" w:type="dxa"/>
               <w:start w:w="120" w:type="dxa"/>
@@ -8063,7 +8058,7 @@
         </w:tc>
         <w:tc>
           <w:tcPr>
-            <w:tcW w:type="dxa" w:w="3510"/>
+            <w:tcW w:type="dxa" w:w="3660"/>
             <w:tcMar>
               <w:top w:w="80" w:type="dxa"/>
               <w:start w:w="120" w:type="dxa"/>
@@ -8089,7 +8084,7 @@
       <w:tr>
         <w:tc>
           <w:tcPr>
-            <w:tcW w:type="dxa" w:w="3500"/>
+            <w:tcW w:type="dxa" w:w="3300"/>
             <w:tcMar>
               <w:top w:w="80" w:type="dxa"/>
               <w:start w:w="120" w:type="dxa"/>
@@ -8114,7 +8109,7 @@
         </w:tc>
         <w:tc>
           <w:tcPr>
-            <w:tcW w:type="dxa" w:w="1450"/>
+            <w:tcW w:type="dxa" w:w="1300"/>
             <w:tcMar>
               <w:top w:w="80" w:type="dxa"/>
               <w:start w:w="120" w:type="dxa"/>
@@ -8138,7 +8133,7 @@
         </w:tc>
         <w:tc>
           <w:tcPr>
-            <w:tcW w:type="dxa" w:w="900"/>
+            <w:tcW w:type="dxa" w:w="1100"/>
             <w:tcMar>
               <w:top w:w="80" w:type="dxa"/>
               <w:start w:w="120" w:type="dxa"/>
@@ -8163,7 +8158,7 @@
         </w:tc>
         <w:tc>
           <w:tcPr>
-            <w:tcW w:type="dxa" w:w="3510"/>
+            <w:tcW w:type="dxa" w:w="3660"/>
             <w:tcMar>
               <w:top w:w="80" w:type="dxa"/>
               <w:start w:w="120" w:type="dxa"/>
@@ -8189,7 +8184,7 @@
       <w:tr>
         <w:tc>
           <w:tcPr>
-            <w:tcW w:type="dxa" w:w="3500"/>
+            <w:tcW w:type="dxa" w:w="3300"/>
             <w:tcMar>
               <w:top w:w="80" w:type="dxa"/>
               <w:start w:w="120" w:type="dxa"/>
@@ -8214,7 +8209,7 @@
         </w:tc>
         <w:tc>
           <w:tcPr>
-            <w:tcW w:type="dxa" w:w="1450"/>
+            <w:tcW w:type="dxa" w:w="1300"/>
             <w:tcMar>
               <w:top w:w="80" w:type="dxa"/>
               <w:start w:w="120" w:type="dxa"/>
@@ -8238,7 +8233,7 @@
         </w:tc>
         <w:tc>
           <w:tcPr>
-            <w:tcW w:type="dxa" w:w="900"/>
+            <w:tcW w:type="dxa" w:w="1100"/>
             <w:tcMar>
               <w:top w:w="80" w:type="dxa"/>
               <w:start w:w="120" w:type="dxa"/>
@@ -8263,7 +8258,7 @@
         </w:tc>
         <w:tc>
           <w:tcPr>
-            <w:tcW w:type="dxa" w:w="3510"/>
+            <w:tcW w:type="dxa" w:w="3660"/>
             <w:tcMar>
               <w:top w:w="80" w:type="dxa"/>
               <w:start w:w="120" w:type="dxa"/>
@@ -8289,7 +8284,7 @@
       <w:tr>
         <w:tc>
           <w:tcPr>
-            <w:tcW w:type="dxa" w:w="3500"/>
+            <w:tcW w:type="dxa" w:w="3300"/>
             <w:tcMar>
               <w:top w:w="80" w:type="dxa"/>
               <w:start w:w="120" w:type="dxa"/>
@@ -8314,7 +8309,7 @@
         </w:tc>
         <w:tc>
           <w:tcPr>
-            <w:tcW w:type="dxa" w:w="1450"/>
+            <w:tcW w:type="dxa" w:w="1300"/>
             <w:tcMar>
               <w:top w:w="80" w:type="dxa"/>
               <w:start w:w="120" w:type="dxa"/>
@@ -8338,7 +8333,7 @@
         </w:tc>
         <w:tc>
           <w:tcPr>
-            <w:tcW w:type="dxa" w:w="900"/>
+            <w:tcW w:type="dxa" w:w="1100"/>
             <w:tcMar>
               <w:top w:w="80" w:type="dxa"/>
               <w:start w:w="120" w:type="dxa"/>
@@ -8363,7 +8358,7 @@
         </w:tc>
         <w:tc>
           <w:tcPr>
-            <w:tcW w:type="dxa" w:w="3510"/>
+            <w:tcW w:type="dxa" w:w="3660"/>
             <w:tcMar>
               <w:top w:w="80" w:type="dxa"/>
               <w:start w:w="120" w:type="dxa"/>
@@ -8389,7 +8384,7 @@
       <w:tr>
         <w:tc>
           <w:tcPr>
-            <w:tcW w:type="dxa" w:w="3500"/>
+            <w:tcW w:type="dxa" w:w="3300"/>
             <w:tcMar>
               <w:top w:w="80" w:type="dxa"/>
               <w:start w:w="120" w:type="dxa"/>
@@ -8414,7 +8409,7 @@
         </w:tc>
         <w:tc>
           <w:tcPr>
-            <w:tcW w:type="dxa" w:w="1450"/>
+            <w:tcW w:type="dxa" w:w="1300"/>
             <w:tcMar>
               <w:top w:w="80" w:type="dxa"/>
               <w:start w:w="120" w:type="dxa"/>
@@ -8438,7 +8433,7 @@
         </w:tc>
         <w:tc>
           <w:tcPr>
-            <w:tcW w:type="dxa" w:w="900"/>
+            <w:tcW w:type="dxa" w:w="1100"/>
             <w:tcMar>
               <w:top w:w="80" w:type="dxa"/>
               <w:start w:w="120" w:type="dxa"/>
@@ -8463,7 +8458,7 @@
         </w:tc>
         <w:tc>
           <w:tcPr>
-            <w:tcW w:type="dxa" w:w="3510"/>
+            <w:tcW w:type="dxa" w:w="3660"/>
             <w:tcMar>
               <w:top w:w="80" w:type="dxa"/>
               <w:start w:w="120" w:type="dxa"/>
@@ -8489,7 +8484,7 @@
       <w:tr>
         <w:tc>
           <w:tcPr>
-            <w:tcW w:type="dxa" w:w="3500"/>
+            <w:tcW w:type="dxa" w:w="3300"/>
             <w:tcMar>
               <w:top w:w="80" w:type="dxa"/>
               <w:start w:w="120" w:type="dxa"/>
@@ -8514,7 +8509,7 @@
         </w:tc>
         <w:tc>
           <w:tcPr>
-            <w:tcW w:type="dxa" w:w="1450"/>
+            <w:tcW w:type="dxa" w:w="1300"/>
             <w:tcMar>
               <w:top w:w="80" w:type="dxa"/>
               <w:start w:w="120" w:type="dxa"/>
@@ -8539,7 +8534,7 @@
         </w:tc>
         <w:tc>
           <w:tcPr>
-            <w:tcW w:type="dxa" w:w="900"/>
+            <w:tcW w:type="dxa" w:w="1100"/>
             <w:tcMar>
               <w:top w:w="80" w:type="dxa"/>
               <w:start w:w="120" w:type="dxa"/>
@@ -8564,7 +8559,7 @@
         </w:tc>
         <w:tc>
           <w:tcPr>
-            <w:tcW w:type="dxa" w:w="3510"/>
+            <w:tcW w:type="dxa" w:w="3660"/>
             <w:tcMar>
               <w:top w:w="80" w:type="dxa"/>
               <w:start w:w="120" w:type="dxa"/>
@@ -8591,7 +8586,7 @@
       <w:tr>
         <w:tc>
           <w:tcPr>
-            <w:tcW w:type="dxa" w:w="3500"/>
+            <w:tcW w:type="dxa" w:w="3300"/>
             <w:tcMar>
               <w:top w:w="80" w:type="dxa"/>
               <w:start w:w="120" w:type="dxa"/>
@@ -8616,7 +8611,7 @@
         </w:tc>
         <w:tc>
           <w:tcPr>
-            <w:tcW w:type="dxa" w:w="1450"/>
+            <w:tcW w:type="dxa" w:w="1300"/>
             <w:tcMar>
               <w:top w:w="80" w:type="dxa"/>
               <w:start w:w="120" w:type="dxa"/>
@@ -8640,7 +8635,7 @@
         </w:tc>
         <w:tc>
           <w:tcPr>
-            <w:tcW w:type="dxa" w:w="900"/>
+            <w:tcW w:type="dxa" w:w="1100"/>
             <w:tcMar>
               <w:top w:w="80" w:type="dxa"/>
               <w:start w:w="120" w:type="dxa"/>
@@ -8665,7 +8660,7 @@
         </w:tc>
         <w:tc>
           <w:tcPr>
-            <w:tcW w:type="dxa" w:w="3510"/>
+            <w:tcW w:type="dxa" w:w="3660"/>
             <w:tcMar>
               <w:top w:w="80" w:type="dxa"/>
               <w:start w:w="120" w:type="dxa"/>
@@ -8692,7 +8687,7 @@
       <w:tr>
         <w:tc>
           <w:tcPr>
-            <w:tcW w:type="dxa" w:w="3500"/>
+            <w:tcW w:type="dxa" w:w="3300"/>
             <w:tcMar>
               <w:top w:w="80" w:type="dxa"/>
               <w:start w:w="120" w:type="dxa"/>
@@ -8717,7 +8712,7 @@
         </w:tc>
         <w:tc>
           <w:tcPr>
-            <w:tcW w:type="dxa" w:w="1450"/>
+            <w:tcW w:type="dxa" w:w="1300"/>
             <w:tcMar>
               <w:top w:w="80" w:type="dxa"/>
               <w:start w:w="120" w:type="dxa"/>
@@ -8741,7 +8736,7 @@
         </w:tc>
         <w:tc>
           <w:tcPr>
-            <w:tcW w:type="dxa" w:w="900"/>
+            <w:tcW w:type="dxa" w:w="1100"/>
             <w:tcMar>
               <w:top w:w="80" w:type="dxa"/>
               <w:start w:w="120" w:type="dxa"/>
@@ -8766,7 +8761,7 @@
         </w:tc>
         <w:tc>
           <w:tcPr>
-            <w:tcW w:type="dxa" w:w="3510"/>
+            <w:tcW w:type="dxa" w:w="3660"/>
             <w:tcMar>
               <w:top w:w="80" w:type="dxa"/>
               <w:start w:w="120" w:type="dxa"/>
@@ -8793,7 +8788,7 @@
       <w:tr>
         <w:tc>
           <w:tcPr>
-            <w:tcW w:type="dxa" w:w="3500"/>
+            <w:tcW w:type="dxa" w:w="3300"/>
             <w:tcMar>
               <w:top w:w="80" w:type="dxa"/>
               <w:start w:w="120" w:type="dxa"/>
@@ -8818,7 +8813,7 @@
         </w:tc>
         <w:tc>
           <w:tcPr>
-            <w:tcW w:type="dxa" w:w="1450"/>
+            <w:tcW w:type="dxa" w:w="1300"/>
             <w:tcMar>
               <w:top w:w="80" w:type="dxa"/>
               <w:start w:w="120" w:type="dxa"/>
@@ -8842,7 +8837,7 @@
         </w:tc>
         <w:tc>
           <w:tcPr>
-            <w:tcW w:type="dxa" w:w="900"/>
+            <w:tcW w:type="dxa" w:w="1100"/>
             <w:tcMar>
               <w:top w:w="80" w:type="dxa"/>
               <w:start w:w="120" w:type="dxa"/>
@@ -8867,7 +8862,7 @@
         </w:tc>
         <w:tc>
           <w:tcPr>
-            <w:tcW w:type="dxa" w:w="3510"/>
+            <w:tcW w:type="dxa" w:w="3660"/>
             <w:tcMar>
               <w:top w:w="80" w:type="dxa"/>
               <w:start w:w="120" w:type="dxa"/>
@@ -8893,7 +8888,7 @@
       <w:tr>
         <w:tc>
           <w:tcPr>
-            <w:tcW w:type="dxa" w:w="3500"/>
+            <w:tcW w:type="dxa" w:w="3300"/>
             <w:tcMar>
               <w:top w:w="80" w:type="dxa"/>
               <w:start w:w="120" w:type="dxa"/>
@@ -8918,7 +8913,7 @@
         </w:tc>
         <w:tc>
           <w:tcPr>
-            <w:tcW w:type="dxa" w:w="1450"/>
+            <w:tcW w:type="dxa" w:w="1300"/>
             <w:tcMar>
               <w:top w:w="80" w:type="dxa"/>
               <w:start w:w="120" w:type="dxa"/>
@@ -8942,7 +8937,7 @@
         </w:tc>
         <w:tc>
           <w:tcPr>
-            <w:tcW w:type="dxa" w:w="900"/>
+            <w:tcW w:type="dxa" w:w="1100"/>
             <w:tcMar>
               <w:top w:w="80" w:type="dxa"/>
               <w:start w:w="120" w:type="dxa"/>
@@ -8967,7 +8962,7 @@
         </w:tc>
         <w:tc>
           <w:tcPr>
-            <w:tcW w:type="dxa" w:w="3510"/>
+            <w:tcW w:type="dxa" w:w="3660"/>
             <w:tcMar>
               <w:top w:w="80" w:type="dxa"/>
               <w:start w:w="120" w:type="dxa"/>
@@ -8993,7 +8988,7 @@
       <w:tr>
         <w:tc>
           <w:tcPr>
-            <w:tcW w:type="dxa" w:w="3500"/>
+            <w:tcW w:type="dxa" w:w="3300"/>
             <w:tcMar>
               <w:top w:w="80" w:type="dxa"/>
               <w:start w:w="120" w:type="dxa"/>
@@ -9018,7 +9013,7 @@
         </w:tc>
         <w:tc>
           <w:tcPr>
-            <w:tcW w:type="dxa" w:w="1450"/>
+            <w:tcW w:type="dxa" w:w="1300"/>
             <w:tcMar>
               <w:top w:w="80" w:type="dxa"/>
               <w:start w:w="120" w:type="dxa"/>
@@ -9042,7 +9037,7 @@
         </w:tc>
         <w:tc>
           <w:tcPr>
-            <w:tcW w:type="dxa" w:w="900"/>
+            <w:tcW w:type="dxa" w:w="1100"/>
             <w:tcMar>
               <w:top w:w="80" w:type="dxa"/>
               <w:start w:w="120" w:type="dxa"/>
@@ -9067,7 +9062,7 @@
         </w:tc>
         <w:tc>
           <w:tcPr>
-            <w:tcW w:type="dxa" w:w="3510"/>
+            <w:tcW w:type="dxa" w:w="3660"/>
             <w:tcMar>
               <w:top w:w="80" w:type="dxa"/>
               <w:start w:w="120" w:type="dxa"/>
@@ -9093,7 +9088,7 @@
       <w:tr>
         <w:tc>
           <w:tcPr>
-            <w:tcW w:type="dxa" w:w="3500"/>
+            <w:tcW w:type="dxa" w:w="3300"/>
             <w:tcMar>
               <w:top w:w="80" w:type="dxa"/>
               <w:start w:w="120" w:type="dxa"/>
@@ -9118,7 +9113,7 @@
         </w:tc>
         <w:tc>
           <w:tcPr>
-            <w:tcW w:type="dxa" w:w="1450"/>
+            <w:tcW w:type="dxa" w:w="1300"/>
             <w:tcMar>
               <w:top w:w="80" w:type="dxa"/>
               <w:start w:w="120" w:type="dxa"/>
@@ -9142,7 +9137,7 @@
         </w:tc>
         <w:tc>
           <w:tcPr>
-            <w:tcW w:type="dxa" w:w="900"/>
+            <w:tcW w:type="dxa" w:w="1100"/>
             <w:tcMar>
               <w:top w:w="80" w:type="dxa"/>
               <w:start w:w="120" w:type="dxa"/>
@@ -9167,7 +9162,7 @@
         </w:tc>
         <w:tc>
           <w:tcPr>
-            <w:tcW w:type="dxa" w:w="3510"/>
+            <w:tcW w:type="dxa" w:w="3660"/>
             <w:tcMar>
               <w:top w:w="80" w:type="dxa"/>
               <w:start w:w="120" w:type="dxa"/>

</xml_diff>

<commit_message>
docs(owner): publish Cashfree completion runbook
</commit_message>
<xml_diff>
--- a/docs/GODFIN_OWNER_COMPLETION_RUNBOOK.docx
+++ b/docs/GODFIN_OWNER_COMPLETION_RUNBOOK.docx
@@ -64,7 +64,7 @@
           <w:color w:val="667085"/>
           <w:sz w:val="20"/>
         </w:rPr>
-        <w:t>Version 2.4  •  16 August 2026  •  oculusrex14/GODFIN (private)</w:t>
+        <w:t>Version 2.5  •  16 August 2026  •  oculusrex14/GODFIN (private)</w:t>
         <w:br/>
         <w:t>Production branch: codex/godfin-production-v5</w:t>
       </w:r>
@@ -156,7 +156,7 @@
         </w:numPr>
       </w:pPr>
       <w:r>
-        <w:t>Keep the desktop backend local. Supabase, Vercel, Stripe, Resend, and R2 are website, licensing, email, and distribution services only; they must never become the application database.</w:t>
+        <w:t>Keep the desktop backend local. Supabase, Vercel, Cashfree, Resend, and R2 are website, licensing, email, and distribution services only; they must never become the application database.</w:t>
       </w:r>
     </w:p>
     <w:p>
@@ -220,7 +220,7 @@
           <w:color w:val="172033"/>
           <w:sz w:val="21"/>
         </w:rPr>
-        <w:t>Production remediation is tracked on the private v5 branch. The clean Python 3.12 baseline is 876 passing backend tests. All 182 API operations publish an explicit success or intentional terminal status, a non-empty media-specific success schema, and the shared error contract. Frontend lint, accessibility, authentication, and production builds pass; website contract and production builds pass; desktop release/update tests pass 12/12; and package privacy checks pass 7/7.</w:t>
+        <w:t>Production remediation is tracked on the private v5 branch. The clean Python 3.12 baseline is 878 passing backend tests. All 182 API operations publish an explicit success or intentional terminal status, a non-empty media-specific success schema, and the shared error contract. Frontend lint, accessibility, authentication, and production builds pass; five executable Cashfree contract tests and the website production build pass; desktop release/update tests pass 12/12; and package privacy checks pass 7/7.</w:t>
       </w:r>
     </w:p>
     <w:p>
@@ -244,7 +244,7 @@
         </w:numPr>
       </w:pPr>
       <w:r>
-        <w:t>Production website: https://godfin.vercel.app</w:t>
+        <w:t>Canonical production website: https://godfin.dev. The apex resolves to Vercel over HTTPS; https://godfin.vercel.app remains an operational fallback.</w:t>
       </w:r>
     </w:p>
     <w:p>
@@ -256,7 +256,7 @@
         </w:numPr>
       </w:pPr>
       <w:r>
-        <w:t>Supabase project: GODFIN (ap-south-1); migrations 0001–0003 match local history. Migration 0003 adds the non-revenue owner_test license kind without weakening normal three-device enforcement.</w:t>
+        <w:t>Supabase project: GODFIN (ap-south-1). Local ordered migrations now run through 0006; migration 0006 adds provider-neutral Cashfree purchase/event fields and replay-safe Cashfree provisioning without deleting legacy purchase history. Remote application and pgTAP evidence remain required.</w:t>
       </w:r>
     </w:p>
     <w:p>
@@ -292,7 +292,7 @@
         </w:numPr>
       </w:pPr>
       <w:r>
-        <w:t>The website product tour uses real React application captures generated only from synthetic data, muted WebM/MP4 media with reduced-motion fallbacks, and build-time checks that prevent unreleased features from being advertised. Production deployment dpl_2dUiNiw38R9pqfsymPx7NWhpw7Ej is READY at godfin.vercel.app.</w:t>
+        <w:t>The website product tour uses real React application captures generated only from synthetic data, muted WebM/MP4 media with reduced-motion fallbacks, and build-time checks that prevent unreleased features from being advertised. The current public deployment is reachable at godfin.dev; the Cashfree code update must remain a preview until migration 0006 and provider tests pass.</w:t>
       </w:r>
     </w:p>
     <w:p>
@@ -364,7 +364,7 @@
         </w:numPr>
       </w:pPr>
       <w:r>
-        <w:t>The deterministic CycloneDX 1.6 SBOM contains 1,008 unique components with zero unresolved license identifiers. Third-party notices list all conditional licenses. Final human legal clearance is intentionally fail-closed and remains pending in supply-chain/legal-clearance.json.</w:t>
+        <w:t>The deterministic CycloneDX 1.6 SBOM contains 1,035 unique components with zero unresolved license identifiers. Third-party notices list all conditional licenses. Final human legal clearance is intentionally fail-closed and remains pending in supply-chain/legal-clearance.json.</w:t>
       </w:r>
     </w:p>
     <w:p>
@@ -400,7 +400,7 @@
         </w:numPr>
       </w:pPr>
       <w:r>
-        <w:t>Repository code evidence is current through commit 25fd5f7 on codex/godfin-production-v5; this v2.4 runbook and its refreshed package evidence are the next documentation-only commit.</w:t>
+        <w:t>Repository code evidence is current through commit aeb5cb9 on codex/godfin-production-v5. Cashfree, canonical-domain, Gmail-callback, and bounded-job changes are pushed privately; this v2.5 runbook is the next documentation-only commit.</w:t>
       </w:r>
     </w:p>
     <w:p>
@@ -412,7 +412,19 @@
         </w:numPr>
       </w:pPr>
       <w:r>
-        <w:t>Desktop Gmail OAuth configuration, final browser-family verification, Stripe KYC/prices, Resend/DNS, custom domain, Apple/Windows certificates, R2, cross-platform clean-system evidence, dependency-license approval, and public-launch authorization are not yet complete.</w:t>
+        <w:t>The Gmail callback trust defect is fixed in the installed app: the exact external-browser callback may reach the OAuth handler while ordinary routes still require the per-launch secret. Owner consent/sync/disconnect/reconnect must now be retried with the configured Desktop client; naraharikripa14@gmail.com is also listed as a Google test user.</w:t>
+      </w:r>
+    </w:p>
+    <w:p>
+      <w:pPr>
+        <w:keepLines/>
+        <w:numPr>
+          <w:ilvl w:val="0"/>
+          <w:numId w:val="11"/>
+        </w:numPr>
+      </w:pPr>
+      <w:r>
+        <w:t>Final Gmail consent, Cashfree KYC/sandbox/live tests, Supabase migration 0006 deployment, Resend DNS, Google/Supabase canonical redirect updates, Apple/Windows certificates, R2, cross-platform clean-system evidence, dependency-license approval, and public-launch authorization are not yet complete.</w:t>
       </w:r>
     </w:p>
     <w:p>
@@ -626,7 +638,7 @@
                 <w:color w:val="172033"/>
                 <w:sz w:val="18"/>
               </w:rPr>
-              <w:t>No owner desktop OAuth client is installed outside the repository.</w:t>
+              <w:t>Client setup is done and callback trust is fixed; end-to-end consent/sync has not been re-run.</w:t>
             </w:r>
           </w:p>
         </w:tc>
@@ -651,7 +663,7 @@
                 <w:color w:val="172033"/>
                 <w:sz w:val="18"/>
               </w:rPr>
-              <w:t>Create the separate read-only Gmail desktop client and store its JSON privately.</w:t>
+              <w:t>Retry Connect Gmail in the installed app and complete Google consent.</w:t>
             </w:r>
           </w:p>
         </w:tc>
@@ -805,7 +817,7 @@
                 <w:color w:val="172033"/>
                 <w:sz w:val="18"/>
               </w:rPr>
-              <w:t>Stripe India</w:t>
+              <w:t>Cashfree India</w:t>
             </w:r>
           </w:p>
         </w:tc>
@@ -830,7 +842,7 @@
                 <w:color w:val="172033"/>
                 <w:sz w:val="18"/>
               </w:rPr>
-              <w:t>Keys, one-time Price IDs, and webhook are absent.</w:t>
+              <w:t>Repository integration exists; KYC, credentials, webhook, and sandbox evidence are absent.</w:t>
             </w:r>
           </w:p>
         </w:tc>
@@ -855,7 +867,7 @@
                 <w:color w:val="172033"/>
                 <w:sz w:val="18"/>
               </w:rPr>
-              <w:t>Complete KYC; create test/live products and webhook.</w:t>
+              <w:t>Complete KYC; configure sandbox keys and all required webhook events.</w:t>
             </w:r>
           </w:p>
         </w:tc>
@@ -880,7 +892,7 @@
                 <w:color w:val="172033"/>
                 <w:sz w:val="18"/>
               </w:rPr>
-              <w:t>Replay-safe purchase provisions once.</w:t>
+              <w:t>Replay-safe purchase, refund, dispute, and email flows pass.</w:t>
             </w:r>
           </w:p>
         </w:tc>
@@ -1009,7 +1021,7 @@
                 <w:color w:val="172033"/>
                 <w:sz w:val="18"/>
               </w:rPr>
-              <w:t>Custom domain</w:t>
+              <w:t>Canonical redirects</w:t>
             </w:r>
           </w:p>
         </w:tc>
@@ -1034,7 +1046,7 @@
                 <w:color w:val="172033"/>
                 <w:sz w:val="18"/>
               </w:rPr>
-              <w:t>No Vercel domain is attached.</w:t>
+              <w:t>godfin.dev resolves, but Google/Supabase/Vercel settings still need owner verification.</w:t>
             </w:r>
           </w:p>
         </w:tc>
@@ -1059,7 +1071,7 @@
                 <w:color w:val="172033"/>
                 <w:sz w:val="18"/>
               </w:rPr>
-              <w:t>Register/control godfin.dev and connect DNS.</w:t>
+              <w:t>Make godfin.dev primary and retain the Vercel callback fallback.</w:t>
             </w:r>
           </w:p>
         </w:tc>
@@ -1084,7 +1096,7 @@
                 <w:color w:val="172033"/>
                 <w:sz w:val="18"/>
               </w:rPr>
-              <w:t>HTTPS apex and redirect pass.</w:t>
+              <w:t>Apex, www redirect, OAuth, sitemap, and security headers pass.</w:t>
             </w:r>
           </w:p>
         </w:tc>
@@ -1737,7 +1749,7 @@
         </w:numPr>
       </w:pPr>
       <w:r>
-        <w:t>Add authorized JavaScript origins: https://godfin.vercel.app now; add https://godfin.dev and https://www.godfin.dev after domain connection.</w:t>
+        <w:t>Add authorized JavaScript origins: https://godfin.dev and https://www.godfin.dev. Keep https://godfin.vercel.app only as the documented operational fallback while migration is completed.</w:t>
       </w:r>
     </w:p>
     <w:p>
@@ -1786,7 +1798,7 @@
         </w:numPr>
       </w:pPr>
       <w:r>
-        <w:t>In Supabase Authentication → URL Configuration, set Site URL to https://godfin.vercel.app until the custom domain is live.</w:t>
+        <w:t>In Supabase Authentication → URL Configuration, set Site URL to https://godfin.dev.</w:t>
       </w:r>
     </w:p>
     <w:p>
@@ -1798,7 +1810,7 @@
         </w:numPr>
       </w:pPr>
       <w:r>
-        <w:t>Add https://godfin.vercel.app/auth/callback to the redirect allow-list. Later add https://godfin.dev/auth/callback and switch the Site URL to the custom domain.</w:t>
+        <w:t>Add https://godfin.dev/auth/callback and https://www.godfin.dev/auth/callback to the redirect allow-list. Retain https://godfin.vercel.app/auth/callback as the explicit fallback.</w:t>
       </w:r>
     </w:p>
     <w:p>
@@ -1822,7 +1834,7 @@
         </w:numPr>
       </w:pPr>
       <w:r>
-        <w:t>Open https://godfin.vercel.app/account in a private browser window, choose Google, complete consent, and verify return to /account.</w:t>
+        <w:t>Open https://godfin.dev/account in a private browser window, choose Google, complete consent, and verify return to /account.</w:t>
       </w:r>
     </w:p>
     <w:p>
@@ -1834,7 +1846,7 @@
         </w:numPr>
       </w:pPr>
       <w:r>
-        <w:t>Sign out and repeat with a second test Google account. Confirm neither account can see the other account’s purchases, licenses, activations, or waitlist data.</w:t>
+        <w:t>Sign out and repeat with naraharikripa14@gmail.com. Confirm neither account can see the other account’s purchases, licenses, activations, or waitlist data.</w:t>
       </w:r>
     </w:p>
     <w:p>
@@ -1938,7 +1950,7 @@
           <w:color w:val="172033"/>
           <w:sz w:val="21"/>
         </w:rPr>
-        <w:t>The production origin is https://godfin.vercel.app, the Supabase callback is https://omrtkfwjauyakhvynutk.supabase.co/auth/v1/callback, and the website callback is https://godfin.vercel.app/auth/callback. A distinct second-account isolation test remains a pre-launch gate.</w:t>
+        <w:t>The canonical origin is https://godfin.dev, the Supabase provider callback is https://omrtkfwjauyakhvynutk.supabase.co/auth/v1/callback, and the website callback is https://godfin.dev/auth/callback. The Vercel callback remains a fallback. A distinct second-account isolation test remains a pre-launch gate.</w:t>
       </w:r>
     </w:p>
     <w:p>
@@ -2025,6 +2037,33 @@
     </w:p>
     <w:p>
       <w:pPr>
+        <w:spacing w:before="100" w:after="160" w:line="288" w:lineRule="auto"/>
+        <w:ind w:left="115" w:right="115"/>
+        <w:shd w:fill="E8EEF5"/>
+        <w:pBdr>
+          <w:left w:val="single" w:sz="18" w:space="8" w:color="163A5F"/>
+        </w:pBdr>
+      </w:pPr>
+      <w:r>
+        <w:rPr>
+          <w:rFonts w:ascii="Calibri" w:hAnsi="Calibri"/>
+          <w:b/>
+          <w:color w:val="163A5F"/>
+          <w:sz w:val="21"/>
+        </w:rPr>
+        <w:t xml:space="preserve">IF YOU SAW MISSING_LAUNCH_TRUST  </w:t>
+      </w:r>
+      <w:r>
+        <w:rPr>
+          <w:rFonts w:ascii="Calibri" w:hAnsi="Calibri"/>
+          <w:color w:val="172033"/>
+          <w:sz w:val="21"/>
+        </w:rPr>
+        <w:t>Fully quit GODFIN, reopen /Applications/GODFIN.app, and begin a fresh Connect Gmail attempt from Settings. Do not reuse or refresh an old Google callback tab. Builds at commit 1e3f160 or later allow only the exact 127.0.0.1 Gmail callback through this boundary; every ordinary backend route still requires the active desktop launch secret.</w:t>
+      </w:r>
+    </w:p>
+    <w:p>
+      <w:pPr>
         <w:keepLines/>
         <w:numPr>
           <w:ilvl w:val="0"/>
@@ -2104,7 +2143,7 @@
         </w:numPr>
       </w:pPr>
       <w:r>
-        <w:t>Complete the localhost callback. Verify Settings changes to connected, run the initial sync against a test mailbox, and confirm imports are assigned only to configured active account routes.</w:t>
+        <w:t>Complete the localhost callback. The installed build now permits only the exact external-browser GET callback to pass without the per-launch secret; host/origin validation, one-time state, PKCE, session binding, and expiry remain enforced. Verify Settings changes to connected, run the initial sync against a test mailbox, and confirm imports are assigned only to configured active account routes.</w:t>
       </w:r>
     </w:p>
     <w:p>
@@ -2269,7 +2308,7 @@
         <w:pStyle w:val="Heading1"/>
       </w:pPr>
       <w:r>
-        <w:t>2. Stripe India: one-time payments only</w:t>
+        <w:t>2. Cashfree India: one-time payments only</w:t>
       </w:r>
     </w:p>
     <w:p>
@@ -2296,7 +2335,7 @@
           <w:color w:val="172033"/>
           <w:sz w:val="21"/>
         </w:rPr>
-        <w:t>Create one-time prices and Checkout mode=payment only. Pro and Max include zero hosted AI credits. Credit packs are separate one-time purchases. Never create a subscription, trial, recurring price, or monthly allowance.</w:t>
+        <w:t>Sell only the Pro and Max lifetime licenses. They include zero hosted AI credits. Do not create subscriptions, trials, recurring prices, credit packs, or monthly allowances.</w:t>
       </w:r>
     </w:p>
     <w:p>
@@ -2316,7 +2355,7 @@
         </w:numPr>
       </w:pPr>
       <w:r>
-        <w:t>Use a Stripe account owned by the legal seller. Complete India activation, KYC, bank verification, statement descriptor, customer support details, tax settings, and two-factor authentication.</w:t>
+        <w:t>Use a Cashfree account owned by the legal seller. Complete Payment Gateway activation, KYC, bank verification, statement descriptor, customer support details, tax settings, and two-factor authentication.</w:t>
       </w:r>
     </w:p>
     <w:p>
@@ -2340,7 +2379,7 @@
         </w:numPr>
       </w:pPr>
       <w:r>
-        <w:t>Confirm with Stripe and your tax adviser that the account may sell one-time software licenses domestically and internationally, and how GST/invoices/refunds must be handled.</w:t>
+        <w:t>Confirm with Cashfree and your tax adviser that the account may sell one-time software licenses domestically and internationally, and how GST, invoices, chargebacks, and refunds must be handled.</w:t>
       </w:r>
     </w:p>
     <w:p>
@@ -2352,7 +2391,7 @@
         </w:numPr>
       </w:pPr>
       <w:r>
-        <w:t>Enable Radar’s supported payment-fraud controls. Do not build hardware serial, persistent IP fingerprint, or payment-method fingerprint storage in GODFIN.</w:t>
+        <w:t>Enable Cashfree's available risk controls. Do not build hardware serial, persistent IP fingerprint, or payment-method fingerprint storage in GODFIN.</w:t>
       </w:r>
     </w:p>
     <w:p>
@@ -2360,7 +2399,215 @@
         <w:pStyle w:val="Heading2"/>
       </w:pPr>
       <w:r>
-        <w:t>2.2 Create test products and prices</w:t>
+        <w:t>2.2 Test and apply Supabase migration 0006</w:t>
+      </w:r>
+    </w:p>
+    <w:p>
+      <w:pPr>
+        <w:spacing w:before="100" w:after="160" w:line="288" w:lineRule="auto"/>
+        <w:ind w:left="115" w:right="115"/>
+        <w:shd w:fill="FFF4D8"/>
+        <w:pBdr>
+          <w:left w:val="single" w:sz="18" w:space="8" w:color="7A5A00"/>
+        </w:pBdr>
+      </w:pPr>
+      <w:r>
+        <w:rPr>
+          <w:rFonts w:ascii="Calibri" w:hAnsi="Calibri"/>
+          <w:b/>
+          <w:color w:val="7A5A00"/>
+          <w:sz w:val="21"/>
+        </w:rPr>
+        <w:t xml:space="preserve">DO THIS BEFORE ENABLING CHECKOUT  </w:t>
+      </w:r>
+      <w:r>
+        <w:rPr>
+          <w:rFonts w:ascii="Calibri" w:hAnsi="Calibri"/>
+          <w:color w:val="172033"/>
+          <w:sz w:val="21"/>
+        </w:rPr>
+        <w:t>The deployed website cannot read Cashfree purchases until migration 0006 exists in Supabase. Keep CHECKOUT_ENABLED=false throughout this section. The migration is additive and preserves legacy purchase history, but a verified backup is still required before a production database change.</w:t>
+      </w:r>
+    </w:p>
+    <w:p>
+      <w:pPr>
+        <w:keepLines/>
+        <w:numPr>
+          <w:ilvl w:val="0"/>
+          <w:numId w:val="10"/>
+        </w:numPr>
+      </w:pPr>
+      <w:r>
+        <w:t>Open Docker Desktop and wait until it reports that its engine is running. This is used only to test an isolated local Supabase database; it does not receive the desktop app's financial data.</w:t>
+      </w:r>
+    </w:p>
+    <w:p>
+      <w:pPr>
+        <w:keepLines/>
+        <w:numPr>
+          <w:ilvl w:val="0"/>
+          <w:numId w:val="10"/>
+        </w:numPr>
+      </w:pPr>
+      <w:r>
+        <w:t>Open Terminal and run: cd /Users/oculus/Projects/GODFIN/GODFIN_PRODUCTION/website</w:t>
+      </w:r>
+    </w:p>
+    <w:p>
+      <w:pPr>
+        <w:keepLines/>
+        <w:numPr>
+          <w:ilvl w:val="0"/>
+          <w:numId w:val="10"/>
+        </w:numPr>
+      </w:pPr>
+      <w:r>
+        <w:t>Run: supabase start. Wait for the local services to finish starting. If the command says Docker is unavailable, fix Docker first rather than skipping the database test.</w:t>
+      </w:r>
+    </w:p>
+    <w:p>
+      <w:pPr>
+        <w:keepLines/>
+        <w:numPr>
+          <w:ilvl w:val="0"/>
+          <w:numId w:val="10"/>
+        </w:numPr>
+      </w:pPr>
+      <w:r>
+        <w:t>Run: supabase db reset --local. Read the target carefully and continue only when it clearly says the local Supabase stack. This command is destructive to the local test database and must never be run with --linked.</w:t>
+      </w:r>
+    </w:p>
+    <w:p>
+      <w:pPr>
+        <w:keepLines/>
+        <w:numPr>
+          <w:ilvl w:val="0"/>
+          <w:numId w:val="10"/>
+        </w:numPr>
+      </w:pPr>
+      <w:r>
+        <w:t>Run: supabase test db --local supabase/tests. Confirm all files, including 0006_cashfree_commerce.test.sql, finish successfully with no failed pgTAP assertion.</w:t>
+      </w:r>
+    </w:p>
+    <w:p>
+      <w:pPr>
+        <w:keepLines/>
+        <w:numPr>
+          <w:ilvl w:val="0"/>
+          <w:numId w:val="10"/>
+        </w:numPr>
+      </w:pPr>
+      <w:r>
+        <w:t>Run: supabase stop. This shuts down the temporary local stack without touching the hosted project.</w:t>
+      </w:r>
+    </w:p>
+    <w:p>
+      <w:pPr>
+        <w:keepLines/>
+        <w:numPr>
+          <w:ilvl w:val="0"/>
+          <w:numId w:val="10"/>
+        </w:numPr>
+      </w:pPr>
+      <w:r>
+        <w:t>In Supabase Dashboard, open project GODFIN → Database → Backups and verify that a recent recoverable backup exists. If the plan does not provide managed backups, make a private encrypted database backup/export using Supabase's documented method before continuing.</w:t>
+      </w:r>
+    </w:p>
+    <w:p>
+      <w:pPr>
+        <w:keepLines/>
+        <w:numPr>
+          <w:ilvl w:val="0"/>
+          <w:numId w:val="10"/>
+        </w:numPr>
+      </w:pPr>
+      <w:r>
+        <w:t>Back in Terminal, run: supabase login. Complete the one-time browser authorization if asked; never paste the access token into this document or chat.</w:t>
+      </w:r>
+    </w:p>
+    <w:p>
+      <w:pPr>
+        <w:keepLines/>
+        <w:numPr>
+          <w:ilvl w:val="0"/>
+          <w:numId w:val="10"/>
+        </w:numPr>
+      </w:pPr>
+      <w:r>
+        <w:t>Run: supabase link --project-ref omrtkfwjauyakhvynutk. Confirm the displayed project is GODFIN in ap-south-1.</w:t>
+      </w:r>
+    </w:p>
+    <w:p>
+      <w:pPr>
+        <w:keepLines/>
+        <w:numPr>
+          <w:ilvl w:val="0"/>
+          <w:numId w:val="10"/>
+        </w:numPr>
+      </w:pPr>
+      <w:r>
+        <w:t>Run: supabase migration list --linked. Migration 0006 should appear locally and not yet remotely on the first run.</w:t>
+      </w:r>
+    </w:p>
+    <w:p>
+      <w:pPr>
+        <w:keepLines/>
+        <w:numPr>
+          <w:ilvl w:val="0"/>
+          <w:numId w:val="10"/>
+        </w:numPr>
+      </w:pPr>
+      <w:r>
+        <w:t>Run: supabase db push --linked --dry-run. Read the output and confirm it proposes only the missing ordered migration 0006_cashfree_commerce.sql.</w:t>
+      </w:r>
+    </w:p>
+    <w:p>
+      <w:pPr>
+        <w:keepLines/>
+        <w:numPr>
+          <w:ilvl w:val="0"/>
+          <w:numId w:val="10"/>
+        </w:numPr>
+      </w:pPr>
+      <w:r>
+        <w:t>Run: supabase db push --linked. Do not close Terminal until it reports success.</w:t>
+      </w:r>
+    </w:p>
+    <w:p>
+      <w:pPr>
+        <w:keepLines/>
+        <w:numPr>
+          <w:ilvl w:val="0"/>
+          <w:numId w:val="10"/>
+        </w:numPr>
+      </w:pPr>
+      <w:r>
+        <w:t>Run: supabase migration list --linked again. Confirm 0006 appears in both the local and remote columns. Leave CHECKOUT_ENABLED=false until the sandbox matrix passes.</w:t>
+      </w:r>
+    </w:p>
+    <w:p>
+      <w:pPr>
+        <w:pStyle w:val="RunbookCaption"/>
+      </w:pPr>
+      <w:r>
+        <w:t xml:space="preserve">Official reference: </w:t>
+      </w:r>
+      <w:hyperlink r:id="rId13">
+        <w:r>
+          <w:rPr>
+            <w:color w:val="2E74B5"/>
+            <w:u w:val="single"/>
+          </w:rPr>
+          <w:t>Supabase database migrations</w:t>
+        </w:r>
+      </w:hyperlink>
+    </w:p>
+    <w:p>
+      <w:pPr>
+        <w:pStyle w:val="Heading2"/>
+      </w:pPr>
+      <w:r>
+        <w:t>2.3 Configure sandbox variables and catalog</w:t>
       </w:r>
     </w:p>
     <w:tbl>
@@ -2372,10 +2619,10 @@
         <w:tblInd w:w="120" w:type="dxa"/>
       </w:tblPr>
       <w:tblGrid>
-        <w:gridCol w:w="3260"/>
+        <w:gridCol w:w="2800"/>
         <w:gridCol w:w="2500"/>
-        <w:gridCol w:w="1000"/>
-        <w:gridCol w:w="2600"/>
+        <w:gridCol w:w="1600"/>
+        <w:gridCol w:w="2460"/>
       </w:tblGrid>
       <w:tr>
         <w:trPr>
@@ -2383,7 +2630,7 @@
         </w:trPr>
         <w:tc>
           <w:tcPr>
-            <w:tcW w:type="dxa" w:w="3260"/>
+            <w:tcW w:type="dxa" w:w="2800"/>
             <w:shd w:fill="E8EEF5"/>
             <w:tcMar>
               <w:top w:w="80" w:type="dxa"/>
@@ -2404,7 +2651,7 @@
                 <w:color w:val="163A5F"/>
                 <w:sz w:val="19"/>
               </w:rPr>
-              <w:t>Environment variable</w:t>
+              <w:t>Setting</w:t>
             </w:r>
           </w:p>
         </w:tc>
@@ -2431,13 +2678,13 @@
                 <w:color w:val="163A5F"/>
                 <w:sz w:val="19"/>
               </w:rPr>
-              <w:t>Product</w:t>
+              <w:t>Purpose</w:t>
             </w:r>
           </w:p>
         </w:tc>
         <w:tc>
           <w:tcPr>
-            <w:tcW w:type="dxa" w:w="1000"/>
+            <w:tcW w:type="dxa" w:w="1600"/>
             <w:shd w:fill="E8EEF5"/>
             <w:tcMar>
               <w:top w:w="80" w:type="dxa"/>
@@ -2458,13 +2705,13 @@
                 <w:color w:val="163A5F"/>
                 <w:sz w:val="19"/>
               </w:rPr>
-              <w:t>Currency</w:t>
+              <w:t>Safe starting value</w:t>
             </w:r>
           </w:p>
         </w:tc>
         <w:tc>
           <w:tcPr>
-            <w:tcW w:type="dxa" w:w="2600"/>
+            <w:tcW w:type="dxa" w:w="2460"/>
             <w:shd w:fill="E8EEF5"/>
             <w:tcMar>
               <w:top w:w="80" w:type="dxa"/>
@@ -2485,7 +2732,7 @@
                 <w:color w:val="163A5F"/>
                 <w:sz w:val="19"/>
               </w:rPr>
-              <w:t>Exact one-time amount</w:t>
+              <w:t>Owner action</w:t>
             </w:r>
           </w:p>
         </w:tc>
@@ -2493,7 +2740,7 @@
       <w:tr>
         <w:tc>
           <w:tcPr>
-            <w:tcW w:type="dxa" w:w="3260"/>
+            <w:tcW w:type="dxa" w:w="2800"/>
             <w:tcMar>
               <w:top w:w="80" w:type="dxa"/>
               <w:start w:w="120" w:type="dxa"/>
@@ -2512,7 +2759,7 @@
                 <w:color w:val="172033"/>
                 <w:sz w:val="18"/>
               </w:rPr>
-              <w:t>STRIPE_PRICE_PRO</w:t>
+              <w:t>CASHFREE_CLIENT_ID</w:t>
             </w:r>
           </w:p>
         </w:tc>
@@ -2537,13 +2784,13 @@
                 <w:color w:val="172033"/>
                 <w:sz w:val="18"/>
               </w:rPr>
-              <w:t>GODFIN Pro lifetime</w:t>
+              <w:t>Server authentication</w:t>
             </w:r>
           </w:p>
         </w:tc>
         <w:tc>
           <w:tcPr>
-            <w:tcW w:type="dxa" w:w="1000"/>
+            <w:tcW w:type="dxa" w:w="1600"/>
             <w:tcMar>
               <w:top w:w="80" w:type="dxa"/>
               <w:start w:w="120" w:type="dxa"/>
@@ -2562,13 +2809,13 @@
                 <w:color w:val="172033"/>
                 <w:sz w:val="18"/>
               </w:rPr>
-              <w:t>INR</w:t>
+              <w:t>Secret; leave blank in Git</w:t>
             </w:r>
           </w:p>
         </w:tc>
         <w:tc>
           <w:tcPr>
-            <w:tcW w:type="dxa" w:w="2600"/>
+            <w:tcW w:type="dxa" w:w="2460"/>
             <w:tcMar>
               <w:top w:w="80" w:type="dxa"/>
               <w:start w:w="120" w:type="dxa"/>
@@ -2587,7 +2834,7 @@
                 <w:color w:val="172033"/>
                 <w:sz w:val="18"/>
               </w:rPr>
-              <w:t>₹4,999</w:t>
+              <w:t>Add sandbox value in Vercel Preview</w:t>
             </w:r>
           </w:p>
         </w:tc>
@@ -2595,7 +2842,7 @@
       <w:tr>
         <w:tc>
           <w:tcPr>
-            <w:tcW w:type="dxa" w:w="3260"/>
+            <w:tcW w:type="dxa" w:w="2800"/>
             <w:tcMar>
               <w:top w:w="80" w:type="dxa"/>
               <w:start w:w="120" w:type="dxa"/>
@@ -2614,7 +2861,7 @@
                 <w:color w:val="172033"/>
                 <w:sz w:val="18"/>
               </w:rPr>
-              <w:t>STRIPE_PRICE_MAX</w:t>
+              <w:t>CASHFREE_CLIENT_SECRET</w:t>
             </w:r>
           </w:p>
         </w:tc>
@@ -2639,13 +2886,13 @@
                 <w:color w:val="172033"/>
                 <w:sz w:val="18"/>
               </w:rPr>
-              <w:t>GODFIN Max lifetime</w:t>
+              <w:t>Webhook/API HMAC secret</w:t>
             </w:r>
           </w:p>
         </w:tc>
         <w:tc>
           <w:tcPr>
-            <w:tcW w:type="dxa" w:w="1000"/>
+            <w:tcW w:type="dxa" w:w="1600"/>
             <w:tcMar>
               <w:top w:w="80" w:type="dxa"/>
               <w:start w:w="120" w:type="dxa"/>
@@ -2664,13 +2911,13 @@
                 <w:color w:val="172033"/>
                 <w:sz w:val="18"/>
               </w:rPr>
-              <w:t>INR</w:t>
+              <w:t>Secret; leave blank in Git</w:t>
             </w:r>
           </w:p>
         </w:tc>
         <w:tc>
           <w:tcPr>
-            <w:tcW w:type="dxa" w:w="2600"/>
+            <w:tcW w:type="dxa" w:w="2460"/>
             <w:tcMar>
               <w:top w:w="80" w:type="dxa"/>
               <w:start w:w="120" w:type="dxa"/>
@@ -2689,7 +2936,7 @@
                 <w:color w:val="172033"/>
                 <w:sz w:val="18"/>
               </w:rPr>
-              <w:t>₹9,999</w:t>
+              <w:t>Add sandbox value in Vercel Preview</w:t>
             </w:r>
           </w:p>
         </w:tc>
@@ -2697,7 +2944,7 @@
       <w:tr>
         <w:tc>
           <w:tcPr>
-            <w:tcW w:type="dxa" w:w="3260"/>
+            <w:tcW w:type="dxa" w:w="2800"/>
             <w:tcMar>
               <w:top w:w="80" w:type="dxa"/>
               <w:start w:w="120" w:type="dxa"/>
@@ -2716,7 +2963,7 @@
                 <w:color w:val="172033"/>
                 <w:sz w:val="18"/>
               </w:rPr>
-              <w:t>STRIPE_PRICE_PRO_US</w:t>
+              <w:t>CASHFREE_ENVIRONMENT</w:t>
             </w:r>
           </w:p>
         </w:tc>
@@ -2741,13 +2988,13 @@
                 <w:color w:val="172033"/>
                 <w:sz w:val="18"/>
               </w:rPr>
-              <w:t>GODFIN Pro lifetime</w:t>
+              <w:t>Provider environment</w:t>
             </w:r>
           </w:p>
         </w:tc>
         <w:tc>
           <w:tcPr>
-            <w:tcW w:type="dxa" w:w="1000"/>
+            <w:tcW w:type="dxa" w:w="1600"/>
             <w:tcMar>
               <w:top w:w="80" w:type="dxa"/>
               <w:start w:w="120" w:type="dxa"/>
@@ -2766,13 +3013,13 @@
                 <w:color w:val="172033"/>
                 <w:sz w:val="18"/>
               </w:rPr>
-              <w:t>USD</w:t>
+              <w:t>sandbox</w:t>
             </w:r>
           </w:p>
         </w:tc>
         <w:tc>
           <w:tcPr>
-            <w:tcW w:type="dxa" w:w="2600"/>
+            <w:tcW w:type="dxa" w:w="2460"/>
             <w:tcMar>
               <w:top w:w="80" w:type="dxa"/>
               <w:start w:w="120" w:type="dxa"/>
@@ -2791,7 +3038,7 @@
                 <w:color w:val="172033"/>
                 <w:sz w:val="18"/>
               </w:rPr>
-              <w:t>$99</w:t>
+              <w:t>Change only after live acceptance</w:t>
             </w:r>
           </w:p>
         </w:tc>
@@ -2799,7 +3046,7 @@
       <w:tr>
         <w:tc>
           <w:tcPr>
-            <w:tcW w:type="dxa" w:w="3260"/>
+            <w:tcW w:type="dxa" w:w="2800"/>
             <w:tcMar>
               <w:top w:w="80" w:type="dxa"/>
               <w:start w:w="120" w:type="dxa"/>
@@ -2818,7 +3065,7 @@
                 <w:color w:val="172033"/>
                 <w:sz w:val="18"/>
               </w:rPr>
-              <w:t>STRIPE_PRICE_MAX_US</w:t>
+              <w:t>CHECKOUT_ENABLED</w:t>
             </w:r>
           </w:p>
         </w:tc>
@@ -2843,13 +3090,13 @@
                 <w:color w:val="172033"/>
                 <w:sz w:val="18"/>
               </w:rPr>
-              <w:t>GODFIN Max lifetime</w:t>
+              <w:t>Global checkout kill switch</w:t>
             </w:r>
           </w:p>
         </w:tc>
         <w:tc>
           <w:tcPr>
-            <w:tcW w:type="dxa" w:w="1000"/>
+            <w:tcW w:type="dxa" w:w="1600"/>
             <w:tcMar>
               <w:top w:w="80" w:type="dxa"/>
               <w:start w:w="120" w:type="dxa"/>
@@ -2868,13 +3115,13 @@
                 <w:color w:val="172033"/>
                 <w:sz w:val="18"/>
               </w:rPr>
-              <w:t>USD</w:t>
+              <w:t>false</w:t>
             </w:r>
           </w:p>
         </w:tc>
         <w:tc>
           <w:tcPr>
-            <w:tcW w:type="dxa" w:w="2600"/>
+            <w:tcW w:type="dxa" w:w="2460"/>
             <w:tcMar>
               <w:top w:w="80" w:type="dxa"/>
               <w:start w:w="120" w:type="dxa"/>
@@ -2893,7 +3140,7 @@
                 <w:color w:val="172033"/>
                 <w:sz w:val="18"/>
               </w:rPr>
-              <w:t>$199</w:t>
+              <w:t>Enable only for a controlled test</w:t>
             </w:r>
           </w:p>
         </w:tc>
@@ -2901,7 +3148,7 @@
       <w:tr>
         <w:tc>
           <w:tcPr>
-            <w:tcW w:type="dxa" w:w="3260"/>
+            <w:tcW w:type="dxa" w:w="2800"/>
             <w:tcMar>
               <w:top w:w="80" w:type="dxa"/>
               <w:start w:w="120" w:type="dxa"/>
@@ -2920,7 +3167,7 @@
                 <w:color w:val="172033"/>
                 <w:sz w:val="18"/>
               </w:rPr>
-              <w:t>STRIPE_PRICE_CREDITS_STARTER</w:t>
+              <w:t>PPP_CHECKOUT_ENABLED</w:t>
             </w:r>
           </w:p>
         </w:tc>
@@ -2945,13 +3192,13 @@
                 <w:color w:val="172033"/>
                 <w:sz w:val="18"/>
               </w:rPr>
-              <w:t>500 hosted credits</w:t>
+              <w:t>Regional pricing gate</w:t>
             </w:r>
           </w:p>
         </w:tc>
         <w:tc>
           <w:tcPr>
-            <w:tcW w:type="dxa" w:w="1000"/>
+            <w:tcW w:type="dxa" w:w="1600"/>
             <w:tcMar>
               <w:top w:w="80" w:type="dxa"/>
               <w:start w:w="120" w:type="dxa"/>
@@ -2970,13 +3217,13 @@
                 <w:color w:val="172033"/>
                 <w:sz w:val="18"/>
               </w:rPr>
-              <w:t>INR</w:t>
+              <w:t>false</w:t>
             </w:r>
           </w:p>
         </w:tc>
         <w:tc>
           <w:tcPr>
-            <w:tcW w:type="dxa" w:w="2600"/>
+            <w:tcW w:type="dxa" w:w="2460"/>
             <w:tcMar>
               <w:top w:w="80" w:type="dxa"/>
               <w:start w:w="120" w:type="dxa"/>
@@ -2995,7 +3242,7 @@
                 <w:color w:val="172033"/>
                 <w:sz w:val="18"/>
               </w:rPr>
-              <w:t>₹249</w:t>
+              <w:t>Keep off until global legal/tax review</w:t>
             </w:r>
           </w:p>
         </w:tc>
@@ -3003,7 +3250,7 @@
       <w:tr>
         <w:tc>
           <w:tcPr>
-            <w:tcW w:type="dxa" w:w="3260"/>
+            <w:tcW w:type="dxa" w:w="2800"/>
             <w:tcMar>
               <w:top w:w="80" w:type="dxa"/>
               <w:start w:w="120" w:type="dxa"/>
@@ -3022,7 +3269,7 @@
                 <w:color w:val="172033"/>
                 <w:sz w:val="18"/>
               </w:rPr>
-              <w:t>STRIPE_PRICE_CREDITS_REGULAR</w:t>
+              <w:t>CASHFREE_GLOBAL_PAYMENTS_APPROVED</w:t>
             </w:r>
           </w:p>
         </w:tc>
@@ -3047,13 +3294,13 @@
                 <w:color w:val="172033"/>
                 <w:sz w:val="18"/>
               </w:rPr>
-              <w:t>1,200 hosted credits</w:t>
+              <w:t>Owner approval for global checkout</w:t>
             </w:r>
           </w:p>
         </w:tc>
         <w:tc>
           <w:tcPr>
-            <w:tcW w:type="dxa" w:w="1000"/>
+            <w:tcW w:type="dxa" w:w="1600"/>
             <w:tcMar>
               <w:top w:w="80" w:type="dxa"/>
               <w:start w:w="120" w:type="dxa"/>
@@ -3072,13 +3319,13 @@
                 <w:color w:val="172033"/>
                 <w:sz w:val="18"/>
               </w:rPr>
-              <w:t>INR</w:t>
+              <w:t>false</w:t>
             </w:r>
           </w:p>
         </w:tc>
         <w:tc>
           <w:tcPr>
-            <w:tcW w:type="dxa" w:w="2600"/>
+            <w:tcW w:type="dxa" w:w="2460"/>
             <w:tcMar>
               <w:top w:w="80" w:type="dxa"/>
               <w:start w:w="120" w:type="dxa"/>
@@ -3097,109 +3344,7 @@
                 <w:color w:val="172033"/>
                 <w:sz w:val="18"/>
               </w:rPr>
-              <w:t>₹499</w:t>
-            </w:r>
-          </w:p>
-        </w:tc>
-      </w:tr>
-      <w:tr>
-        <w:tc>
-          <w:tcPr>
-            <w:tcW w:type="dxa" w:w="3260"/>
-            <w:tcMar>
-              <w:top w:w="80" w:type="dxa"/>
-              <w:start w:w="120" w:type="dxa"/>
-              <w:bottom w:w="80" w:type="dxa"/>
-              <w:end w:w="120" w:type="dxa"/>
-            </w:tcMar>
-            <w:vAlign w:val="center"/>
-          </w:tcPr>
-          <w:p>
-            <w:pPr>
-              <w:spacing w:after="0"/>
-            </w:pPr>
-            <w:r>
-              <w:rPr>
-                <w:rFonts w:ascii="Calibri" w:hAnsi="Calibri"/>
-                <w:color w:val="172033"/>
-                <w:sz w:val="18"/>
-              </w:rPr>
-              <w:t>STRIPE_PRICE_CREDITS_POWER</w:t>
-            </w:r>
-          </w:p>
-        </w:tc>
-        <w:tc>
-          <w:tcPr>
-            <w:tcW w:type="dxa" w:w="2500"/>
-            <w:tcMar>
-              <w:top w:w="80" w:type="dxa"/>
-              <w:start w:w="120" w:type="dxa"/>
-              <w:bottom w:w="80" w:type="dxa"/>
-              <w:end w:w="120" w:type="dxa"/>
-            </w:tcMar>
-            <w:vAlign w:val="center"/>
-          </w:tcPr>
-          <w:p>
-            <w:pPr>
-              <w:spacing w:after="0"/>
-            </w:pPr>
-            <w:r>
-              <w:rPr>
-                <w:rFonts w:ascii="Calibri" w:hAnsi="Calibri"/>
-                <w:color w:val="172033"/>
-                <w:sz w:val="18"/>
-              </w:rPr>
-              <w:t>3,000 hosted credits</w:t>
-            </w:r>
-          </w:p>
-        </w:tc>
-        <w:tc>
-          <w:tcPr>
-            <w:tcW w:type="dxa" w:w="1000"/>
-            <w:tcMar>
-              <w:top w:w="80" w:type="dxa"/>
-              <w:start w:w="120" w:type="dxa"/>
-              <w:bottom w:w="80" w:type="dxa"/>
-              <w:end w:w="120" w:type="dxa"/>
-            </w:tcMar>
-            <w:vAlign w:val="center"/>
-          </w:tcPr>
-          <w:p>
-            <w:pPr>
-              <w:spacing w:after="0"/>
-            </w:pPr>
-            <w:r>
-              <w:rPr>
-                <w:rFonts w:ascii="Calibri" w:hAnsi="Calibri"/>
-                <w:color w:val="172033"/>
-                <w:sz w:val="18"/>
-              </w:rPr>
-              <w:t>INR</w:t>
-            </w:r>
-          </w:p>
-        </w:tc>
-        <w:tc>
-          <w:tcPr>
-            <w:tcW w:type="dxa" w:w="2600"/>
-            <w:tcMar>
-              <w:top w:w="80" w:type="dxa"/>
-              <w:start w:w="120" w:type="dxa"/>
-              <w:bottom w:w="80" w:type="dxa"/>
-              <w:end w:w="120" w:type="dxa"/>
-            </w:tcMar>
-            <w:vAlign w:val="center"/>
-          </w:tcPr>
-          <w:p>
-            <w:pPr>
-              <w:spacing w:after="0"/>
-            </w:pPr>
-            <w:r>
-              <w:rPr>
-                <w:rFonts w:ascii="Calibri" w:hAnsi="Calibri"/>
-                <w:color w:val="172033"/>
-                <w:sz w:val="18"/>
-              </w:rPr>
-              <w:t>₹999</w:t>
+              <w:t>Set true only with documented approval</w:t>
             </w:r>
           </w:p>
         </w:tc>
@@ -3219,7 +3364,7 @@
         </w:numPr>
       </w:pPr>
       <w:r>
-        <w:t>Create every Price as one-time. Keep Test and Live Price IDs separate.</w:t>
+        <w:t>The authoritative server catalog remains Pro ₹4,999 and Max ₹9,999. Both are one-time lifetime licenses and include no hosted AI credits.</w:t>
       </w:r>
     </w:p>
     <w:p>
@@ -3231,7 +3376,7 @@
         </w:numPr>
       </w:pPr>
       <w:r>
-        <w:t>Add test Price IDs to Vercel Preview first. Add live Price IDs to Production only after all test-mode acceptance checks pass.</w:t>
+        <w:t>Add sandbox credentials to Vercel Preview first. Keep production credentials in a separate environment and business vault.</w:t>
       </w:r>
     </w:p>
     <w:p>
@@ -3243,7 +3388,7 @@
         </w:numPr>
       </w:pPr>
       <w:r>
-        <w:t>Leave PPP_CHECKOUT_ENABLED=false until US test checkout and country selection are verified. India remains the safe default.</w:t>
+        <w:t>Leave PPP_CHECKOUT_ENABLED=false. India remains the only enabled checkout region until Cashfree international-payment approval, billing-country evidence, and qualified legal/tax review are complete.</w:t>
       </w:r>
     </w:p>
     <w:p>
@@ -3255,7 +3400,7 @@
         </w:numPr>
       </w:pPr>
       <w:r>
-        <w:t>For each new country, use a manual Stripe Price table based on the approved World Bank ICP price-level adjustment, clamped to 0.55–1.25 of the US anchor. Record the source year and approval; recalculate annually.</w:t>
+        <w:t>Do not pass amount, currency, country, user ID, or entitlement from browser code. GODFIN selects and revalidates them server-side.</w:t>
       </w:r>
     </w:p>
     <w:p>
@@ -3267,7 +3412,7 @@
         </w:numPr>
       </w:pPr>
       <w:r>
-        <w:t>Do not let browser-supplied amounts reach Stripe. GODFIN already selects product, country, price ID, and expected amount server-side.</w:t>
+        <w:t>Keep CHECKOUT_ENABLED=false until Supabase migration 0006 is applied and the complete sandbox matrix below passes.</w:t>
       </w:r>
     </w:p>
     <w:p>
@@ -3275,7 +3420,7 @@
         <w:pStyle w:val="Heading2"/>
       </w:pPr>
       <w:r>
-        <w:t>2.3 Configure the webhook</w:t>
+        <w:t>2.4 Configure the webhook</w:t>
       </w:r>
     </w:p>
     <w:p>
@@ -3287,7 +3432,7 @@
         </w:numPr>
       </w:pPr>
       <w:r>
-        <w:t>Create a Test webhook endpoint at https://godfin.vercel.app/api/webhook.</w:t>
+        <w:t>In Cashfree's sandbox dashboard, open Developers → Webhooks (the wording may be Payment Gateway → Webhooks), choose Add webhook, and enter https://godfin.dev/api/webhook. Retain the Vercel fallback only while canonical migration is being verified.</w:t>
       </w:r>
     </w:p>
     <w:p>
@@ -3299,7 +3444,7 @@
         </w:numPr>
       </w:pPr>
       <w:r>
-        <w:t>Subscribe only to checkout.session.completed and checkout.session.async_payment_succeeded.</w:t>
+        <w:t>Subscribe to PAYMENT_SUCCESS, PAYMENT_FAILED, PAYMENT_USER_DROPPED, refund/auto-refund status, and dispute created/updated/closed events.</w:t>
       </w:r>
     </w:p>
     <w:p>
@@ -3311,7 +3456,7 @@
         </w:numPr>
       </w:pPr>
       <w:r>
-        <w:t>Copy the webhook signing secret directly into STRIPE_WEBHOOK_SECRET in Vercel Preview. Repeat with the live endpoint and Production secret after the custom domain is final.</w:t>
+        <w:t>Choose the latest available webhook version supported by the account. The code accepts 2026-01-01, 2025-01-01, and 2023-08-01 while using Cashfree's current 2026-01-01 order API.</w:t>
       </w:r>
     </w:p>
     <w:p>
@@ -3323,7 +3468,7 @@
         </w:numPr>
       </w:pPr>
       <w:r>
-        <w:t>Set STRIPE_SECRET_KEY and all matching Price variables in the same Vercel environment. Redeploy after changes.</w:t>
+        <w:t>Cashfree signs the timestamp plus the exact raw body with HMAC-SHA256. Do not add a second parser/proxy that reformats the body before GODFIN verifies it.</w:t>
       </w:r>
     </w:p>
     <w:p>
@@ -3335,7 +3480,7 @@
         </w:numPr>
       </w:pPr>
       <w:r>
-        <w:t>Use Stripe CLI or Dashboard replay to send the same paid event twice. Verify one purchase, one license, one credit grant if applicable, and one license email.</w:t>
+        <w:t>Use Cashfree Dashboard webhook replay to send the same paid event twice. Verify one provider event, one purchase, one license, and one email.</w:t>
       </w:r>
     </w:p>
     <w:p>
@@ -3348,7 +3493,7 @@
         <w:pStyle w:val="Heading2"/>
       </w:pPr>
       <w:r>
-        <w:t>2.4 Payment acceptance evidence</w:t>
+        <w:t>2.5 Payment acceptance evidence</w:t>
       </w:r>
     </w:p>
     <w:p>
@@ -3372,7 +3517,7 @@
         </w:numPr>
       </w:pPr>
       <w:r>
-        <w:t>Successful Pro and Max test payments provision exactly one lifetime license each.</w:t>
+        <w:t>Successful Pro and Max sandbox payments provision exactly one lifetime license each.</w:t>
       </w:r>
     </w:p>
     <w:p>
@@ -3396,7 +3541,7 @@
         </w:numPr>
       </w:pPr>
       <w:r>
-        <w:t>Cancelled or unpaid sessions create nothing.</w:t>
+        <w:t>Cancelled, failed, dropped, or unpaid orders create no license.</w:t>
       </w:r>
     </w:p>
     <w:p>
@@ -3408,7 +3553,7 @@
         </w:numPr>
       </w:pPr>
       <w:r>
-        <w:t>Async payment success provisions exactly once.</w:t>
+        <w:t>A browser return without a verified success webhook creates no license.</w:t>
       </w:r>
     </w:p>
     <w:p>
@@ -3420,7 +3565,7 @@
         </w:numPr>
       </w:pPr>
       <w:r>
-        <w:t>Credit-pack replay does not duplicate the balance.</w:t>
+        <w:t>A partial refund suspends; a full refund revokes; a merchant-won dispute restores only when no other adverse state exists.</w:t>
       </w:r>
     </w:p>
     <w:p>
@@ -3432,7 +3577,7 @@
         </w:numPr>
       </w:pPr>
       <w:r>
-        <w:t>The desktop fourth activation is rejected; deactivating one device allows another.</w:t>
+        <w:t>An auto-refund for a different payment attempt on the same order does not affect the paid license.</w:t>
       </w:r>
     </w:p>
     <w:p>
@@ -3444,25 +3589,20 @@
         </w:numPr>
       </w:pPr>
       <w:r>
+        <w:t>The desktop fourth activation is rejected; deactivating one device allows another.</w:t>
+      </w:r>
+    </w:p>
+    <w:p>
+      <w:pPr>
+        <w:keepLines/>
+        <w:numPr>
+          <w:ilvl w:val="0"/>
+          <w:numId w:val="12"/>
+        </w:numPr>
+      </w:pPr>
+      <w:r>
         <w:t>A controlled live purchase is completed only after legal, tax, email, and refund procedures are ready.</w:t>
       </w:r>
-    </w:p>
-    <w:p>
-      <w:pPr>
-        <w:pStyle w:val="RunbookCaption"/>
-      </w:pPr>
-      <w:r>
-        <w:t xml:space="preserve">Official reference: </w:t>
-      </w:r>
-      <w:hyperlink r:id="rId13">
-        <w:r>
-          <w:rPr>
-            <w:color w:val="2E74B5"/>
-            <w:u w:val="single"/>
-          </w:rPr>
-          <w:t>Stripe India documentation</w:t>
-        </w:r>
-      </w:hyperlink>
     </w:p>
     <w:p>
       <w:pPr>
@@ -3477,7 +3617,24 @@
             <w:color w:val="2E74B5"/>
             <w:u w:val="single"/>
           </w:rPr>
-          <w:t>Stripe webhook signatures</w:t>
+          <w:t>Cashfree current Payments API</w:t>
+        </w:r>
+      </w:hyperlink>
+    </w:p>
+    <w:p>
+      <w:pPr>
+        <w:pStyle w:val="RunbookCaption"/>
+      </w:pPr>
+      <w:r>
+        <w:t xml:space="preserve">Official reference: </w:t>
+      </w:r>
+      <w:hyperlink r:id="rId15">
+        <w:r>
+          <w:rPr>
+            <w:color w:val="2E74B5"/>
+            <w:u w:val="single"/>
+          </w:rPr>
+          <w:t>Cashfree webhook signature verification</w:t>
         </w:r>
       </w:hyperlink>
     </w:p>
@@ -3489,7 +3646,7 @@
         <w:rPr>
           <w:b/>
         </w:rPr>
-        <w:t xml:space="preserve">Stripe account ID: </w:t>
+        <w:t xml:space="preserve">Cashfree merchant ID (not keys): </w:t>
       </w:r>
       <w:r>
         <w:t>__________________________________________________________________________</w:t>
@@ -3503,7 +3660,7 @@
         <w:rPr>
           <w:b/>
         </w:rPr>
-        <w:t xml:space="preserve">Test webhook endpoint ID: </w:t>
+        <w:t xml:space="preserve">Sandbox webhook name: </w:t>
       </w:r>
       <w:r>
         <w:t>__________________________________________________________________________</w:t>
@@ -3517,7 +3674,7 @@
         <w:rPr>
           <w:b/>
         </w:rPr>
-        <w:t xml:space="preserve">Live webhook endpoint ID: </w:t>
+        <w:t xml:space="preserve">Live webhook name: </w:t>
       </w:r>
       <w:r>
         <w:t>__________________________________________________________________________</w:t>
@@ -3554,7 +3711,7 @@
         </w:numPr>
       </w:pPr>
       <w:r>
-        <w:t>Create the Resend account under the business owner, enable two-factor authentication, and add godfin.dev as the sending domain.</w:t>
+        <w:t>First make hello@godfin.dev a real receiving mailbox or forwarding address with your chosen email provider. Resend sends application email; it is not the support inbox. Send a message to hello@godfin.dev from an unrelated account and reply from it before continuing.</w:t>
       </w:r>
     </w:p>
     <w:p>
@@ -3566,7 +3723,7 @@
         </w:numPr>
       </w:pPr>
       <w:r>
-        <w:t>In the authoritative DNS provider, add exactly the SPF and DKIM records supplied by Resend. Do not invent or duplicate SPF records.</w:t>
+        <w:t>Create the Resend account under the business owner, enable two-factor authentication, and add godfin.dev as the sending domain.</w:t>
       </w:r>
     </w:p>
     <w:p>
@@ -3578,7 +3735,7 @@
         </w:numPr>
       </w:pPr>
       <w:r>
-        <w:t>Add a DMARC record. Start with monitoring if necessary, review reports, then tighten with counsel/operations guidance.</w:t>
+        <w:t>In the authoritative DNS provider, add exactly the SPF and DKIM records supplied by Resend. Do not invent or duplicate SPF records.</w:t>
       </w:r>
     </w:p>
     <w:p>
@@ -3590,7 +3747,7 @@
         </w:numPr>
       </w:pPr>
       <w:r>
-        <w:t>Create monitored addresses or aliases: licenses@godfin.dev, support@godfin.dev, privacy@godfin.dev, legal@godfin.dev, and security@godfin.dev.</w:t>
+        <w:t>Add a DMARC record. Start with monitoring if necessary, review reports, then tighten with counsel/operations guidance.</w:t>
       </w:r>
     </w:p>
     <w:p>
@@ -3602,7 +3759,7 @@
         </w:numPr>
       </w:pPr>
       <w:r>
-        <w:t>Create a least-privilege production Resend API key. Store it directly as RESEND_API_KEY in Vercel Production and Preview; set RESEND_FROM_EMAIL to GODFIN &lt;licenses@godfin.dev&gt;.</w:t>
+        <w:t>Create and monitor hello@godfin.dev as the single general-purpose address for license delivery, customer support, privacy/legal requests, and security reports. Use inbox labels or filters so each request type remains easy to track.</w:t>
       </w:r>
     </w:p>
     <w:p>
@@ -3614,7 +3771,7 @@
         </w:numPr>
       </w:pPr>
       <w:r>
-        <w:t>Redeploy. Submit the waitlist form, receive the confirmation email, confirm once, and verify a repeated confirmation does not duplicate the record.</w:t>
+        <w:t>Create a least-privilege production Resend API key. Store it directly as RESEND_API_KEY in Vercel Production and Preview; set RESEND_FROM_EMAIL to GODFIN &lt;hello@godfin.dev&gt;, NEXT_PUBLIC_SUPPORT_EMAIL to hello@godfin.dev, and NEXT_PUBLIC_PRIVACY_EMAIL to hello@godfin.dev.</w:t>
       </w:r>
     </w:p>
     <w:p>
@@ -3626,6 +3783,18 @@
         </w:numPr>
       </w:pPr>
       <w:r>
+        <w:t>Redeploy. Submit the waitlist form, receive the confirmation email, confirm once, and verify a repeated confirmation does not duplicate the record.</w:t>
+      </w:r>
+    </w:p>
+    <w:p>
+      <w:pPr>
+        <w:keepLines/>
+        <w:numPr>
+          <w:ilvl w:val="0"/>
+          <w:numId w:val="10"/>
+        </w:numPr>
+      </w:pPr>
+      <w:r>
         <w:t>Complete a synthetic license email test to Gmail and another provider. Check SPF, DKIM, DMARC alignment, inbox placement, links, mobile layout, plain-text fallback, reply path, and resend behavior.</w:t>
       </w:r>
     </w:p>
@@ -3686,7 +3855,7 @@
         </w:numPr>
       </w:pPr>
       <w:r>
-        <w:t>Support, privacy, legal, licenses, and security mailboxes are monitored.</w:t>
+        <w:t>hello@godfin.dev is monitored and its support, privacy/legal, license, and security filters are tested.</w:t>
       </w:r>
     </w:p>
     <w:p>
@@ -3696,7 +3865,7 @@
       <w:r>
         <w:t xml:space="preserve">Official reference: </w:t>
       </w:r>
-      <w:hyperlink r:id="rId15">
+      <w:hyperlink r:id="rId16">
         <w:r>
           <w:rPr>
             <w:color w:val="2E74B5"/>
@@ -3815,7 +3984,7 @@
         </w:numPr>
       </w:pPr>
       <w:r>
-        <w:t>Set NEXT_PUBLIC_SITE_URL=https://godfin.dev for Production after DNS and HTTPS are ready. Update Google/Supabase redirect allow-lists and Stripe webhook/success/cancel URLs before switching traffic.</w:t>
+        <w:t>Set NEXT_PUBLIC_SITE_URL=https://godfin.dev for Production after DNS and HTTPS are ready. Update Google/Supabase redirect allow-lists and the Cashfree webhook/return URLs before switching traffic.</w:t>
       </w:r>
     </w:p>
     <w:p>
@@ -3875,7 +4044,7 @@
         </w:numPr>
       </w:pPr>
       <w:r>
-        <w:t>Google, Stripe, and Resend use the canonical production host.</w:t>
+        <w:t>Google, Cashfree, and Resend use the canonical production host.</w:t>
       </w:r>
     </w:p>
     <w:p>
@@ -4920,7 +5089,7 @@
       <w:r>
         <w:t xml:space="preserve">Official reference: </w:t>
       </w:r>
-      <w:hyperlink r:id="rId16">
+      <w:hyperlink r:id="rId17">
         <w:r>
           <w:rPr>
             <w:color w:val="2E74B5"/>
@@ -6692,7 +6861,7 @@
         </w:numPr>
       </w:pPr>
       <w:r>
-        <w:t>Backend: 876 tests pass under clean Python 3.12, including auth/PIN, encryption, migrations, backups, merchant upsert, licenses, exact response contracts for all 182 API operations, goal ledgers and FD/RD suggestions, simulation reference vectors, recurring detection, atomic accounts, package privacy, CA tax pack, classification memory, performance, net worth, behavior insights, reward-pilot redaction, and UTC finance-fetch regressions.</w:t>
+        <w:t>Backend: 878 tests pass under clean Python 3.12, including auth/PIN, encryption, migrations, backups, merchant upsert, licenses, bounded background-job lock recovery, exact response contracts for all 182 API operations, goal ledgers and FD/RD suggestions, simulation reference vectors, recurring detection, atomic accounts, package privacy, CA tax pack, classification memory, performance, net worth, behavior insights, reward-pilot redaction, and UTC finance-fetch regressions.</w:t>
       </w:r>
     </w:p>
     <w:p>
@@ -6740,7 +6909,7 @@
         </w:numPr>
       </w:pPr>
       <w:r>
-        <w:t>Supply chain: deterministic CycloneDX 1.6 SBOM and third-party notices cover 1,008 unique components with zero unresolved license identifiers. Human review of conditional licenses remains a required fail-closed release gate.</w:t>
+        <w:t>Supply chain: deterministic CycloneDX 1.6 SBOM and third-party notices cover 1,035 unique components with zero unresolved license identifiers. Human review of conditional licenses remains a required fail-closed release gate.</w:t>
       </w:r>
     </w:p>
     <w:p>
@@ -7210,7 +7379,7 @@
         </w:numPr>
       </w:pPr>
       <w:r>
-        <w:t>Ensure Pro ₹4,999 and Max ₹9,999 are lifetime licenses with zero hosted credits; local AI and BYO keys consume no GODFIN credits; hosted packs are separate one-time purchases.</w:t>
+        <w:t>Ensure Pro ₹4,999 and Max ₹9,999 are lifetime licenses with zero hosted credits; local AI and BYO keys consume no GODFIN credits; no hosted AI credit packs are currently sold.</w:t>
       </w:r>
     </w:p>
     <w:p>
@@ -7903,7 +8072,7 @@
                 <w:color w:val="172033"/>
                 <w:sz w:val="18"/>
               </w:rPr>
-              <w:t>Stripe + webhook + refund/tax</w:t>
+              <w:t>Cashfree + webhook + refund/tax</w:t>
             </w:r>
           </w:p>
         </w:tc>
@@ -8103,7 +8272,7 @@
                 <w:color w:val="172033"/>
                 <w:sz w:val="18"/>
               </w:rPr>
-              <w:t>Custom domain + security headers</w:t>
+              <w:t>Canonical domain + security headers</w:t>
             </w:r>
           </w:p>
         </w:tc>
@@ -8177,6 +8346,7 @@
                 <w:color w:val="172033"/>
                 <w:sz w:val="18"/>
               </w:rPr>
+              <w:t>godfin.dev resolves to Vercel; provider callbacks and production deployment still require acceptance evidence.</w:t>
             </w:r>
           </w:p>
         </w:tc>

</xml_diff>

<commit_message>
docs(owner): add CI recovery guide
</commit_message>
<xml_diff>
--- a/docs/GODFIN_OWNER_COMPLETION_RUNBOOK.docx
+++ b/docs/GODFIN_OWNER_COMPLETION_RUNBOOK.docx
@@ -64,7 +64,7 @@
           <w:color w:val="667085"/>
           <w:sz w:val="20"/>
         </w:rPr>
-        <w:t>Version 2.5  •  16 August 2026  •  oculusrex14/GODFIN (private)</w:t>
+        <w:t>Version 2.6  •  16 August 2026  •  oculusrex14/GODFIN (private)</w:t>
         <w:br/>
         <w:t>Production branch: codex/godfin-production-v5</w:t>
       </w:r>
@@ -220,7 +220,7 @@
           <w:color w:val="172033"/>
           <w:sz w:val="21"/>
         </w:rPr>
-        <w:t>Production remediation is tracked on the private v5 branch. The clean Python 3.12 baseline is 878 passing backend tests. All 182 API operations publish an explicit success or intentional terminal status, a non-empty media-specific success schema, and the shared error contract. Frontend lint, accessibility, authentication, and production builds pass; five executable Cashfree contract tests and the website production build pass; desktop release/update tests pass 12/12; and package privacy checks pass 7/7.</w:t>
+        <w:t>Production remediation is tracked on the private v5 branch. The clean Python 3.12 baseline is 883 passing backend tests. All 182 API operations publish an explicit success or intentional terminal status, a non-empty media-specific success schema, and the shared error contract. Frontend lint, accessibility, authentication, and production builds pass; five executable Cashfree contract tests and the website production build pass; desktop release/update tests pass 12/12; and package privacy checks pass 7/7.</w:t>
       </w:r>
     </w:p>
     <w:p>
@@ -376,7 +376,7 @@
         </w:numPr>
       </w:pPr>
       <w:r>
-        <w:t>A fresh local macOS arm64 package was built from code commit 25fd5f7 using the locked toolchain. It starts in 3.000 seconds on first launch and 1.033 seconds on restart, preserves its database, enforces the local trust and maintenance boundaries, and remains below the 700 MB idle-memory budget at 604.5 MB across five processes. The private DMG SHA-256 is 5b3fd15ae40e9ab59ea2b344f6de9e15f37e6ad2030b1d2f330253f2ed4c98c5 and the ZIP SHA-256 is 8bd9d5b59e11e3bdbb5edfb5f882ed953a5341a178a2d77cd0a7190154ce5b91. This is an ad-hoc local test signature, not an Apple-notarized customer release.</w:t>
+        <w:t>A fresh local macOS arm64 package was built from repository commit ea76be1, containing Gmail restart fix 8dce936, using the locked toolchain. It starts in 3.376 seconds on first launch and 1.229 seconds on restart, preserves its database, enforces the local trust and maintenance boundaries, and remains below the 700 MB idle-memory budget at 607 MB across five processes. The private DMG SHA-256 is 2b68a8245c5c622f2def9b364eca6864eb3a1f58192a75032dcd8c50f2c65937 and the ZIP SHA-256 is 59cfcf718772a1b5a59064a0e9b66b9a20ed7d22182fed7d3bcc3122f7e56a9d. This is an ad-hoc local test signature, not an Apple-notarized customer release.</w:t>
       </w:r>
     </w:p>
     <w:p>
@@ -400,7 +400,7 @@
         </w:numPr>
       </w:pPr>
       <w:r>
-        <w:t>Repository code evidence is current through commit aeb5cb9 on codex/godfin-production-v5. Cashfree, canonical-domain, Gmail-callback, and bounded-job changes are pushed privately; this v2.5 runbook is the next documentation-only commit.</w:t>
+        <w:t>Repository evidence is current through commit 9e355bf on codex/godfin-production-v5. Cashfree, canonical-domain, Gmail callback, credential-restart, browser-matrix, and bounded-job changes are pushed privately; this v2.6 runbook is the next documentation-only commit.</w:t>
       </w:r>
     </w:p>
     <w:p>
@@ -412,7 +412,7 @@
         </w:numPr>
       </w:pPr>
       <w:r>
-        <w:t>The Gmail callback trust defect is fixed in the installed app: the exact external-browser callback may reach the OAuth handler while ordinary routes still require the per-launch secret. Owner consent/sync/disconnect/reconnect must now be retried with the configured Desktop client; naraharikripa14@gmail.com is also listed as a Google test user.</w:t>
+        <w:t>The private desktop Gmail flow is complete: the exact external-browser callback reaches the OAuth handler while ordinary routes still require the per-launch secret; owner consent succeeded; the first sync processed 718 messages and created 158 transactions; and persisted credentials now reload after a complete desktop/backend restart. naraharikripa14@gmail.com is also listed as a Google test user.</w:t>
       </w:r>
     </w:p>
     <w:p>
@@ -424,7 +424,7 @@
         </w:numPr>
       </w:pPr>
       <w:r>
-        <w:t>Final Gmail consent, Cashfree KYC/sandbox/live tests, Supabase migration 0006 deployment, Resend DNS, Google/Supabase canonical redirect updates, Apple/Windows certificates, R2, cross-platform clean-system evidence, dependency-license approval, and public-launch authorization are not yet complete.</w:t>
+        <w:t>Public Gmail consent-screen review, Cashfree KYC/sandbox/live tests, Supabase migration 0006 deployment, Resend DNS, Google/Supabase canonical redirect updates, Apple/Windows certificates, R2, cross-platform clean-system evidence, dependency-license approval, GitHub Actions billing, and public-launch authorization are not yet complete.</w:t>
       </w:r>
     </w:p>
     <w:p>
@@ -613,7 +613,7 @@
                 <w:color w:val="172033"/>
                 <w:sz w:val="18"/>
               </w:rPr>
-              <w:t>Desktop Gmail OAuth</w:t>
+              <w:t>GitHub Actions billing</w:t>
             </w:r>
           </w:p>
         </w:tc>
@@ -638,7 +638,7 @@
                 <w:color w:val="172033"/>
                 <w:sz w:val="18"/>
               </w:rPr>
-              <w:t>Client setup is done and callback trust is fixed; end-to-end consent/sync has not been re-run.</w:t>
+              <w:t>GitHub rejects every hosted CI job before step 1 because the account payment or Actions spending limit blocks runners.</w:t>
             </w:r>
           </w:p>
         </w:tc>
@@ -663,7 +663,7 @@
                 <w:color w:val="172033"/>
                 <w:sz w:val="18"/>
               </w:rPr>
-              <w:t>Retry Connect Gmail in the installed app and complete Google consent.</w:t>
+              <w:t>Open account Billing &amp; licensing; fix the payment method and create or raise a GitHub Actions budget that permits usage.</w:t>
             </w:r>
           </w:p>
         </w:tc>
@@ -688,7 +688,7 @@
                 <w:color w:val="172033"/>
                 <w:sz w:val="18"/>
               </w:rPr>
-              <w:t>Connect, callback, status, sync, disconnect, and reauthorization pass.</w:t>
+              <w:t>The exact private candidate CI run starts every job and finishes green.</w:t>
             </w:r>
           </w:p>
         </w:tc>
@@ -1454,7 +1454,7 @@
                 <w:color w:val="172033"/>
                 <w:sz w:val="18"/>
               </w:rPr>
-              <w:t>Provider-backed browser checks are deferred to the final tranche.</w:t>
+              <w:t>Twelve Chromium, Firefox, and WebKit cases enumerate locally, but hosted jobs cannot start until GitHub Actions billing is restored.</w:t>
             </w:r>
           </w:p>
         </w:tc>
@@ -1479,7 +1479,7 @@
                 <w:color w:val="172033"/>
                 <w:sz w:val="18"/>
               </w:rPr>
-              <w:t>Run supported Chrome, Safari, Firefox, and Edge acceptance flows.</w:t>
+              <w:t>Fix Actions billing first; then run CI plus supported Chrome, Safari, Firefox, and Edge acceptance flows.</w:t>
             </w:r>
           </w:p>
         </w:tc>
@@ -1504,7 +1504,7 @@
                 <w:color w:val="172033"/>
                 <w:sz w:val="18"/>
               </w:rPr>
-              <w:t>Screenshots, traces, accessibility, and isolation evidence are archived.</w:t>
+              <w:t>Green run, screenshots, traces, accessibility, and isolation evidence are archived.</w:t>
             </w:r>
           </w:p>
         </w:tc>
@@ -6861,7 +6861,7 @@
         </w:numPr>
       </w:pPr>
       <w:r>
-        <w:t>Backend: 878 tests pass under clean Python 3.12, including auth/PIN, encryption, migrations, backups, merchant upsert, licenses, bounded background-job lock recovery, exact response contracts for all 182 API operations, goal ledgers and FD/RD suggestions, simulation reference vectors, recurring detection, atomic accounts, package privacy, CA tax pack, classification memory, performance, net worth, behavior insights, reward-pilot redaction, and UTC finance-fetch regressions.</w:t>
+        <w:t>Backend: 883 tests pass under clean Python 3.12, including auth/PIN, encryption, migrations, backups, merchant upsert, licenses, bounded background-job lock recovery, exact response contracts for all 182 API operations, Gmail credential reload after restart, goal ledgers and FD/RD suggestions, simulation reference vectors, recurring detection, atomic accounts, package privacy, CA tax pack, classification memory, performance, net worth, behavior insights, reward-pilot redaction, and UTC finance-fetch regressions.</w:t>
       </w:r>
     </w:p>
     <w:p>
@@ -6933,7 +6933,7 @@
         </w:numPr>
       </w:pPr>
       <w:r>
-        <w:t>Local packaging: the fresh commit-25fd5f7 macOS arm64 candidate passed strict codesign verification, first start 3.000 seconds, restart 1.033 seconds, idle memory 604.5 MB across five processes, database preservation, local trust boundary, and maintenance-boundary checks. The DMG and ZIP exact SHA-256 values are recorded in the current package evidence. Gatekeeper correctly rejects the candidate because it is not yet Apple-notarized.</w:t>
+        <w:t>Local packaging: the fresh ea76be1 macOS arm64 candidate, containing Gmail restart fix 8dce936, passed strict codesign verification, first start 3.376 seconds, restart 1.229 seconds, idle memory 607 MB across five processes, database preservation, local trust boundary, maintenance boundary, backend auto-start, and callback-path checks. The DMG and ZIP exact SHA-256 values are recorded in the current package evidence. Gatekeeper correctly rejects the candidate because it is not yet Apple-notarized.</w:t>
       </w:r>
     </w:p>
     <w:p>
@@ -7008,8 +7008,122 @@
           <w:color w:val="172033"/>
           <w:sz w:val="21"/>
         </w:rPr>
-        <w:t>Do not tag a candidate until the CI run for the exact commit is green. A local pass is necessary but not sufficient.</w:t>
-      </w:r>
+        <w:t>Do not tag a candidate until the CI run for the exact commit is green. Current jobs do not reach step 1 because GitHub reports a failed account payment or Actions spending limit. A local pass is necessary but not sufficient.</w:t>
+      </w:r>
+    </w:p>
+    <w:p>
+      <w:pPr>
+        <w:pStyle w:val="Heading2"/>
+      </w:pPr>
+      <w:r>
+        <w:t>13.1 Restore GitHub Actions in plain language</w:t>
+      </w:r>
+    </w:p>
+    <w:p>
+      <w:pPr>
+        <w:keepLines/>
+        <w:numPr>
+          <w:ilvl w:val="0"/>
+          <w:numId w:val="10"/>
+        </w:numPr>
+      </w:pPr>
+      <w:r>
+        <w:t>Open https://github.com/settings/billing in the GitHub account that owns oculusrex14/GODFIN. Sign in and complete password or two-factor checks yourself.</w:t>
+      </w:r>
+    </w:p>
+    <w:p>
+      <w:pPr>
+        <w:keepLines/>
+        <w:numPr>
+          <w:ilvl w:val="0"/>
+          <w:numId w:val="10"/>
+        </w:numPr>
+      </w:pPr>
+      <w:r>
+        <w:t>Open Payment information. If GitHub shows a failed, expired, or missing payment method, add or correct it. Do not share card details, billing address, one-time passwords, or screenshots containing them.</w:t>
+      </w:r>
+    </w:p>
+    <w:p>
+      <w:pPr>
+        <w:keepLines/>
+        <w:numPr>
+          <w:ilvl w:val="0"/>
+          <w:numId w:val="10"/>
+        </w:numPr>
+      </w:pPr>
+      <w:r>
+        <w:t>Open Budgets and alerts. Find a GitHub Actions budget for the personal account or this repository. If it stops usage at zero or at a reached limit, raise it to a small monthly amount you are comfortable with, or disable only the stop-usage control. Keep email alerts enabled.</w:t>
+      </w:r>
+    </w:p>
+    <w:p>
+      <w:pPr>
+        <w:keepLines/>
+        <w:numPr>
+          <w:ilvl w:val="0"/>
+          <w:numId w:val="10"/>
+        </w:numPr>
+      </w:pPr>
+      <w:r>
+        <w:t>Return to https://github.com/oculusrex14/GODFIN/actions. Open the newest failed CI run and choose Re-run all jobs. If the button is missing, push no new code; ask Codex to re-run the existing private workflow through GitHub CLI after billing is fixed.</w:t>
+      </w:r>
+    </w:p>
+    <w:p>
+      <w:pPr>
+        <w:keepLines/>
+        <w:numPr>
+          <w:ilvl w:val="0"/>
+          <w:numId w:val="10"/>
+        </w:numPr>
+      </w:pPr>
+      <w:r>
+        <w:t>A successful repair is obvious: backend, frontend, website, website-browser-matrix, desktop-audit, and e2e show real steps instead of failing instantly. Wait until all six are green, then copy only the run URL into the evidence field below.</w:t>
+      </w:r>
+    </w:p>
+    <w:p>
+      <w:pPr>
+        <w:keepLines/>
+        <w:numPr>
+          <w:ilvl w:val="0"/>
+          <w:numId w:val="10"/>
+        </w:numPr>
+      </w:pPr>
+      <w:r>
+        <w:t>If GitHub still shows the same billing annotation after payment and budget changes, wait up to 15 minutes, sign out/in, and contact GitHub Billing Support. Do not make the repository public to obtain free Actions minutes.</w:t>
+      </w:r>
+    </w:p>
+    <w:p>
+      <w:pPr>
+        <w:pStyle w:val="RunbookCaption"/>
+      </w:pPr>
+      <w:r>
+        <w:t xml:space="preserve">Official reference: </w:t>
+      </w:r>
+      <w:hyperlink r:id="rId18">
+        <w:r>
+          <w:rPr>
+            <w:color w:val="2E74B5"/>
+            <w:u w:val="single"/>
+          </w:rPr>
+          <w:t>GitHub Actions billing</w:t>
+        </w:r>
+      </w:hyperlink>
+    </w:p>
+    <w:p>
+      <w:pPr>
+        <w:pStyle w:val="RunbookCaption"/>
+      </w:pPr>
+      <w:r>
+        <w:t xml:space="preserve">Official reference: </w:t>
+      </w:r>
+      <w:hyperlink r:id="rId19">
+        <w:r>
+          <w:rPr>
+            <w:color w:val="2E74B5"/>
+            <w:u w:val="single"/>
+          </w:rPr>
+          <w:t>GitHub budgets and alerts</w:t>
+        </w:r>
+      </w:hyperlink>
     </w:p>
     <w:p>
       <w:pPr>
@@ -7895,6 +8009,7 @@
                 <w:color w:val="172033"/>
                 <w:sz w:val="18"/>
               </w:rPr>
+              <w:t>Codex + owner</w:t>
             </w:r>
           </w:p>
         </w:tc>
@@ -7919,7 +8034,7 @@
                 <w:color w:val="172033"/>
                 <w:sz w:val="18"/>
               </w:rPr>
-              <w:t>☐</w:t>
+              <w:t>☒</w:t>
             </w:r>
           </w:p>
         </w:tc>
@@ -7944,7 +8059,7 @@
                 <w:color w:val="172033"/>
                 <w:sz w:val="18"/>
               </w:rPr>
-              <w:t>Separate Desktop client; read-only consent; connect/sync/disconnect/reconnect evidence.</w:t>
+              <w:t>Private Desktop client; read-only consent, callback, initial sync, safe routing, and restart reload verified on 16 Aug 2026. Public consent publication remains separate.</w:t>
             </w:r>
           </w:p>
         </w:tc>
@@ -8977,6 +9092,107 @@
                 <w:color w:val="172033"/>
                 <w:sz w:val="18"/>
               </w:rPr>
+              <w:t>GitHub Actions runner availability</w:t>
+            </w:r>
+          </w:p>
+        </w:tc>
+        <w:tc>
+          <w:tcPr>
+            <w:tcW w:type="dxa" w:w="1300"/>
+            <w:tcMar>
+              <w:top w:w="80" w:type="dxa"/>
+              <w:start w:w="120" w:type="dxa"/>
+              <w:bottom w:w="80" w:type="dxa"/>
+              <w:end w:w="120" w:type="dxa"/>
+            </w:tcMar>
+            <w:vAlign w:val="center"/>
+          </w:tcPr>
+          <w:p>
+            <w:pPr>
+              <w:spacing w:after="0"/>
+            </w:pPr>
+            <w:r>
+              <w:rPr>
+                <w:rFonts w:ascii="Calibri" w:hAnsi="Calibri"/>
+                <w:color w:val="172033"/>
+                <w:sz w:val="18"/>
+              </w:rPr>
+            </w:r>
+          </w:p>
+        </w:tc>
+        <w:tc>
+          <w:tcPr>
+            <w:tcW w:type="dxa" w:w="1100"/>
+            <w:tcMar>
+              <w:top w:w="80" w:type="dxa"/>
+              <w:start w:w="120" w:type="dxa"/>
+              <w:bottom w:w="80" w:type="dxa"/>
+              <w:end w:w="120" w:type="dxa"/>
+            </w:tcMar>
+            <w:vAlign w:val="center"/>
+          </w:tcPr>
+          <w:p>
+            <w:pPr>
+              <w:spacing w:after="0"/>
+            </w:pPr>
+            <w:r>
+              <w:rPr>
+                <w:rFonts w:ascii="Calibri" w:hAnsi="Calibri"/>
+                <w:color w:val="172033"/>
+                <w:sz w:val="18"/>
+              </w:rPr>
+              <w:t>☐</w:t>
+            </w:r>
+          </w:p>
+        </w:tc>
+        <w:tc>
+          <w:tcPr>
+            <w:tcW w:type="dxa" w:w="3660"/>
+            <w:tcMar>
+              <w:top w:w="80" w:type="dxa"/>
+              <w:start w:w="120" w:type="dxa"/>
+              <w:bottom w:w="80" w:type="dxa"/>
+              <w:end w:w="120" w:type="dxa"/>
+            </w:tcMar>
+            <w:vAlign w:val="center"/>
+          </w:tcPr>
+          <w:p>
+            <w:pPr>
+              <w:spacing w:after="0"/>
+            </w:pPr>
+            <w:r>
+              <w:rPr>
+                <w:rFonts w:ascii="Calibri" w:hAnsi="Calibri"/>
+                <w:color w:val="172033"/>
+                <w:sz w:val="18"/>
+              </w:rPr>
+              <w:t>Resolve account payment/Actions budget block; retain one exact-commit run with all jobs green.</w:t>
+            </w:r>
+          </w:p>
+        </w:tc>
+      </w:tr>
+      <w:tr>
+        <w:tc>
+          <w:tcPr>
+            <w:tcW w:type="dxa" w:w="3300"/>
+            <w:tcMar>
+              <w:top w:w="80" w:type="dxa"/>
+              <w:start w:w="120" w:type="dxa"/>
+              <w:bottom w:w="80" w:type="dxa"/>
+              <w:end w:w="120" w:type="dxa"/>
+            </w:tcMar>
+            <w:vAlign w:val="center"/>
+          </w:tcPr>
+          <w:p>
+            <w:pPr>
+              <w:spacing w:after="0"/>
+            </w:pPr>
+            <w:r>
+              <w:rPr>
+                <w:rFonts w:ascii="Calibri" w:hAnsi="Calibri"/>
+                <w:color w:val="172033"/>
+                <w:sz w:val="18"/>
+              </w:rPr>
               <w:t>Security/privacy/recovery matrix</w:t>
             </w:r>
           </w:p>
@@ -9751,12 +9967,13 @@
       <w:start w:val="1"/>
       <w:numFmt w:val="decimal"/>
       <w:lvlText w:val="%1."/>
+      <w:suff w:val="space"/>
       <w:lvlJc w:val="left"/>
       <w:pPr>
         <w:tabs>
-          <w:tab w:val="num" w:pos="720"/>
+          <w:tab w:val="num" w:pos="900"/>
         </w:tabs>
-        <w:ind w:left="720" w:hanging="360"/>
+        <w:ind w:left="900" w:hanging="540"/>
         <w:spacing w:after="60" w:line="276" w:lineRule="auto"/>
       </w:pPr>
     </w:lvl>

</xml_diff>